<commit_message>
Minor updates in datasets
</commit_message>
<xml_diff>
--- a/docs/dataForTaining-chatBot/type of data.docx
+++ b/docs/dataForTaining-chatBot/type of data.docx
@@ -4,176 +4,424 @@
   <w:body>
     <w:p>
       <w:pPr>
-        <w:spacing w:before="100" w:beforeAutospacing="1" w:after="100" w:afterAutospacing="1" w:line="240" w:lineRule="auto"/>
-        <w:outlineLvl w:val="2"/>
-        <w:rPr>
-          <w:rFonts w:ascii="Times New Roman" w:eastAsia="Times New Roman" w:hAnsi="Times New Roman" w:cs="Times New Roman"/>
-          <w:b/>
-          <w:bCs/>
-          <w:sz w:val="27"/>
-          <w:szCs w:val="27"/>
-          <w:lang w:eastAsia="en-PK"/>
-        </w:rPr>
-      </w:pPr>
-      <w:r>
-        <w:rPr>
-          <w:rFonts w:ascii="Times New Roman" w:eastAsia="Times New Roman" w:hAnsi="Times New Roman" w:cs="Times New Roman"/>
-          <w:b/>
-          <w:bCs/>
-          <w:sz w:val="27"/>
-          <w:szCs w:val="27"/>
-          <w:lang w:eastAsia="en-PK"/>
-        </w:rPr>
-        <w:t>1. Core Legal Text Data (</w:t>
-      </w:r>
-      <w:r>
-        <w:rPr>
-          <w:rFonts w:ascii="Times New Roman" w:eastAsia="Times New Roman" w:hAnsi="Times New Roman" w:cs="Times New Roman"/>
-          <w:b/>
-          <w:bCs/>
-          <w:sz w:val="27"/>
-          <w:szCs w:val="27"/>
-          <w:lang w:val="en-US" w:eastAsia="en-PK"/>
-        </w:rPr>
-        <w:t>property law</w:t>
-      </w:r>
-      <w:r>
-        <w:rPr>
-          <w:rFonts w:ascii="Times New Roman" w:eastAsia="Times New Roman" w:hAnsi="Times New Roman" w:cs="Times New Roman"/>
-          <w:b/>
-          <w:bCs/>
-          <w:sz w:val="27"/>
-          <w:szCs w:val="27"/>
-          <w:lang w:eastAsia="en-PK"/>
-        </w:rPr>
-        <w:t>)</w:t>
-      </w:r>
-    </w:p>
-    <w:p>
-      <w:pPr>
-        <w:pStyle w:val="Heading3"/>
-        <w:rPr>
-          <w:rStyle w:val="Strong"/>
-          <w:b/>
-          <w:bCs/>
-        </w:rPr>
-      </w:pPr>
-      <w:r>
-        <w:t xml:space="preserve">2. </w:t>
-      </w:r>
-      <w:r>
-        <w:rPr>
-          <w:rStyle w:val="Strong"/>
-          <w:b/>
-          <w:bCs/>
-        </w:rPr>
-        <w:t>UQA (</w:t>
-      </w:r>
-      <w:r>
-        <w:rPr>
-          <w:rStyle w:val="Strong"/>
-          <w:b/>
-          <w:bCs/>
-          <w:lang w:val="en-US"/>
-        </w:rPr>
-        <w:t xml:space="preserve">Urdu </w:t>
-      </w:r>
-      <w:r>
-        <w:rPr>
-          <w:rStyle w:val="Strong"/>
-          <w:b/>
-          <w:bCs/>
-        </w:rPr>
-        <w:t>Question–Answer) Data</w:t>
-      </w:r>
-    </w:p>
-    <w:p>
-      <w:pPr>
-        <w:pStyle w:val="Heading3"/>
-        <w:rPr>
-          <w:rStyle w:val="Strong"/>
-          <w:b/>
-          <w:bCs/>
-          <w:lang w:val="en-US"/>
-        </w:rPr>
-      </w:pPr>
-      <w:r>
-        <w:rPr>
-          <w:rStyle w:val="Strong"/>
-          <w:b/>
-          <w:bCs/>
-          <w:lang w:val="en-US"/>
-        </w:rPr>
-        <w:t xml:space="preserve">3. </w:t>
+        <w:rPr>
+          <w:lang w:val="en-US"/>
+        </w:rPr>
+      </w:pPr>
+      <w:r>
+        <w:rPr>
+          <w:lang w:val="en-US"/>
+        </w:rPr>
+        <w:t xml:space="preserve">The types of </w:t>
       </w:r>
       <w:proofErr w:type="gramStart"/>
       <w:r>
         <w:rPr>
-          <w:rStyle w:val="Strong"/>
-          <w:b/>
-          <w:bCs/>
-          <w:lang w:val="en-US"/>
-        </w:rPr>
-        <w:t>Judgments</w:t>
+          <w:lang w:val="en-US"/>
+        </w:rPr>
+        <w:t>dataset</w:t>
       </w:r>
       <w:proofErr w:type="gramEnd"/>
       <w:r>
         <w:rPr>
-          <w:rStyle w:val="Strong"/>
-          <w:b/>
-          <w:bCs/>
+          <w:lang w:val="en-US"/>
+        </w:rPr>
+        <w:t xml:space="preserve"> used;</w:t>
+      </w:r>
+    </w:p>
+    <w:p>
+      <w:pPr>
+        <w:pStyle w:val="ListParagraph"/>
+        <w:numPr>
+          <w:ilvl w:val="0"/>
+          <w:numId w:val="1"/>
+        </w:numPr>
+      </w:pPr>
+      <w:r>
+        <w:rPr>
+          <w:lang w:val="en-US"/>
+        </w:rPr>
+        <w:t>Property law</w:t>
+      </w:r>
+      <w:r>
+        <w:rPr>
           <w:lang w:val="en-US"/>
         </w:rPr>
         <w:t xml:space="preserve"> </w:t>
       </w:r>
       <w:r>
         <w:rPr>
-          <w:rStyle w:val="Strong"/>
-          <w:b/>
-          <w:bCs/>
-          <w:lang w:val="en-US"/>
-        </w:rPr>
-        <w:t>data</w:t>
-      </w:r>
-    </w:p>
-    <w:p>
-      <w:pPr>
-        <w:pStyle w:val="Heading3"/>
-        <w:rPr>
-          <w:rStyle w:val="Strong"/>
-          <w:b/>
-          <w:bCs/>
-          <w:lang w:val="en-US"/>
-        </w:rPr>
-      </w:pPr>
-      <w:r>
-        <w:rPr>
-          <w:rStyle w:val="Strong"/>
-          <w:b/>
-          <w:bCs/>
-          <w:lang w:val="en-US"/>
-        </w:rPr>
-        <w:t xml:space="preserve">4. legal </w:t>
+          <w:lang w:val="en-US"/>
+        </w:rPr>
+        <w:t>taken from Pakistan code website</w:t>
+      </w:r>
+    </w:p>
+    <w:p>
+      <w:pPr>
+        <w:pStyle w:val="ListParagraph"/>
+        <w:numPr>
+          <w:ilvl w:val="0"/>
+          <w:numId w:val="1"/>
+        </w:numPr>
+      </w:pPr>
+      <w:r>
+        <w:rPr>
+          <w:lang w:val="en-US"/>
+        </w:rPr>
+        <w:t xml:space="preserve">Supreme courts judgments taken from </w:t>
       </w:r>
       <w:proofErr w:type="spellStart"/>
       <w:r>
         <w:rPr>
-          <w:rStyle w:val="Strong"/>
-          <w:b/>
-          <w:bCs/>
-          <w:lang w:val="en-US"/>
-        </w:rPr>
-        <w:t>uqad</w:t>
+          <w:lang w:val="en-US"/>
+        </w:rPr>
+        <w:t>keggle</w:t>
       </w:r>
       <w:proofErr w:type="spellEnd"/>
     </w:p>
     <w:p>
       <w:pPr>
-        <w:pStyle w:val="Heading3"/>
-        <w:rPr>
-          <w:lang w:val="en-US"/>
-        </w:rPr>
-      </w:pPr>
+        <w:pStyle w:val="ListParagraph"/>
+        <w:numPr>
+          <w:ilvl w:val="0"/>
+          <w:numId w:val="1"/>
+        </w:numPr>
+      </w:pPr>
+      <w:r>
+        <w:rPr>
+          <w:lang w:val="en-US"/>
+        </w:rPr>
+        <w:t xml:space="preserve">Legal </w:t>
+      </w:r>
+      <w:r>
+        <w:rPr>
+          <w:lang w:val="en-US"/>
+        </w:rPr>
+        <w:t>UQAD from hugging face</w:t>
+      </w:r>
+    </w:p>
+    <w:p>
+      <w:pPr>
+        <w:pStyle w:val="ListParagraph"/>
+        <w:numPr>
+          <w:ilvl w:val="0"/>
+          <w:numId w:val="1"/>
+        </w:numPr>
+      </w:pPr>
+      <w:r>
+        <w:rPr>
+          <w:lang w:val="en-US"/>
+        </w:rPr>
+        <w:t>General UQAD</w:t>
+      </w:r>
+      <w:r>
+        <w:rPr>
+          <w:lang w:val="en-US"/>
+        </w:rPr>
+        <w:t xml:space="preserve"> from </w:t>
+      </w:r>
+      <w:proofErr w:type="spellStart"/>
+      <w:r>
+        <w:rPr>
+          <w:lang w:val="en-US"/>
+        </w:rPr>
+        <w:t>github</w:t>
+      </w:r>
+      <w:proofErr w:type="spellEnd"/>
+    </w:p>
+    <w:p>
+      <w:pPr>
+        <w:pStyle w:val="ListParagraph"/>
+        <w:numPr>
+          <w:ilvl w:val="0"/>
+          <w:numId w:val="1"/>
+        </w:numPr>
+      </w:pPr>
+      <w:r>
+        <w:rPr>
+          <w:lang w:val="en-US"/>
+        </w:rPr>
+        <w:t>Roman Urdu data</w:t>
+      </w:r>
+      <w:r>
+        <w:rPr>
+          <w:lang w:val="en-US"/>
+        </w:rPr>
+        <w:t xml:space="preserve"> from </w:t>
+      </w:r>
+      <w:proofErr w:type="spellStart"/>
+      <w:r>
+        <w:rPr>
+          <w:lang w:val="en-US"/>
+        </w:rPr>
+        <w:t>keggle</w:t>
+      </w:r>
+      <w:proofErr w:type="spellEnd"/>
+      <w:r>
+        <w:rPr>
+          <w:lang w:val="en-US"/>
+        </w:rPr>
+        <w:br/>
+      </w:r>
+      <w:r>
+        <w:rPr>
+          <w:lang w:val="en-US"/>
+        </w:rPr>
+        <w:br/>
+        <w:t>Dataset explaining;</w:t>
+      </w:r>
+    </w:p>
+    <w:p>
+      <w:pPr>
+        <w:ind w:left="360"/>
+      </w:pPr>
+      <w:r>
+        <w:rPr>
+          <w:lang w:val="en-US"/>
+        </w:rPr>
+        <w:sym w:font="Wingdings" w:char="F0E0"/>
+      </w:r>
+      <w:r>
+        <w:rPr>
+          <w:lang w:val="en-US"/>
+        </w:rPr>
+        <w:t>Property law taken from Pakistan code website</w:t>
+      </w:r>
+    </w:p>
+    <w:p>
+      <w:r>
+        <w:br w:type="page"/>
+      </w:r>
+    </w:p>
+    <w:p>
+      <w:pPr>
+        <w:rPr>
+          <w:lang w:val="en-US"/>
+        </w:rPr>
+      </w:pPr>
+      <w:r>
+        <w:rPr>
+          <w:lang w:val="en-US"/>
+        </w:rPr>
+        <w:lastRenderedPageBreak/>
+        <w:t>Balanced dataset</w:t>
+      </w:r>
+    </w:p>
+    <w:p>
+      <w:pPr>
+        <w:rPr>
+          <w:lang w:val="en-US"/>
+        </w:rPr>
+      </w:pPr>
+      <w:r>
+        <w:rPr>
+          <w:lang w:val="en-US"/>
+        </w:rPr>
+        <w:tab/>
+        <w:t xml:space="preserve">Feature </w:t>
+      </w:r>
+      <w:proofErr w:type="spellStart"/>
+      <w:r>
+        <w:rPr>
+          <w:lang w:val="en-US"/>
+        </w:rPr>
+        <w:t>impoverment</w:t>
+      </w:r>
+      <w:proofErr w:type="spellEnd"/>
+    </w:p>
+    <w:p>
+      <w:pPr>
+        <w:rPr>
+          <w:lang w:val="en-US"/>
+        </w:rPr>
+      </w:pPr>
+      <w:r>
+        <w:rPr>
+          <w:lang w:val="en-US"/>
+        </w:rPr>
+        <w:t>Rule based</w:t>
+      </w:r>
+    </w:p>
+    <w:p>
+      <w:pPr>
+        <w:rPr>
+          <w:lang w:val="en-US"/>
+        </w:rPr>
+      </w:pPr>
+      <w:r>
+        <w:rPr>
+          <w:lang w:val="en-US"/>
+        </w:rPr>
+        <w:t>Make model adaptive</w:t>
+      </w:r>
+    </w:p>
+    <w:p>
+      <w:pPr>
+        <w:rPr>
+          <w:lang w:val="en-US"/>
+        </w:rPr>
+      </w:pPr>
+      <w:r>
+        <w:rPr>
+          <w:lang w:val="en-US"/>
+        </w:rPr>
+        <w:t>Synthetic data gen</w:t>
+      </w:r>
+    </w:p>
+    <w:p>
+      <w:pPr>
+        <w:rPr>
+          <w:lang w:val="en-US"/>
+        </w:rPr>
+      </w:pPr>
+      <w:r>
+        <w:rPr>
+          <w:lang w:val="en-US"/>
+        </w:rPr>
+        <w:br w:type="page"/>
+      </w:r>
+    </w:p>
+    <w:p>
+      <w:pPr>
+        <w:rPr>
+          <w:lang w:val="en-US"/>
+        </w:rPr>
+      </w:pPr>
+      <w:r>
+        <w:rPr>
+          <w:lang w:val="en-US"/>
+        </w:rPr>
+        <w:lastRenderedPageBreak/>
+        <w:br w:type="page"/>
+      </w:r>
+    </w:p>
+    <w:p>
+      <w:pPr>
+        <w:rPr>
+          <w:lang w:val="en-US"/>
+        </w:rPr>
+      </w:pPr>
+      <w:r>
+        <w:rPr>
+          <w:lang w:val="en-US"/>
+        </w:rPr>
+        <w:lastRenderedPageBreak/>
+        <w:t>Synthetic data gen</w:t>
+      </w:r>
+    </w:p>
+    <w:p>
+      <w:pPr>
+        <w:rPr>
+          <w:lang w:val="en-US"/>
+        </w:rPr>
+      </w:pPr>
+      <w:r>
+        <w:rPr>
+          <w:lang w:val="en-US"/>
+        </w:rPr>
+        <w:t>Multiple models and algos</w:t>
+      </w:r>
+    </w:p>
+    <w:p>
+      <w:pPr>
+        <w:rPr>
+          <w:lang w:val="en-US"/>
+        </w:rPr>
+      </w:pPr>
+      <w:r>
+        <w:rPr>
+          <w:lang w:val="en-US"/>
+        </w:rPr>
+        <w:t>Epochs increase</w:t>
+      </w:r>
+    </w:p>
+    <w:p>
+      <w:pPr>
+        <w:rPr>
+          <w:lang w:val="en-US"/>
+        </w:rPr>
+      </w:pPr>
+      <w:r>
+        <w:rPr>
+          <w:lang w:val="en-US"/>
+        </w:rPr>
+        <w:t>Data</w:t>
+      </w:r>
+    </w:p>
+    <w:p>
+      <w:pPr>
+        <w:rPr>
+          <w:lang w:val="en-US"/>
+        </w:rPr>
+      </w:pPr>
+    </w:p>
+    <w:p>
+      <w:pPr>
+        <w:rPr>
+          <w:lang w:val="en-US"/>
+        </w:rPr>
+      </w:pPr>
+    </w:p>
+    <w:p>
+      <w:pPr>
+        <w:rPr>
+          <w:lang w:val="en-US"/>
+        </w:rPr>
+      </w:pPr>
+    </w:p>
+    <w:p>
+      <w:pPr>
+        <w:pStyle w:val="ListParagraph"/>
+        <w:numPr>
+          <w:ilvl w:val="0"/>
+          <w:numId w:val="2"/>
+        </w:numPr>
+        <w:rPr>
+          <w:lang w:val="en-US"/>
+        </w:rPr>
+      </w:pPr>
+      <w:r>
+        <w:rPr>
+          <w:lang w:val="en-US"/>
+        </w:rPr>
+        <w:t>Create a single csv file concatenating all dataset files</w:t>
+      </w:r>
+    </w:p>
+    <w:p>
+      <w:pPr>
+        <w:pStyle w:val="ListParagraph"/>
+        <w:numPr>
+          <w:ilvl w:val="0"/>
+          <w:numId w:val="2"/>
+        </w:numPr>
+        <w:rPr>
+          <w:lang w:val="en-US"/>
+        </w:rPr>
+      </w:pPr>
+      <w:r>
+        <w:rPr>
+          <w:lang w:val="en-US"/>
+        </w:rPr>
+        <w:t xml:space="preserve">Features should be same for all datasets files </w:t>
+      </w:r>
+    </w:p>
+    <w:p>
+      <w:pPr>
+        <w:pStyle w:val="ListParagraph"/>
+        <w:numPr>
+          <w:ilvl w:val="0"/>
+          <w:numId w:val="2"/>
+        </w:numPr>
+        <w:rPr>
+          <w:lang w:val="en-US"/>
+        </w:rPr>
+      </w:pPr>
+      <w:r>
+        <w:rPr>
+          <w:lang w:val="en-US"/>
+        </w:rPr>
+        <w:t>Provide k-best from this file that are suitable for my legal advice chatbot (filtered feature engineering done)</w:t>
+      </w:r>
     </w:p>
     <w:sectPr>
       <w:pgSz w:w="11906" w:h="16838"/>
@@ -183,6 +431,195 @@
     </w:sectPr>
   </w:body>
 </w:document>
+</file>
+
+<file path=word/numbering.xml><?xml version="1.0" encoding="utf-8"?>
+<w:numbering xmlns:wpc="http://schemas.microsoft.com/office/word/2010/wordprocessingCanvas" xmlns:cx="http://schemas.microsoft.com/office/drawing/2014/chartex" xmlns:cx1="http://schemas.microsoft.com/office/drawing/2015/9/8/chartex" xmlns:cx2="http://schemas.microsoft.com/office/drawing/2015/10/21/chartex" xmlns:cx3="http://schemas.microsoft.com/office/drawing/2016/5/9/chartex" xmlns:cx4="http://schemas.microsoft.com/office/drawing/2016/5/10/chartex" xmlns:cx5="http://schemas.microsoft.com/office/drawing/2016/5/11/chartex" xmlns:cx6="http://schemas.microsoft.com/office/drawing/2016/5/12/chartex" xmlns:cx7="http://schemas.microsoft.com/office/drawing/2016/5/13/chartex" xmlns:cx8="http://schemas.microsoft.com/office/drawing/2016/5/14/chartex" xmlns:mc="http://schemas.openxmlformats.org/markup-compatibility/2006" xmlns:aink="http://schemas.microsoft.com/office/drawing/2016/ink" xmlns:am3d="http://schemas.microsoft.com/office/drawing/2017/model3d" xmlns:o="urn:schemas-microsoft-com:office:office" xmlns:r="http://schemas.openxmlformats.org/officeDocument/2006/relationships" xmlns:m="http://schemas.openxmlformats.org/officeDocument/2006/math" xmlns:v="urn:schemas-microsoft-com:vml" xmlns:wp14="http://schemas.microsoft.com/office/word/2010/wordprocessingDrawing" xmlns:wp="http://schemas.openxmlformats.org/drawingml/2006/wordprocessingDrawing" xmlns:w10="urn:schemas-microsoft-com:office:word" xmlns:w="http://schemas.openxmlformats.org/wordprocessingml/2006/main" xmlns:w14="http://schemas.microsoft.com/office/word/2010/wordml" xmlns:w15="http://schemas.microsoft.com/office/word/2012/wordml" xmlns:w16cex="http://schemas.microsoft.com/office/word/2018/wordml/cex" xmlns:w16cid="http://schemas.microsoft.com/office/word/2016/wordml/cid" xmlns:w16="http://schemas.microsoft.com/office/word/2018/wordml" xmlns:w16sdtdh="http://schemas.microsoft.com/office/word/2020/wordml/sdtdatahash" xmlns:w16se="http://schemas.microsoft.com/office/word/2015/wordml/symex" xmlns:wpg="http://schemas.microsoft.com/office/word/2010/wordprocessingGroup" xmlns:wpi="http://schemas.microsoft.com/office/word/2010/wordprocessingInk" xmlns:wne="http://schemas.microsoft.com/office/word/2006/wordml" xmlns:wps="http://schemas.microsoft.com/office/word/2010/wordprocessingShape" mc:Ignorable="w14 w15 w16se w16cid w16 w16cex w16sdtdh wp14">
+  <w:abstractNum w:abstractNumId="0" w15:restartNumberingAfterBreak="0">
+    <w:nsid w:val="02C60843"/>
+    <w:multiLevelType w:val="hybridMultilevel"/>
+    <w:tmpl w:val="26446F76"/>
+    <w:lvl w:ilvl="0" w:tplc="2000000F">
+      <w:start w:val="1"/>
+      <w:numFmt w:val="decimal"/>
+      <w:lvlText w:val="%1."/>
+      <w:lvlJc w:val="left"/>
+      <w:pPr>
+        <w:ind w:left="720" w:hanging="360"/>
+      </w:pPr>
+      <w:rPr>
+        <w:rFonts w:hint="default"/>
+      </w:rPr>
+    </w:lvl>
+    <w:lvl w:ilvl="1" w:tplc="20000019" w:tentative="1">
+      <w:start w:val="1"/>
+      <w:numFmt w:val="lowerLetter"/>
+      <w:lvlText w:val="%2."/>
+      <w:lvlJc w:val="left"/>
+      <w:pPr>
+        <w:ind w:left="1440" w:hanging="360"/>
+      </w:pPr>
+    </w:lvl>
+    <w:lvl w:ilvl="2" w:tplc="2000001B" w:tentative="1">
+      <w:start w:val="1"/>
+      <w:numFmt w:val="lowerRoman"/>
+      <w:lvlText w:val="%3."/>
+      <w:lvlJc w:val="right"/>
+      <w:pPr>
+        <w:ind w:left="2160" w:hanging="180"/>
+      </w:pPr>
+    </w:lvl>
+    <w:lvl w:ilvl="3" w:tplc="2000000F" w:tentative="1">
+      <w:start w:val="1"/>
+      <w:numFmt w:val="decimal"/>
+      <w:lvlText w:val="%4."/>
+      <w:lvlJc w:val="left"/>
+      <w:pPr>
+        <w:ind w:left="2880" w:hanging="360"/>
+      </w:pPr>
+    </w:lvl>
+    <w:lvl w:ilvl="4" w:tplc="20000019" w:tentative="1">
+      <w:start w:val="1"/>
+      <w:numFmt w:val="lowerLetter"/>
+      <w:lvlText w:val="%5."/>
+      <w:lvlJc w:val="left"/>
+      <w:pPr>
+        <w:ind w:left="3600" w:hanging="360"/>
+      </w:pPr>
+    </w:lvl>
+    <w:lvl w:ilvl="5" w:tplc="2000001B" w:tentative="1">
+      <w:start w:val="1"/>
+      <w:numFmt w:val="lowerRoman"/>
+      <w:lvlText w:val="%6."/>
+      <w:lvlJc w:val="right"/>
+      <w:pPr>
+        <w:ind w:left="4320" w:hanging="180"/>
+      </w:pPr>
+    </w:lvl>
+    <w:lvl w:ilvl="6" w:tplc="2000000F" w:tentative="1">
+      <w:start w:val="1"/>
+      <w:numFmt w:val="decimal"/>
+      <w:lvlText w:val="%7."/>
+      <w:lvlJc w:val="left"/>
+      <w:pPr>
+        <w:ind w:left="5040" w:hanging="360"/>
+      </w:pPr>
+    </w:lvl>
+    <w:lvl w:ilvl="7" w:tplc="20000019" w:tentative="1">
+      <w:start w:val="1"/>
+      <w:numFmt w:val="lowerLetter"/>
+      <w:lvlText w:val="%8."/>
+      <w:lvlJc w:val="left"/>
+      <w:pPr>
+        <w:ind w:left="5760" w:hanging="360"/>
+      </w:pPr>
+    </w:lvl>
+    <w:lvl w:ilvl="8" w:tplc="2000001B" w:tentative="1">
+      <w:start w:val="1"/>
+      <w:numFmt w:val="lowerRoman"/>
+      <w:lvlText w:val="%9."/>
+      <w:lvlJc w:val="right"/>
+      <w:pPr>
+        <w:ind w:left="6480" w:hanging="180"/>
+      </w:pPr>
+    </w:lvl>
+  </w:abstractNum>
+  <w:abstractNum w:abstractNumId="1" w15:restartNumberingAfterBreak="0">
+    <w:nsid w:val="31012CDF"/>
+    <w:multiLevelType w:val="hybridMultilevel"/>
+    <w:tmpl w:val="4FDE6AEE"/>
+    <w:lvl w:ilvl="0" w:tplc="2000000F">
+      <w:start w:val="1"/>
+      <w:numFmt w:val="decimal"/>
+      <w:lvlText w:val="%1."/>
+      <w:lvlJc w:val="left"/>
+      <w:pPr>
+        <w:ind w:left="720" w:hanging="360"/>
+      </w:pPr>
+      <w:rPr>
+        <w:rFonts w:hint="default"/>
+      </w:rPr>
+    </w:lvl>
+    <w:lvl w:ilvl="1" w:tplc="20000019" w:tentative="1">
+      <w:start w:val="1"/>
+      <w:numFmt w:val="lowerLetter"/>
+      <w:lvlText w:val="%2."/>
+      <w:lvlJc w:val="left"/>
+      <w:pPr>
+        <w:ind w:left="1440" w:hanging="360"/>
+      </w:pPr>
+    </w:lvl>
+    <w:lvl w:ilvl="2" w:tplc="2000001B" w:tentative="1">
+      <w:start w:val="1"/>
+      <w:numFmt w:val="lowerRoman"/>
+      <w:lvlText w:val="%3."/>
+      <w:lvlJc w:val="right"/>
+      <w:pPr>
+        <w:ind w:left="2160" w:hanging="180"/>
+      </w:pPr>
+    </w:lvl>
+    <w:lvl w:ilvl="3" w:tplc="2000000F" w:tentative="1">
+      <w:start w:val="1"/>
+      <w:numFmt w:val="decimal"/>
+      <w:lvlText w:val="%4."/>
+      <w:lvlJc w:val="left"/>
+      <w:pPr>
+        <w:ind w:left="2880" w:hanging="360"/>
+      </w:pPr>
+    </w:lvl>
+    <w:lvl w:ilvl="4" w:tplc="20000019" w:tentative="1">
+      <w:start w:val="1"/>
+      <w:numFmt w:val="lowerLetter"/>
+      <w:lvlText w:val="%5."/>
+      <w:lvlJc w:val="left"/>
+      <w:pPr>
+        <w:ind w:left="3600" w:hanging="360"/>
+      </w:pPr>
+    </w:lvl>
+    <w:lvl w:ilvl="5" w:tplc="2000001B" w:tentative="1">
+      <w:start w:val="1"/>
+      <w:numFmt w:val="lowerRoman"/>
+      <w:lvlText w:val="%6."/>
+      <w:lvlJc w:val="right"/>
+      <w:pPr>
+        <w:ind w:left="4320" w:hanging="180"/>
+      </w:pPr>
+    </w:lvl>
+    <w:lvl w:ilvl="6" w:tplc="2000000F" w:tentative="1">
+      <w:start w:val="1"/>
+      <w:numFmt w:val="decimal"/>
+      <w:lvlText w:val="%7."/>
+      <w:lvlJc w:val="left"/>
+      <w:pPr>
+        <w:ind w:left="5040" w:hanging="360"/>
+      </w:pPr>
+    </w:lvl>
+    <w:lvl w:ilvl="7" w:tplc="20000019" w:tentative="1">
+      <w:start w:val="1"/>
+      <w:numFmt w:val="lowerLetter"/>
+      <w:lvlText w:val="%8."/>
+      <w:lvlJc w:val="left"/>
+      <w:pPr>
+        <w:ind w:left="5760" w:hanging="360"/>
+      </w:pPr>
+    </w:lvl>
+    <w:lvl w:ilvl="8" w:tplc="2000001B" w:tentative="1">
+      <w:start w:val="1"/>
+      <w:numFmt w:val="lowerRoman"/>
+      <w:lvlText w:val="%9."/>
+      <w:lvlJc w:val="right"/>
+      <w:pPr>
+        <w:ind w:left="6480" w:hanging="180"/>
+      </w:pPr>
+    </w:lvl>
+  </w:abstractNum>
+  <w:num w:numId="1">
+    <w:abstractNumId w:val="0"/>
+  </w:num>
+  <w:num w:numId="2">
+    <w:abstractNumId w:val="1"/>
+  </w:num>
+</w:numbering>
 </file>
 
 <file path=word/styles.xml><?xml version="1.0" encoding="utf-8"?>
@@ -584,26 +1021,6 @@
     <w:name w:val="Normal"/>
     <w:qFormat/>
   </w:style>
-  <w:style w:type="paragraph" w:styleId="Heading3">
-    <w:name w:val="heading 3"/>
-    <w:basedOn w:val="Normal"/>
-    <w:link w:val="Heading3Char"/>
-    <w:uiPriority w:val="9"/>
-    <w:qFormat/>
-    <w:rsid w:val="0063638C"/>
-    <w:pPr>
-      <w:spacing w:before="100" w:beforeAutospacing="1" w:after="100" w:afterAutospacing="1" w:line="240" w:lineRule="auto"/>
-      <w:outlineLvl w:val="2"/>
-    </w:pPr>
-    <w:rPr>
-      <w:rFonts w:ascii="Times New Roman" w:eastAsia="Times New Roman" w:hAnsi="Times New Roman" w:cs="Times New Roman"/>
-      <w:b/>
-      <w:bCs/>
-      <w:sz w:val="27"/>
-      <w:szCs w:val="27"/>
-      <w:lang w:eastAsia="en-PK"/>
-    </w:rPr>
-  </w:style>
   <w:style w:type="character" w:default="1" w:styleId="DefaultParagraphFont">
     <w:name w:val="Default Paragraph Font"/>
     <w:uiPriority w:val="1"/>
@@ -631,31 +1048,16 @@
     <w:semiHidden/>
     <w:unhideWhenUsed/>
   </w:style>
-  <w:style w:type="character" w:customStyle="1" w:styleId="Heading3Char">
-    <w:name w:val="Heading 3 Char"/>
-    <w:basedOn w:val="DefaultParagraphFont"/>
-    <w:link w:val="Heading3"/>
-    <w:uiPriority w:val="9"/>
-    <w:rsid w:val="0063638C"/>
-    <w:rPr>
-      <w:rFonts w:ascii="Times New Roman" w:eastAsia="Times New Roman" w:hAnsi="Times New Roman" w:cs="Times New Roman"/>
-      <w:b/>
-      <w:bCs/>
-      <w:sz w:val="27"/>
-      <w:szCs w:val="27"/>
-      <w:lang w:val="en-PK" w:eastAsia="en-PK"/>
-    </w:rPr>
-  </w:style>
-  <w:style w:type="character" w:styleId="Strong">
-    <w:name w:val="Strong"/>
-    <w:basedOn w:val="DefaultParagraphFont"/>
-    <w:uiPriority w:val="22"/>
+  <w:style w:type="paragraph" w:styleId="ListParagraph">
+    <w:name w:val="List Paragraph"/>
+    <w:basedOn w:val="Normal"/>
+    <w:uiPriority w:val="34"/>
     <w:qFormat/>
-    <w:rsid w:val="0063638C"/>
-    <w:rPr>
-      <w:b/>
-      <w:bCs/>
-    </w:rPr>
+    <w:rsid w:val="00994484"/>
+    <w:pPr>
+      <w:ind w:left="720"/>
+      <w:contextualSpacing/>
+    </w:pPr>
   </w:style>
 </w:styles>
 </file>
@@ -953,4 +1355,16 @@
     </a:ext>
   </a:extLst>
 </a:theme>
+</file>
+
+<file path=customXml/item1.xml><?xml version="1.0" encoding="utf-8"?>
+<b:Sources xmlns:b="http://schemas.openxmlformats.org/officeDocument/2006/bibliography" xmlns="http://schemas.openxmlformats.org/officeDocument/2006/bibliography" SelectedStyle="\APASixthEditionOfficeOnline.xsl" StyleName="APA" Version="6"/>
+</file>
+
+<file path=customXml/itemProps1.xml><?xml version="1.0" encoding="utf-8"?>
+<ds:datastoreItem xmlns:ds="http://schemas.openxmlformats.org/officeDocument/2006/customXml" ds:itemID="{7D6E30FF-3B20-4652-85DD-133401FAD500}">
+  <ds:schemaRefs>
+    <ds:schemaRef ds:uri="http://schemas.openxmlformats.org/officeDocument/2006/bibliography"/>
+  </ds:schemaRefs>
+</ds:datastoreItem>
 </file>
</xml_diff>

<commit_message>
new data gathering and setting for better fine tunning
</commit_message>
<xml_diff>
--- a/docs/dataForTaining-chatBot/type of data.docx
+++ b/docs/dataForTaining-chatBot/type of data.docx
@@ -2,6 +2,2494 @@
 <file path=word/document.xml><?xml version="1.0" encoding="utf-8"?>
 <w:document xmlns:wpc="http://schemas.microsoft.com/office/word/2010/wordprocessingCanvas" xmlns:cx="http://schemas.microsoft.com/office/drawing/2014/chartex" xmlns:cx1="http://schemas.microsoft.com/office/drawing/2015/9/8/chartex" xmlns:cx2="http://schemas.microsoft.com/office/drawing/2015/10/21/chartex" xmlns:cx3="http://schemas.microsoft.com/office/drawing/2016/5/9/chartex" xmlns:cx4="http://schemas.microsoft.com/office/drawing/2016/5/10/chartex" xmlns:cx5="http://schemas.microsoft.com/office/drawing/2016/5/11/chartex" xmlns:cx6="http://schemas.microsoft.com/office/drawing/2016/5/12/chartex" xmlns:cx7="http://schemas.microsoft.com/office/drawing/2016/5/13/chartex" xmlns:cx8="http://schemas.microsoft.com/office/drawing/2016/5/14/chartex" xmlns:mc="http://schemas.openxmlformats.org/markup-compatibility/2006" xmlns:aink="http://schemas.microsoft.com/office/drawing/2016/ink" xmlns:am3d="http://schemas.microsoft.com/office/drawing/2017/model3d" xmlns:o="urn:schemas-microsoft-com:office:office" xmlns:r="http://schemas.openxmlformats.org/officeDocument/2006/relationships" xmlns:m="http://schemas.openxmlformats.org/officeDocument/2006/math" xmlns:v="urn:schemas-microsoft-com:vml" xmlns:wp14="http://schemas.microsoft.com/office/word/2010/wordprocessingDrawing" xmlns:wp="http://schemas.openxmlformats.org/drawingml/2006/wordprocessingDrawing" xmlns:w10="urn:schemas-microsoft-com:office:word" xmlns:w="http://schemas.openxmlformats.org/wordprocessingml/2006/main" xmlns:w14="http://schemas.microsoft.com/office/word/2010/wordml" xmlns:w15="http://schemas.microsoft.com/office/word/2012/wordml" xmlns:w16cex="http://schemas.microsoft.com/office/word/2018/wordml/cex" xmlns:w16cid="http://schemas.microsoft.com/office/word/2016/wordml/cid" xmlns:w16="http://schemas.microsoft.com/office/word/2018/wordml" xmlns:w16sdtdh="http://schemas.microsoft.com/office/word/2020/wordml/sdtdatahash" xmlns:w16se="http://schemas.microsoft.com/office/word/2015/wordml/symex" xmlns:wpg="http://schemas.microsoft.com/office/word/2010/wordprocessingGroup" xmlns:wpi="http://schemas.microsoft.com/office/word/2010/wordprocessingInk" xmlns:wne="http://schemas.microsoft.com/office/word/2006/wordml" xmlns:wps="http://schemas.microsoft.com/office/word/2010/wordprocessingShape" mc:Ignorable="w14 w15 w16se w16cid w16 w16cex w16sdtdh wp14">
   <w:body>
+    <w:p>
+      <w:pPr>
+        <w:rPr>
+          <w:sz w:val="24"/>
+          <w:szCs w:val="24"/>
+          <w:lang w:val="en-US"/>
+        </w:rPr>
+      </w:pPr>
+      <w:r>
+        <w:rPr>
+          <w:sz w:val="24"/>
+          <w:szCs w:val="24"/>
+          <w:lang w:val="en-US"/>
+        </w:rPr>
+        <w:t xml:space="preserve">Steps to perform on data before fine </w:t>
+      </w:r>
+      <w:proofErr w:type="spellStart"/>
+      <w:r>
+        <w:rPr>
+          <w:sz w:val="24"/>
+          <w:szCs w:val="24"/>
+          <w:lang w:val="en-US"/>
+        </w:rPr>
+        <w:t>tunning</w:t>
+      </w:r>
+      <w:proofErr w:type="spellEnd"/>
+      <w:r>
+        <w:rPr>
+          <w:sz w:val="24"/>
+          <w:szCs w:val="24"/>
+          <w:lang w:val="en-US"/>
+        </w:rPr>
+        <w:t>:</w:t>
+      </w:r>
+    </w:p>
+    <w:p>
+      <w:pPr>
+        <w:numPr>
+          <w:ilvl w:val="0"/>
+          <w:numId w:val="3"/>
+        </w:numPr>
+        <w:spacing w:before="100" w:beforeAutospacing="1" w:after="100" w:afterAutospacing="1" w:line="240" w:lineRule="auto"/>
+        <w:rPr>
+          <w:rFonts w:eastAsia="Times New Roman" w:cstheme="minorHAnsi"/>
+          <w:sz w:val="24"/>
+          <w:szCs w:val="24"/>
+          <w:lang w:val="en-PK" w:eastAsia="en-PK"/>
+        </w:rPr>
+      </w:pPr>
+      <w:r>
+        <w:rPr>
+          <w:rFonts w:eastAsia="Times New Roman" w:cstheme="minorHAnsi"/>
+          <w:b/>
+          <w:bCs/>
+          <w:sz w:val="24"/>
+          <w:szCs w:val="24"/>
+          <w:lang w:val="en-PK" w:eastAsia="en-PK"/>
+        </w:rPr>
+        <w:t>Collect all datasets</w:t>
+      </w:r>
+      <w:r>
+        <w:rPr>
+          <w:rFonts w:eastAsia="Times New Roman" w:cstheme="minorHAnsi"/>
+          <w:sz w:val="24"/>
+          <w:szCs w:val="24"/>
+          <w:lang w:val="en-PK" w:eastAsia="en-PK"/>
+        </w:rPr>
+        <w:br/>
+        <w:t>Gather all judgments, laws, summaries, PDFs, scraped text, etc.</w:t>
+      </w:r>
+    </w:p>
+    <w:p>
+      <w:pPr>
+        <w:numPr>
+          <w:ilvl w:val="0"/>
+          <w:numId w:val="3"/>
+        </w:numPr>
+        <w:spacing w:before="100" w:beforeAutospacing="1" w:after="100" w:afterAutospacing="1" w:line="240" w:lineRule="auto"/>
+        <w:rPr>
+          <w:rFonts w:eastAsia="Times New Roman" w:cstheme="minorHAnsi"/>
+          <w:sz w:val="24"/>
+          <w:szCs w:val="24"/>
+          <w:lang w:val="en-PK" w:eastAsia="en-PK"/>
+        </w:rPr>
+      </w:pPr>
+      <w:r>
+        <w:rPr>
+          <w:rFonts w:eastAsia="Times New Roman" w:cstheme="minorHAnsi"/>
+          <w:b/>
+          <w:bCs/>
+          <w:sz w:val="24"/>
+          <w:szCs w:val="24"/>
+          <w:lang w:val="en-PK" w:eastAsia="en-PK"/>
+        </w:rPr>
+        <w:t>Convert to uniform text format</w:t>
+      </w:r>
+      <w:r>
+        <w:rPr>
+          <w:rFonts w:eastAsia="Times New Roman" w:cstheme="minorHAnsi"/>
+          <w:sz w:val="24"/>
+          <w:szCs w:val="24"/>
+          <w:lang w:val="en-PK" w:eastAsia="en-PK"/>
+        </w:rPr>
+        <w:br/>
+        <w:t>Convert PDFs/HTML/</w:t>
+      </w:r>
+      <w:proofErr w:type="spellStart"/>
+      <w:r>
+        <w:rPr>
+          <w:rFonts w:eastAsia="Times New Roman" w:cstheme="minorHAnsi"/>
+          <w:sz w:val="24"/>
+          <w:szCs w:val="24"/>
+          <w:lang w:val="en-PK" w:eastAsia="en-PK"/>
+        </w:rPr>
+        <w:t>DOCs</w:t>
+      </w:r>
+      <w:proofErr w:type="spellEnd"/>
+      <w:r>
+        <w:rPr>
+          <w:rFonts w:eastAsia="Times New Roman" w:cstheme="minorHAnsi"/>
+          <w:sz w:val="24"/>
+          <w:szCs w:val="24"/>
+          <w:lang w:val="en-PK" w:eastAsia="en-PK"/>
+        </w:rPr>
+        <w:t xml:space="preserve"> → clean plain text (UTF-8).</w:t>
+      </w:r>
+    </w:p>
+    <w:p>
+      <w:pPr>
+        <w:numPr>
+          <w:ilvl w:val="0"/>
+          <w:numId w:val="3"/>
+        </w:numPr>
+        <w:spacing w:before="100" w:beforeAutospacing="1" w:after="100" w:afterAutospacing="1" w:line="240" w:lineRule="auto"/>
+        <w:rPr>
+          <w:rFonts w:eastAsia="Times New Roman" w:cstheme="minorHAnsi"/>
+          <w:sz w:val="24"/>
+          <w:szCs w:val="24"/>
+          <w:lang w:val="en-PK" w:eastAsia="en-PK"/>
+        </w:rPr>
+      </w:pPr>
+      <w:r>
+        <w:rPr>
+          <w:rFonts w:eastAsia="Times New Roman" w:cstheme="minorHAnsi"/>
+          <w:b/>
+          <w:bCs/>
+          <w:sz w:val="24"/>
+          <w:szCs w:val="24"/>
+          <w:lang w:val="en-PK" w:eastAsia="en-PK"/>
+        </w:rPr>
+        <w:t>Clean the raw text</w:t>
+      </w:r>
+    </w:p>
+    <w:p>
+      <w:pPr>
+        <w:numPr>
+          <w:ilvl w:val="1"/>
+          <w:numId w:val="3"/>
+        </w:numPr>
+        <w:spacing w:before="100" w:beforeAutospacing="1" w:after="100" w:afterAutospacing="1" w:line="240" w:lineRule="auto"/>
+        <w:rPr>
+          <w:rFonts w:eastAsia="Times New Roman" w:cstheme="minorHAnsi"/>
+          <w:sz w:val="24"/>
+          <w:szCs w:val="24"/>
+          <w:lang w:val="en-PK" w:eastAsia="en-PK"/>
+        </w:rPr>
+      </w:pPr>
+      <w:r>
+        <w:rPr>
+          <w:rFonts w:eastAsia="Times New Roman" w:cstheme="minorHAnsi"/>
+          <w:sz w:val="24"/>
+          <w:szCs w:val="24"/>
+          <w:lang w:val="en-PK" w:eastAsia="en-PK"/>
+        </w:rPr>
+        <w:t>Remove headers/footers</w:t>
+      </w:r>
+    </w:p>
+    <w:p>
+      <w:pPr>
+        <w:numPr>
+          <w:ilvl w:val="1"/>
+          <w:numId w:val="3"/>
+        </w:numPr>
+        <w:spacing w:before="100" w:beforeAutospacing="1" w:after="100" w:afterAutospacing="1" w:line="240" w:lineRule="auto"/>
+        <w:rPr>
+          <w:rFonts w:eastAsia="Times New Roman" w:cstheme="minorHAnsi"/>
+          <w:sz w:val="24"/>
+          <w:szCs w:val="24"/>
+          <w:lang w:val="en-PK" w:eastAsia="en-PK"/>
+        </w:rPr>
+      </w:pPr>
+      <w:r>
+        <w:rPr>
+          <w:rFonts w:eastAsia="Times New Roman" w:cstheme="minorHAnsi"/>
+          <w:sz w:val="24"/>
+          <w:szCs w:val="24"/>
+          <w:lang w:val="en-PK" w:eastAsia="en-PK"/>
+        </w:rPr>
+        <w:t>Remove page numbers, dates, junk symbols</w:t>
+      </w:r>
+    </w:p>
+    <w:p>
+      <w:pPr>
+        <w:numPr>
+          <w:ilvl w:val="1"/>
+          <w:numId w:val="3"/>
+        </w:numPr>
+        <w:spacing w:before="100" w:beforeAutospacing="1" w:after="100" w:afterAutospacing="1" w:line="240" w:lineRule="auto"/>
+        <w:rPr>
+          <w:rFonts w:eastAsia="Times New Roman" w:cstheme="minorHAnsi"/>
+          <w:sz w:val="24"/>
+          <w:szCs w:val="24"/>
+          <w:lang w:val="en-PK" w:eastAsia="en-PK"/>
+        </w:rPr>
+      </w:pPr>
+      <w:r>
+        <w:rPr>
+          <w:rFonts w:eastAsia="Times New Roman" w:cstheme="minorHAnsi"/>
+          <w:sz w:val="24"/>
+          <w:szCs w:val="24"/>
+          <w:lang w:val="en-PK" w:eastAsia="en-PK"/>
+        </w:rPr>
+        <w:t>Fix spacing, line breaks</w:t>
+      </w:r>
+    </w:p>
+    <w:p>
+      <w:pPr>
+        <w:numPr>
+          <w:ilvl w:val="1"/>
+          <w:numId w:val="3"/>
+        </w:numPr>
+        <w:spacing w:before="100" w:beforeAutospacing="1" w:after="100" w:afterAutospacing="1" w:line="240" w:lineRule="auto"/>
+        <w:rPr>
+          <w:rFonts w:eastAsia="Times New Roman" w:cstheme="minorHAnsi"/>
+          <w:sz w:val="24"/>
+          <w:szCs w:val="24"/>
+          <w:lang w:val="en-PK" w:eastAsia="en-PK"/>
+        </w:rPr>
+      </w:pPr>
+      <w:r>
+        <w:rPr>
+          <w:rFonts w:eastAsia="Times New Roman" w:cstheme="minorHAnsi"/>
+          <w:sz w:val="24"/>
+          <w:szCs w:val="24"/>
+          <w:lang w:val="en-PK" w:eastAsia="en-PK"/>
+        </w:rPr>
+        <w:t>Remove duplicate cases</w:t>
+      </w:r>
+    </w:p>
+    <w:p>
+      <w:pPr>
+        <w:numPr>
+          <w:ilvl w:val="0"/>
+          <w:numId w:val="3"/>
+        </w:numPr>
+        <w:spacing w:before="100" w:beforeAutospacing="1" w:after="100" w:afterAutospacing="1" w:line="240" w:lineRule="auto"/>
+        <w:rPr>
+          <w:rFonts w:eastAsia="Times New Roman" w:cstheme="minorHAnsi"/>
+          <w:sz w:val="24"/>
+          <w:szCs w:val="24"/>
+          <w:lang w:val="en-PK" w:eastAsia="en-PK"/>
+        </w:rPr>
+      </w:pPr>
+      <w:r>
+        <w:rPr>
+          <w:rFonts w:eastAsia="Times New Roman" w:cstheme="minorHAnsi"/>
+          <w:b/>
+          <w:bCs/>
+          <w:sz w:val="24"/>
+          <w:szCs w:val="24"/>
+          <w:lang w:val="en-PK" w:eastAsia="en-PK"/>
+        </w:rPr>
+        <w:t>Standardize structure</w:t>
+      </w:r>
+    </w:p>
+    <w:p>
+      <w:pPr>
+        <w:numPr>
+          <w:ilvl w:val="1"/>
+          <w:numId w:val="3"/>
+        </w:numPr>
+        <w:spacing w:before="100" w:beforeAutospacing="1" w:after="100" w:afterAutospacing="1" w:line="240" w:lineRule="auto"/>
+        <w:rPr>
+          <w:rFonts w:eastAsia="Times New Roman" w:cstheme="minorHAnsi"/>
+          <w:sz w:val="24"/>
+          <w:szCs w:val="24"/>
+          <w:lang w:val="en-PK" w:eastAsia="en-PK"/>
+        </w:rPr>
+      </w:pPr>
+      <w:r>
+        <w:rPr>
+          <w:rFonts w:eastAsia="Times New Roman" w:cstheme="minorHAnsi"/>
+          <w:sz w:val="24"/>
+          <w:szCs w:val="24"/>
+          <w:lang w:val="en-PK" w:eastAsia="en-PK"/>
+        </w:rPr>
+        <w:t xml:space="preserve">Extract and label sections (e.g., </w:t>
+      </w:r>
+      <w:r>
+        <w:rPr>
+          <w:rFonts w:eastAsia="Times New Roman" w:cstheme="minorHAnsi"/>
+          <w:i/>
+          <w:iCs/>
+          <w:sz w:val="24"/>
+          <w:szCs w:val="24"/>
+          <w:lang w:val="en-PK" w:eastAsia="en-PK"/>
+        </w:rPr>
+        <w:t>Facts, Issue, Arguments, Decision</w:t>
+      </w:r>
+      <w:r>
+        <w:rPr>
+          <w:rFonts w:eastAsia="Times New Roman" w:cstheme="minorHAnsi"/>
+          <w:sz w:val="24"/>
+          <w:szCs w:val="24"/>
+          <w:lang w:val="en-PK" w:eastAsia="en-PK"/>
+        </w:rPr>
+        <w:t>)</w:t>
+      </w:r>
+    </w:p>
+    <w:p>
+      <w:pPr>
+        <w:numPr>
+          <w:ilvl w:val="1"/>
+          <w:numId w:val="3"/>
+        </w:numPr>
+        <w:spacing w:before="100" w:beforeAutospacing="1" w:after="100" w:afterAutospacing="1" w:line="240" w:lineRule="auto"/>
+        <w:rPr>
+          <w:rFonts w:eastAsia="Times New Roman" w:cstheme="minorHAnsi"/>
+          <w:sz w:val="24"/>
+          <w:szCs w:val="24"/>
+          <w:lang w:val="en-PK" w:eastAsia="en-PK"/>
+        </w:rPr>
+      </w:pPr>
+      <w:r>
+        <w:rPr>
+          <w:rFonts w:eastAsia="Times New Roman" w:cstheme="minorHAnsi"/>
+          <w:sz w:val="24"/>
+          <w:szCs w:val="24"/>
+          <w:lang w:val="en-PK" w:eastAsia="en-PK"/>
+        </w:rPr>
+        <w:t>Ensure every file follows the same structure.</w:t>
+      </w:r>
+    </w:p>
+    <w:p>
+      <w:pPr>
+        <w:numPr>
+          <w:ilvl w:val="0"/>
+          <w:numId w:val="3"/>
+        </w:numPr>
+        <w:spacing w:before="100" w:beforeAutospacing="1" w:after="100" w:afterAutospacing="1" w:line="240" w:lineRule="auto"/>
+        <w:rPr>
+          <w:rFonts w:eastAsia="Times New Roman" w:cstheme="minorHAnsi"/>
+          <w:sz w:val="24"/>
+          <w:szCs w:val="24"/>
+          <w:lang w:val="en-PK" w:eastAsia="en-PK"/>
+        </w:rPr>
+      </w:pPr>
+      <w:r>
+        <w:rPr>
+          <w:rFonts w:eastAsia="Times New Roman" w:cstheme="minorHAnsi"/>
+          <w:b/>
+          <w:bCs/>
+          <w:sz w:val="24"/>
+          <w:szCs w:val="24"/>
+          <w:lang w:val="en-PK" w:eastAsia="en-PK"/>
+        </w:rPr>
+        <w:t>Normalize content</w:t>
+      </w:r>
+    </w:p>
+    <w:p>
+      <w:pPr>
+        <w:numPr>
+          <w:ilvl w:val="1"/>
+          <w:numId w:val="3"/>
+        </w:numPr>
+        <w:spacing w:before="100" w:beforeAutospacing="1" w:after="100" w:afterAutospacing="1" w:line="240" w:lineRule="auto"/>
+        <w:rPr>
+          <w:rFonts w:eastAsia="Times New Roman" w:cstheme="minorHAnsi"/>
+          <w:sz w:val="24"/>
+          <w:szCs w:val="24"/>
+          <w:lang w:val="en-PK" w:eastAsia="en-PK"/>
+        </w:rPr>
+      </w:pPr>
+      <w:r>
+        <w:rPr>
+          <w:rFonts w:eastAsia="Times New Roman" w:cstheme="minorHAnsi"/>
+          <w:sz w:val="24"/>
+          <w:szCs w:val="24"/>
+          <w:lang w:val="en-PK" w:eastAsia="en-PK"/>
+        </w:rPr>
+        <w:t>Standardize case names</w:t>
+      </w:r>
+    </w:p>
+    <w:p>
+      <w:pPr>
+        <w:numPr>
+          <w:ilvl w:val="1"/>
+          <w:numId w:val="3"/>
+        </w:numPr>
+        <w:spacing w:before="100" w:beforeAutospacing="1" w:after="100" w:afterAutospacing="1" w:line="240" w:lineRule="auto"/>
+        <w:rPr>
+          <w:rFonts w:eastAsia="Times New Roman" w:cstheme="minorHAnsi"/>
+          <w:sz w:val="24"/>
+          <w:szCs w:val="24"/>
+          <w:lang w:val="en-PK" w:eastAsia="en-PK"/>
+        </w:rPr>
+      </w:pPr>
+      <w:r>
+        <w:rPr>
+          <w:rFonts w:eastAsia="Times New Roman" w:cstheme="minorHAnsi"/>
+          <w:sz w:val="24"/>
+          <w:szCs w:val="24"/>
+          <w:lang w:val="en-PK" w:eastAsia="en-PK"/>
+        </w:rPr>
+        <w:t>Fix inconsistent punctuation</w:t>
+      </w:r>
+    </w:p>
+    <w:p>
+      <w:pPr>
+        <w:numPr>
+          <w:ilvl w:val="1"/>
+          <w:numId w:val="3"/>
+        </w:numPr>
+        <w:spacing w:before="100" w:beforeAutospacing="1" w:after="100" w:afterAutospacing="1" w:line="240" w:lineRule="auto"/>
+        <w:rPr>
+          <w:rFonts w:eastAsia="Times New Roman" w:cstheme="minorHAnsi"/>
+          <w:sz w:val="24"/>
+          <w:szCs w:val="24"/>
+          <w:lang w:val="en-PK" w:eastAsia="en-PK"/>
+        </w:rPr>
+      </w:pPr>
+      <w:r>
+        <w:rPr>
+          <w:rFonts w:eastAsia="Times New Roman" w:cstheme="minorHAnsi"/>
+          <w:sz w:val="24"/>
+          <w:szCs w:val="24"/>
+          <w:lang w:val="en-PK" w:eastAsia="en-PK"/>
+        </w:rPr>
+        <w:t>Normalize legal citations format</w:t>
+      </w:r>
+    </w:p>
+    <w:p>
+      <w:pPr>
+        <w:numPr>
+          <w:ilvl w:val="1"/>
+          <w:numId w:val="3"/>
+        </w:numPr>
+        <w:spacing w:before="100" w:beforeAutospacing="1" w:after="100" w:afterAutospacing="1" w:line="240" w:lineRule="auto"/>
+        <w:rPr>
+          <w:rFonts w:eastAsia="Times New Roman" w:cstheme="minorHAnsi"/>
+          <w:sz w:val="24"/>
+          <w:szCs w:val="24"/>
+          <w:lang w:val="en-PK" w:eastAsia="en-PK"/>
+        </w:rPr>
+      </w:pPr>
+      <w:r>
+        <w:rPr>
+          <w:rFonts w:eastAsia="Times New Roman" w:cstheme="minorHAnsi"/>
+          <w:sz w:val="24"/>
+          <w:szCs w:val="24"/>
+          <w:lang w:val="en-PK" w:eastAsia="en-PK"/>
+        </w:rPr>
+        <w:t>Standardize glossary terms</w:t>
+      </w:r>
+    </w:p>
+    <w:p>
+      <w:pPr>
+        <w:numPr>
+          <w:ilvl w:val="0"/>
+          <w:numId w:val="3"/>
+        </w:numPr>
+        <w:spacing w:before="100" w:beforeAutospacing="1" w:after="100" w:afterAutospacing="1" w:line="240" w:lineRule="auto"/>
+        <w:rPr>
+          <w:rFonts w:eastAsia="Times New Roman" w:cstheme="minorHAnsi"/>
+          <w:sz w:val="24"/>
+          <w:szCs w:val="24"/>
+          <w:lang w:val="en-PK" w:eastAsia="en-PK"/>
+        </w:rPr>
+      </w:pPr>
+      <w:r>
+        <w:rPr>
+          <w:rFonts w:eastAsia="Times New Roman" w:cstheme="minorHAnsi"/>
+          <w:b/>
+          <w:bCs/>
+          <w:sz w:val="24"/>
+          <w:szCs w:val="24"/>
+          <w:lang w:val="en-PK" w:eastAsia="en-PK"/>
+        </w:rPr>
+        <w:t>Remove irrelevant content</w:t>
+      </w:r>
+    </w:p>
+    <w:p>
+      <w:pPr>
+        <w:numPr>
+          <w:ilvl w:val="1"/>
+          <w:numId w:val="3"/>
+        </w:numPr>
+        <w:spacing w:before="100" w:beforeAutospacing="1" w:after="100" w:afterAutospacing="1" w:line="240" w:lineRule="auto"/>
+        <w:rPr>
+          <w:rFonts w:eastAsia="Times New Roman" w:cstheme="minorHAnsi"/>
+          <w:sz w:val="24"/>
+          <w:szCs w:val="24"/>
+          <w:lang w:val="en-PK" w:eastAsia="en-PK"/>
+        </w:rPr>
+      </w:pPr>
+      <w:r>
+        <w:rPr>
+          <w:rFonts w:eastAsia="Times New Roman" w:cstheme="minorHAnsi"/>
+          <w:sz w:val="24"/>
+          <w:szCs w:val="24"/>
+          <w:lang w:val="en-PK" w:eastAsia="en-PK"/>
+        </w:rPr>
+        <w:t>Ads, website menus, copyright stamps</w:t>
+      </w:r>
+    </w:p>
+    <w:p>
+      <w:pPr>
+        <w:numPr>
+          <w:ilvl w:val="1"/>
+          <w:numId w:val="3"/>
+        </w:numPr>
+        <w:spacing w:before="100" w:beforeAutospacing="1" w:after="100" w:afterAutospacing="1" w:line="240" w:lineRule="auto"/>
+        <w:rPr>
+          <w:rFonts w:eastAsia="Times New Roman" w:cstheme="minorHAnsi"/>
+          <w:sz w:val="24"/>
+          <w:szCs w:val="24"/>
+          <w:lang w:val="en-PK" w:eastAsia="en-PK"/>
+        </w:rPr>
+      </w:pPr>
+      <w:r>
+        <w:rPr>
+          <w:rFonts w:eastAsia="Times New Roman" w:cstheme="minorHAnsi"/>
+          <w:sz w:val="24"/>
+          <w:szCs w:val="24"/>
+          <w:lang w:val="en-PK" w:eastAsia="en-PK"/>
+        </w:rPr>
+        <w:t>Unnecessary references</w:t>
+      </w:r>
+    </w:p>
+    <w:p>
+      <w:pPr>
+        <w:numPr>
+          <w:ilvl w:val="1"/>
+          <w:numId w:val="3"/>
+        </w:numPr>
+        <w:spacing w:before="100" w:beforeAutospacing="1" w:after="100" w:afterAutospacing="1" w:line="240" w:lineRule="auto"/>
+        <w:rPr>
+          <w:rFonts w:eastAsia="Times New Roman" w:cstheme="minorHAnsi"/>
+          <w:sz w:val="24"/>
+          <w:szCs w:val="24"/>
+          <w:lang w:val="en-PK" w:eastAsia="en-PK"/>
+        </w:rPr>
+      </w:pPr>
+      <w:r>
+        <w:rPr>
+          <w:rFonts w:eastAsia="Times New Roman" w:cstheme="minorHAnsi"/>
+          <w:sz w:val="24"/>
+          <w:szCs w:val="24"/>
+          <w:lang w:val="en-PK" w:eastAsia="en-PK"/>
+        </w:rPr>
+        <w:t>Boilerplate text</w:t>
+      </w:r>
+    </w:p>
+    <w:p>
+      <w:pPr>
+        <w:numPr>
+          <w:ilvl w:val="0"/>
+          <w:numId w:val="3"/>
+        </w:numPr>
+        <w:spacing w:before="100" w:beforeAutospacing="1" w:after="100" w:afterAutospacing="1" w:line="240" w:lineRule="auto"/>
+        <w:rPr>
+          <w:rFonts w:eastAsia="Times New Roman" w:cstheme="minorHAnsi"/>
+          <w:sz w:val="24"/>
+          <w:szCs w:val="24"/>
+          <w:lang w:val="en-PK" w:eastAsia="en-PK"/>
+        </w:rPr>
+      </w:pPr>
+      <w:r>
+        <w:rPr>
+          <w:rFonts w:eastAsia="Times New Roman" w:cstheme="minorHAnsi"/>
+          <w:b/>
+          <w:bCs/>
+          <w:sz w:val="24"/>
+          <w:szCs w:val="24"/>
+          <w:lang w:val="en-PK" w:eastAsia="en-PK"/>
+        </w:rPr>
+        <w:t>Balance the dataset</w:t>
+      </w:r>
+      <w:r>
+        <w:rPr>
+          <w:rFonts w:eastAsia="Times New Roman" w:cstheme="minorHAnsi"/>
+          <w:sz w:val="24"/>
+          <w:szCs w:val="24"/>
+          <w:lang w:val="en-PK" w:eastAsia="en-PK"/>
+        </w:rPr>
+        <w:br/>
+        <w:t>Ensure you don’t have too many cases from one topic.</w:t>
+      </w:r>
+    </w:p>
+    <w:p>
+      <w:pPr>
+        <w:numPr>
+          <w:ilvl w:val="0"/>
+          <w:numId w:val="3"/>
+        </w:numPr>
+        <w:spacing w:before="100" w:beforeAutospacing="1" w:after="100" w:afterAutospacing="1" w:line="240" w:lineRule="auto"/>
+        <w:rPr>
+          <w:rFonts w:eastAsia="Times New Roman" w:cstheme="minorHAnsi"/>
+          <w:sz w:val="24"/>
+          <w:szCs w:val="24"/>
+          <w:lang w:val="en-PK" w:eastAsia="en-PK"/>
+        </w:rPr>
+      </w:pPr>
+      <w:r>
+        <w:rPr>
+          <w:rFonts w:eastAsia="Times New Roman" w:cstheme="minorHAnsi"/>
+          <w:b/>
+          <w:bCs/>
+          <w:sz w:val="24"/>
+          <w:szCs w:val="24"/>
+          <w:lang w:val="en-PK" w:eastAsia="en-PK"/>
+        </w:rPr>
+        <w:t>Prepare supervised instruction format</w:t>
+      </w:r>
+      <w:r>
+        <w:rPr>
+          <w:rFonts w:eastAsia="Times New Roman" w:cstheme="minorHAnsi"/>
+          <w:sz w:val="24"/>
+          <w:szCs w:val="24"/>
+          <w:lang w:val="en-PK" w:eastAsia="en-PK"/>
+        </w:rPr>
+        <w:br/>
+        <w:t>Convert each item to the format:</w:t>
+      </w:r>
+    </w:p>
+    <w:p>
+      <w:pPr>
+        <w:numPr>
+          <w:ilvl w:val="0"/>
+          <w:numId w:val="3"/>
+        </w:numPr>
+        <w:tabs>
+          <w:tab w:val="clear" w:pos="720"/>
+          <w:tab w:val="left" w:pos="916"/>
+          <w:tab w:val="left" w:pos="1832"/>
+          <w:tab w:val="left" w:pos="2748"/>
+          <w:tab w:val="left" w:pos="3664"/>
+          <w:tab w:val="left" w:pos="4580"/>
+          <w:tab w:val="left" w:pos="5496"/>
+          <w:tab w:val="left" w:pos="6412"/>
+          <w:tab w:val="left" w:pos="7328"/>
+          <w:tab w:val="left" w:pos="8244"/>
+          <w:tab w:val="left" w:pos="9160"/>
+          <w:tab w:val="left" w:pos="10076"/>
+          <w:tab w:val="left" w:pos="10992"/>
+          <w:tab w:val="left" w:pos="11908"/>
+          <w:tab w:val="left" w:pos="12824"/>
+          <w:tab w:val="left" w:pos="13740"/>
+          <w:tab w:val="left" w:pos="14656"/>
+        </w:tabs>
+        <w:spacing w:after="0" w:line="240" w:lineRule="auto"/>
+        <w:rPr>
+          <w:rFonts w:eastAsia="Times New Roman" w:cstheme="minorHAnsi"/>
+          <w:sz w:val="20"/>
+          <w:szCs w:val="20"/>
+          <w:lang w:val="en-PK" w:eastAsia="en-PK"/>
+        </w:rPr>
+      </w:pPr>
+      <w:r>
+        <w:rPr>
+          <w:rFonts w:eastAsia="Times New Roman" w:cstheme="minorHAnsi"/>
+          <w:sz w:val="20"/>
+          <w:szCs w:val="20"/>
+          <w:lang w:val="en-PK" w:eastAsia="en-PK"/>
+        </w:rPr>
+        <w:t>{"instruction": "...", "input": "...", "output": "..."}</w:t>
+      </w:r>
+    </w:p>
+    <w:p>
+      <w:pPr>
+        <w:numPr>
+          <w:ilvl w:val="0"/>
+          <w:numId w:val="3"/>
+        </w:numPr>
+        <w:spacing w:before="100" w:beforeAutospacing="1" w:after="100" w:afterAutospacing="1" w:line="240" w:lineRule="auto"/>
+        <w:rPr>
+          <w:rFonts w:eastAsia="Times New Roman" w:cstheme="minorHAnsi"/>
+          <w:sz w:val="24"/>
+          <w:szCs w:val="24"/>
+          <w:lang w:val="en-PK" w:eastAsia="en-PK"/>
+        </w:rPr>
+      </w:pPr>
+      <w:r>
+        <w:rPr>
+          <w:rFonts w:eastAsia="Times New Roman" w:cstheme="minorHAnsi"/>
+          <w:b/>
+          <w:bCs/>
+          <w:sz w:val="24"/>
+          <w:szCs w:val="24"/>
+          <w:lang w:val="en-PK" w:eastAsia="en-PK"/>
+        </w:rPr>
+        <w:t>Validate and test</w:t>
+      </w:r>
+    </w:p>
+    <w:p>
+      <w:pPr>
+        <w:numPr>
+          <w:ilvl w:val="1"/>
+          <w:numId w:val="3"/>
+        </w:numPr>
+        <w:spacing w:before="100" w:beforeAutospacing="1" w:after="100" w:afterAutospacing="1" w:line="240" w:lineRule="auto"/>
+        <w:rPr>
+          <w:rFonts w:eastAsia="Times New Roman" w:cstheme="minorHAnsi"/>
+          <w:sz w:val="24"/>
+          <w:szCs w:val="24"/>
+          <w:lang w:val="en-PK" w:eastAsia="en-PK"/>
+        </w:rPr>
+      </w:pPr>
+      <w:r>
+        <w:rPr>
+          <w:rFonts w:eastAsia="Times New Roman" w:cstheme="minorHAnsi"/>
+          <w:sz w:val="24"/>
+          <w:szCs w:val="24"/>
+          <w:lang w:val="en-PK" w:eastAsia="en-PK"/>
+        </w:rPr>
+        <w:t>Check for broken JSON</w:t>
+      </w:r>
+    </w:p>
+    <w:p>
+      <w:pPr>
+        <w:numPr>
+          <w:ilvl w:val="1"/>
+          <w:numId w:val="3"/>
+        </w:numPr>
+        <w:spacing w:before="100" w:beforeAutospacing="1" w:after="100" w:afterAutospacing="1" w:line="240" w:lineRule="auto"/>
+        <w:rPr>
+          <w:rFonts w:eastAsia="Times New Roman" w:cstheme="minorHAnsi"/>
+          <w:sz w:val="24"/>
+          <w:szCs w:val="24"/>
+          <w:lang w:val="en-PK" w:eastAsia="en-PK"/>
+        </w:rPr>
+      </w:pPr>
+      <w:r>
+        <w:rPr>
+          <w:rFonts w:eastAsia="Times New Roman" w:cstheme="minorHAnsi"/>
+          <w:sz w:val="24"/>
+          <w:szCs w:val="24"/>
+          <w:lang w:val="en-PK" w:eastAsia="en-PK"/>
+        </w:rPr>
+        <w:t>Remove extremely long outputs</w:t>
+      </w:r>
+    </w:p>
+    <w:p>
+      <w:pPr>
+        <w:numPr>
+          <w:ilvl w:val="1"/>
+          <w:numId w:val="3"/>
+        </w:numPr>
+        <w:spacing w:before="100" w:beforeAutospacing="1" w:after="100" w:afterAutospacing="1" w:line="240" w:lineRule="auto"/>
+        <w:rPr>
+          <w:rFonts w:ascii="Times New Roman" w:eastAsia="Times New Roman" w:hAnsi="Times New Roman" w:cs="Times New Roman"/>
+          <w:sz w:val="24"/>
+          <w:szCs w:val="24"/>
+          <w:lang w:val="en-PK" w:eastAsia="en-PK"/>
+        </w:rPr>
+      </w:pPr>
+      <w:r>
+        <w:rPr>
+          <w:rFonts w:eastAsia="Times New Roman" w:cstheme="minorHAnsi"/>
+          <w:sz w:val="24"/>
+          <w:szCs w:val="24"/>
+          <w:lang w:val="en-PK" w:eastAsia="en-PK"/>
+        </w:rPr>
+        <w:t>Ensure clear Q/A structur</w:t>
+      </w:r>
+      <w:r>
+        <w:rPr>
+          <w:rFonts w:ascii="Times New Roman" w:eastAsia="Times New Roman" w:hAnsi="Times New Roman" w:cs="Times New Roman"/>
+          <w:sz w:val="24"/>
+          <w:szCs w:val="24"/>
+          <w:lang w:val="en-PK" w:eastAsia="en-PK"/>
+        </w:rPr>
+        <w:t>e</w:t>
+      </w:r>
+    </w:p>
+    <w:p>
+      <w:pPr>
+        <w:rPr>
+          <w:lang w:val="en-US"/>
+        </w:rPr>
+      </w:pPr>
+    </w:p>
+    <w:p>
+      <w:pPr>
+        <w:rPr>
+          <w:lang w:val="en-US"/>
+        </w:rPr>
+      </w:pPr>
+    </w:p>
+    <w:p>
+      <w:pPr>
+        <w:rPr>
+          <w:lang w:val="en-US"/>
+        </w:rPr>
+      </w:pPr>
+      <w:r>
+        <w:rPr>
+          <w:lang w:val="en-US"/>
+        </w:rPr>
+        <w:t>Working on property related data:</w:t>
+      </w:r>
+      <w:r>
+        <w:rPr>
+          <w:lang w:val="en-US"/>
+        </w:rPr>
+        <w:br/>
+        <w:t>We are going to make instruction style data. Each act file will be used to do this</w:t>
+      </w:r>
+    </w:p>
+    <w:p>
+      <w:pPr>
+        <w:pStyle w:val="Heading3"/>
+      </w:pPr>
+      <w:r>
+        <w:t>Example 1 — Section Explanation</w:t>
+      </w:r>
+    </w:p>
+    <w:p>
+      <w:pPr>
+        <w:pStyle w:val="Heading3"/>
+      </w:pPr>
+      <w:r>
+        <w:t>Example 2 — Summary</w:t>
+      </w:r>
+    </w:p>
+    <w:p>
+      <w:pPr>
+        <w:pStyle w:val="Heading3"/>
+      </w:pPr>
+      <w:r>
+        <w:t>Example 3 — Application question</w:t>
+      </w:r>
+    </w:p>
+    <w:p>
+      <w:pPr>
+        <w:pStyle w:val="Heading3"/>
+      </w:pPr>
+    </w:p>
+    <w:p>
+      <w:pPr>
+        <w:pStyle w:val="Heading3"/>
+        <w:rPr>
+          <w:lang w:val="en-US"/>
+        </w:rPr>
+      </w:pPr>
+      <w:r>
+        <w:rPr>
+          <w:lang w:val="en-US"/>
+        </w:rPr>
+        <w:lastRenderedPageBreak/>
+        <w:t>What needs next:</w:t>
+      </w:r>
+    </w:p>
+    <w:p>
+      <w:pPr>
+        <w:pStyle w:val="NormalWeb"/>
+      </w:pPr>
+      <w:r>
+        <w:t xml:space="preserve">Here’s a </w:t>
+      </w:r>
+      <w:r>
+        <w:rPr>
+          <w:rStyle w:val="Strong"/>
+        </w:rPr>
+        <w:t>clear and practical</w:t>
+      </w:r>
+      <w:r>
+        <w:t xml:space="preserve"> answer tailored to the dataset you’ve built so far and the </w:t>
+      </w:r>
+      <w:proofErr w:type="spellStart"/>
+      <w:r>
+        <w:t>LegalMate</w:t>
+      </w:r>
+      <w:proofErr w:type="spellEnd"/>
+      <w:r>
+        <w:t xml:space="preserve"> chatbot you’re trying to create:</w:t>
+      </w:r>
+    </w:p>
+    <w:p>
+      <w:r>
+        <w:pict w14:anchorId="70912480">
+          <v:rect id="_x0000_i1028" style="width:0;height:1.5pt" o:hralign="center" o:hrstd="t" o:hr="t" fillcolor="#a0a0a0" stroked="f"/>
+        </w:pict>
+      </w:r>
+    </w:p>
+    <w:p>
+      <w:pPr>
+        <w:pStyle w:val="Heading1"/>
+      </w:pPr>
+      <w:r>
+        <w:rPr>
+          <w:rFonts w:ascii="Segoe UI Emoji" w:hAnsi="Segoe UI Emoji" w:cs="Segoe UI Emoji"/>
+        </w:rPr>
+        <w:t>✅</w:t>
+      </w:r>
+      <w:r>
+        <w:t xml:space="preserve"> </w:t>
+      </w:r>
+      <w:r>
+        <w:rPr>
+          <w:rStyle w:val="Strong"/>
+          <w:b w:val="0"/>
+          <w:bCs w:val="0"/>
+        </w:rPr>
+        <w:t>1. What to add to make your chatbot even better</w:t>
+      </w:r>
+    </w:p>
+    <w:p>
+      <w:pPr>
+        <w:pStyle w:val="NormalWeb"/>
+      </w:pPr>
+      <w:r>
+        <w:t>Right now, your dataset mainly includes:</w:t>
+      </w:r>
+    </w:p>
+    <w:p>
+      <w:pPr>
+        <w:pStyle w:val="NormalWeb"/>
+        <w:numPr>
+          <w:ilvl w:val="0"/>
+          <w:numId w:val="4"/>
+        </w:numPr>
+      </w:pPr>
+      <w:r>
+        <w:t>Property laws</w:t>
+      </w:r>
+    </w:p>
+    <w:p>
+      <w:pPr>
+        <w:pStyle w:val="NormalWeb"/>
+        <w:numPr>
+          <w:ilvl w:val="0"/>
+          <w:numId w:val="4"/>
+        </w:numPr>
+      </w:pPr>
+      <w:r>
+        <w:t>Legal sections + explanations</w:t>
+      </w:r>
+    </w:p>
+    <w:p>
+      <w:pPr>
+        <w:pStyle w:val="NormalWeb"/>
+        <w:numPr>
+          <w:ilvl w:val="0"/>
+          <w:numId w:val="4"/>
+        </w:numPr>
+      </w:pPr>
+      <w:r>
+        <w:t>Summaries</w:t>
+      </w:r>
+    </w:p>
+    <w:p>
+      <w:pPr>
+        <w:pStyle w:val="NormalWeb"/>
+        <w:numPr>
+          <w:ilvl w:val="0"/>
+          <w:numId w:val="4"/>
+        </w:numPr>
+      </w:pPr>
+      <w:r>
+        <w:t>Application-style examples</w:t>
+      </w:r>
+    </w:p>
+    <w:p>
+      <w:pPr>
+        <w:pStyle w:val="NormalWeb"/>
+      </w:pPr>
+      <w:r>
+        <w:t xml:space="preserve">This is </w:t>
+      </w:r>
+      <w:r>
+        <w:rPr>
+          <w:rStyle w:val="Strong"/>
+        </w:rPr>
+        <w:t>great</w:t>
+      </w:r>
+      <w:r>
+        <w:t xml:space="preserve">, but to make your chatbot </w:t>
+      </w:r>
+      <w:r>
+        <w:rPr>
+          <w:rStyle w:val="Emphasis"/>
+        </w:rPr>
+        <w:t>really powerful and reliable</w:t>
+      </w:r>
+      <w:r>
+        <w:t>, you should add the following types of datasets:</w:t>
+      </w:r>
+    </w:p>
+    <w:p>
+      <w:r>
+        <w:pict w14:anchorId="0B3230A6">
+          <v:rect id="_x0000_i1029" style="width:0;height:1.5pt" o:hralign="center" o:hrstd="t" o:hr="t" fillcolor="#a0a0a0" stroked="f"/>
+        </w:pict>
+      </w:r>
+    </w:p>
+    <w:p>
+      <w:pPr>
+        <w:pStyle w:val="Heading2"/>
+      </w:pPr>
+      <w:r>
+        <w:rPr>
+          <w:rStyle w:val="Strong"/>
+          <w:b w:val="0"/>
+          <w:bCs w:val="0"/>
+        </w:rPr>
+        <w:t>A. Real Legal Q&amp;A (High Priority)</w:t>
+      </w:r>
+    </w:p>
+    <w:p>
+      <w:pPr>
+        <w:pStyle w:val="NormalWeb"/>
+      </w:pPr>
+      <w:r>
+        <w:t>User-style questions + lawyer-style answers.</w:t>
+      </w:r>
+      <w:r>
+        <w:br/>
+        <w:t>Examples:</w:t>
+      </w:r>
+    </w:p>
+    <w:p>
+      <w:pPr>
+        <w:pStyle w:val="NormalWeb"/>
+        <w:numPr>
+          <w:ilvl w:val="0"/>
+          <w:numId w:val="5"/>
+        </w:numPr>
+      </w:pPr>
+      <w:r>
+        <w:t>“My landlord increased rent without notice. What are my rights?”</w:t>
+      </w:r>
+    </w:p>
+    <w:p>
+      <w:pPr>
+        <w:pStyle w:val="NormalWeb"/>
+        <w:numPr>
+          <w:ilvl w:val="0"/>
+          <w:numId w:val="5"/>
+        </w:numPr>
+      </w:pPr>
+      <w:r>
+        <w:t>“My property transfer is stuck in mutation. What can I do?”</w:t>
+      </w:r>
+    </w:p>
+    <w:p>
+      <w:pPr>
+        <w:pStyle w:val="NormalWeb"/>
+      </w:pPr>
+      <w:r>
+        <w:t xml:space="preserve">This teaches the model </w:t>
+      </w:r>
+      <w:r>
+        <w:rPr>
+          <w:rStyle w:val="Strong"/>
+        </w:rPr>
+        <w:t>real-world conversational legal reasoning</w:t>
+      </w:r>
+      <w:r>
+        <w:t>.</w:t>
+      </w:r>
+    </w:p>
+    <w:p>
+      <w:r>
+        <w:pict w14:anchorId="1F810462">
+          <v:rect id="_x0000_i1030" style="width:0;height:1.5pt" o:hralign="center" o:hrstd="t" o:hr="t" fillcolor="#a0a0a0" stroked="f"/>
+        </w:pict>
+      </w:r>
+    </w:p>
+    <w:p>
+      <w:pPr>
+        <w:pStyle w:val="Heading2"/>
+      </w:pPr>
+      <w:r>
+        <w:rPr>
+          <w:rStyle w:val="Strong"/>
+          <w:b w:val="0"/>
+          <w:bCs w:val="0"/>
+        </w:rPr>
+        <w:t>B. Case Law Interpretations (Extremely Valuable)</w:t>
+      </w:r>
+    </w:p>
+    <w:p>
+      <w:pPr>
+        <w:pStyle w:val="NormalWeb"/>
+      </w:pPr>
+      <w:r>
+        <w:t>From judgments you have → extract:</w:t>
+      </w:r>
+    </w:p>
+    <w:p>
+      <w:pPr>
+        <w:pStyle w:val="NormalWeb"/>
+        <w:numPr>
+          <w:ilvl w:val="0"/>
+          <w:numId w:val="6"/>
+        </w:numPr>
+      </w:pPr>
+      <w:r>
+        <w:t>Issue</w:t>
+      </w:r>
+    </w:p>
+    <w:p>
+      <w:pPr>
+        <w:pStyle w:val="NormalWeb"/>
+        <w:numPr>
+          <w:ilvl w:val="0"/>
+          <w:numId w:val="6"/>
+        </w:numPr>
+      </w:pPr>
+      <w:r>
+        <w:t>Arguments</w:t>
+      </w:r>
+    </w:p>
+    <w:p>
+      <w:pPr>
+        <w:pStyle w:val="NormalWeb"/>
+        <w:numPr>
+          <w:ilvl w:val="0"/>
+          <w:numId w:val="6"/>
+        </w:numPr>
+      </w:pPr>
+      <w:r>
+        <w:t>Court reasoning</w:t>
+      </w:r>
+    </w:p>
+    <w:p>
+      <w:pPr>
+        <w:pStyle w:val="NormalWeb"/>
+        <w:numPr>
+          <w:ilvl w:val="0"/>
+          <w:numId w:val="6"/>
+        </w:numPr>
+      </w:pPr>
+      <w:r>
+        <w:t>Final ruling</w:t>
+      </w:r>
+    </w:p>
+    <w:p>
+      <w:pPr>
+        <w:pStyle w:val="NormalWeb"/>
+        <w:numPr>
+          <w:ilvl w:val="0"/>
+          <w:numId w:val="6"/>
+        </w:numPr>
+      </w:pPr>
+      <w:r>
+        <w:t>Key principle of law</w:t>
+      </w:r>
+    </w:p>
+    <w:p>
+      <w:pPr>
+        <w:pStyle w:val="NormalWeb"/>
+      </w:pPr>
+      <w:r>
+        <w:t xml:space="preserve">This gives the model </w:t>
+      </w:r>
+      <w:r>
+        <w:rPr>
+          <w:rStyle w:val="Emphasis"/>
+        </w:rPr>
+        <w:t>legal reasoning power</w:t>
+      </w:r>
+      <w:r>
+        <w:t>.</w:t>
+      </w:r>
+    </w:p>
+    <w:p>
+      <w:r>
+        <w:pict w14:anchorId="3391E04B">
+          <v:rect id="_x0000_i1031" style="width:0;height:1.5pt" o:hralign="center" o:hrstd="t" o:hr="t" fillcolor="#a0a0a0" stroked="f"/>
+        </w:pict>
+      </w:r>
+    </w:p>
+    <w:p>
+      <w:pPr>
+        <w:pStyle w:val="Heading2"/>
+      </w:pPr>
+      <w:r>
+        <w:rPr>
+          <w:rStyle w:val="Strong"/>
+          <w:b w:val="0"/>
+          <w:bCs w:val="0"/>
+        </w:rPr>
+        <w:t>C. Scenario-Based Practical Examples</w:t>
+      </w:r>
+    </w:p>
+    <w:p>
+      <w:pPr>
+        <w:pStyle w:val="NormalWeb"/>
+      </w:pPr>
+      <w:r>
+        <w:t xml:space="preserve">These are </w:t>
+      </w:r>
+      <w:r>
+        <w:rPr>
+          <w:rStyle w:val="Emphasis"/>
+        </w:rPr>
+        <w:t>gold</w:t>
+      </w:r>
+      <w:r>
+        <w:t xml:space="preserve"> in fine-tuning:</w:t>
+      </w:r>
+    </w:p>
+    <w:p>
+      <w:pPr>
+        <w:pStyle w:val="NormalWeb"/>
+        <w:numPr>
+          <w:ilvl w:val="0"/>
+          <w:numId w:val="7"/>
+        </w:numPr>
+      </w:pPr>
+      <w:r>
+        <w:lastRenderedPageBreak/>
+        <w:t>“Tenant refuses to vacate after tenancy expiry.”</w:t>
+      </w:r>
+    </w:p>
+    <w:p>
+      <w:pPr>
+        <w:pStyle w:val="NormalWeb"/>
+        <w:numPr>
+          <w:ilvl w:val="0"/>
+          <w:numId w:val="7"/>
+        </w:numPr>
+      </w:pPr>
+      <w:r>
+        <w:t>“Two brothers have inheritance dispute.”</w:t>
+      </w:r>
+    </w:p>
+    <w:p>
+      <w:pPr>
+        <w:pStyle w:val="NormalWeb"/>
+        <w:numPr>
+          <w:ilvl w:val="0"/>
+          <w:numId w:val="7"/>
+        </w:numPr>
+      </w:pPr>
+      <w:r>
+        <w:t>“Buying a house without registry—what can go wrong?”</w:t>
+      </w:r>
+    </w:p>
+    <w:p>
+      <w:r>
+        <w:pict w14:anchorId="7E567C07">
+          <v:rect id="_x0000_i1032" style="width:0;height:1.5pt" o:hralign="center" o:hrstd="t" o:hr="t" fillcolor="#a0a0a0" stroked="f"/>
+        </w:pict>
+      </w:r>
+    </w:p>
+    <w:p>
+      <w:pPr>
+        <w:pStyle w:val="Heading2"/>
+      </w:pPr>
+      <w:r>
+        <w:rPr>
+          <w:rStyle w:val="Strong"/>
+          <w:b w:val="0"/>
+          <w:bCs w:val="0"/>
+        </w:rPr>
+        <w:t>D. Step-by-Step Legal Procedures Dataset</w:t>
+      </w:r>
+    </w:p>
+    <w:p>
+      <w:pPr>
+        <w:pStyle w:val="NormalWeb"/>
+      </w:pPr>
+      <w:r>
+        <w:t>For example:</w:t>
+      </w:r>
+    </w:p>
+    <w:p>
+      <w:pPr>
+        <w:pStyle w:val="NormalWeb"/>
+        <w:numPr>
+          <w:ilvl w:val="0"/>
+          <w:numId w:val="8"/>
+        </w:numPr>
+      </w:pPr>
+      <w:r>
+        <w:t>“How to register a property?”</w:t>
+      </w:r>
+    </w:p>
+    <w:p>
+      <w:pPr>
+        <w:pStyle w:val="NormalWeb"/>
+        <w:numPr>
+          <w:ilvl w:val="0"/>
+          <w:numId w:val="8"/>
+        </w:numPr>
+      </w:pPr>
+      <w:r>
+        <w:t>“How to file a civil case?”</w:t>
+      </w:r>
+    </w:p>
+    <w:p>
+      <w:pPr>
+        <w:pStyle w:val="NormalWeb"/>
+        <w:numPr>
+          <w:ilvl w:val="0"/>
+          <w:numId w:val="8"/>
+        </w:numPr>
+      </w:pPr>
+      <w:r>
+        <w:t>“How mutation works?”</w:t>
+      </w:r>
+    </w:p>
+    <w:p>
+      <w:pPr>
+        <w:pStyle w:val="NormalWeb"/>
+        <w:numPr>
+          <w:ilvl w:val="0"/>
+          <w:numId w:val="8"/>
+        </w:numPr>
+      </w:pPr>
+      <w:r>
+        <w:t>“How eviction is filed?”</w:t>
+      </w:r>
+    </w:p>
+    <w:p>
+      <w:pPr>
+        <w:pStyle w:val="NormalWeb"/>
+      </w:pPr>
+      <w:r>
+        <w:t>This enables the bot to answer “how to do X legally”.</w:t>
+      </w:r>
+    </w:p>
+    <w:p>
+      <w:r>
+        <w:pict w14:anchorId="56E11021">
+          <v:rect id="_x0000_i1033" style="width:0;height:1.5pt" o:hralign="center" o:hrstd="t" o:hr="t" fillcolor="#a0a0a0" stroked="f"/>
+        </w:pict>
+      </w:r>
+    </w:p>
+    <w:p>
+      <w:pPr>
+        <w:pStyle w:val="Heading2"/>
+      </w:pPr>
+      <w:r>
+        <w:rPr>
+          <w:rStyle w:val="Strong"/>
+          <w:b w:val="0"/>
+          <w:bCs w:val="0"/>
+        </w:rPr>
+        <w:t>E. Templates Dataset (Optional but great)</w:t>
+      </w:r>
+    </w:p>
+    <w:p>
+      <w:pPr>
+        <w:pStyle w:val="NormalWeb"/>
+        <w:numPr>
+          <w:ilvl w:val="0"/>
+          <w:numId w:val="9"/>
+        </w:numPr>
+      </w:pPr>
+      <w:r>
+        <w:t>Rent agreement template</w:t>
+      </w:r>
+    </w:p>
+    <w:p>
+      <w:pPr>
+        <w:pStyle w:val="NormalWeb"/>
+        <w:numPr>
+          <w:ilvl w:val="0"/>
+          <w:numId w:val="9"/>
+        </w:numPr>
+      </w:pPr>
+      <w:r>
+        <w:t>Sale deed sample</w:t>
+      </w:r>
+    </w:p>
+    <w:p>
+      <w:pPr>
+        <w:pStyle w:val="NormalWeb"/>
+        <w:numPr>
+          <w:ilvl w:val="0"/>
+          <w:numId w:val="9"/>
+        </w:numPr>
+      </w:pPr>
+      <w:r>
+        <w:t>Legal notice template</w:t>
+      </w:r>
+      <w:r>
+        <w:br/>
+        <w:t xml:space="preserve">Let the model learn structure but </w:t>
+      </w:r>
+      <w:r>
+        <w:rPr>
+          <w:rStyle w:val="Strong"/>
+        </w:rPr>
+        <w:t>don’t include large personal-sensitive templates</w:t>
+      </w:r>
+      <w:r>
+        <w:t>.</w:t>
+      </w:r>
+    </w:p>
+    <w:p>
+      <w:r>
+        <w:pict w14:anchorId="133497EF">
+          <v:rect id="_x0000_i1034" style="width:0;height:1.5pt" o:hralign="center" o:hrstd="t" o:hr="t" fillcolor="#a0a0a0" stroked="f"/>
+        </w:pict>
+      </w:r>
+    </w:p>
+    <w:p>
+      <w:pPr>
+        <w:pStyle w:val="Heading2"/>
+      </w:pPr>
+      <w:r>
+        <w:rPr>
+          <w:rStyle w:val="Strong"/>
+          <w:b w:val="0"/>
+          <w:bCs w:val="0"/>
+        </w:rPr>
+        <w:t>F. Definitions + Glossary Dataset</w:t>
+      </w:r>
+    </w:p>
+    <w:p>
+      <w:pPr>
+        <w:pStyle w:val="NormalWeb"/>
+      </w:pPr>
+      <w:r>
+        <w:t>Short definitions of legal terms:</w:t>
+      </w:r>
+    </w:p>
+    <w:p>
+      <w:pPr>
+        <w:pStyle w:val="NormalWeb"/>
+        <w:numPr>
+          <w:ilvl w:val="0"/>
+          <w:numId w:val="10"/>
+        </w:numPr>
+      </w:pPr>
+      <w:r>
+        <w:t>“Mutation”</w:t>
+      </w:r>
+    </w:p>
+    <w:p>
+      <w:pPr>
+        <w:pStyle w:val="NormalWeb"/>
+        <w:numPr>
+          <w:ilvl w:val="0"/>
+          <w:numId w:val="10"/>
+        </w:numPr>
+      </w:pPr>
+      <w:r>
+        <w:t>“Registry”</w:t>
+      </w:r>
+    </w:p>
+    <w:p>
+      <w:pPr>
+        <w:pStyle w:val="NormalWeb"/>
+        <w:numPr>
+          <w:ilvl w:val="0"/>
+          <w:numId w:val="10"/>
+        </w:numPr>
+      </w:pPr>
+      <w:r>
+        <w:t>“NOC”</w:t>
+      </w:r>
+    </w:p>
+    <w:p>
+      <w:pPr>
+        <w:pStyle w:val="NormalWeb"/>
+        <w:numPr>
+          <w:ilvl w:val="0"/>
+          <w:numId w:val="10"/>
+        </w:numPr>
+      </w:pPr>
+      <w:r>
+        <w:t>“Stamp duty”</w:t>
+      </w:r>
+    </w:p>
+    <w:p>
+      <w:pPr>
+        <w:pStyle w:val="NormalWeb"/>
+        <w:numPr>
+          <w:ilvl w:val="0"/>
+          <w:numId w:val="10"/>
+        </w:numPr>
+      </w:pPr>
+      <w:r>
+        <w:t>“Occupancy rights”</w:t>
+      </w:r>
+    </w:p>
+    <w:p>
+      <w:pPr>
+        <w:pStyle w:val="NormalWeb"/>
+      </w:pPr>
+      <w:r>
+        <w:t>This helps with basic questions.</w:t>
+      </w:r>
+    </w:p>
+    <w:p>
+      <w:r>
+        <w:pict w14:anchorId="63B56C69">
+          <v:rect id="_x0000_i1035" style="width:0;height:1.5pt" o:hralign="center" o:hrstd="t" o:hr="t" fillcolor="#a0a0a0" stroked="f"/>
+        </w:pict>
+      </w:r>
+    </w:p>
+    <w:p>
+      <w:pPr>
+        <w:pStyle w:val="Heading2"/>
+      </w:pPr>
+      <w:r>
+        <w:rPr>
+          <w:rStyle w:val="Strong"/>
+          <w:b w:val="0"/>
+          <w:bCs w:val="0"/>
+        </w:rPr>
+        <w:t>G. Provincial Laws Dataset</w:t>
+      </w:r>
+    </w:p>
+    <w:p>
+      <w:pPr>
+        <w:pStyle w:val="NormalWeb"/>
+      </w:pPr>
+      <w:r>
+        <w:t xml:space="preserve">You need </w:t>
+      </w:r>
+      <w:r>
+        <w:rPr>
+          <w:rStyle w:val="Strong"/>
+        </w:rPr>
+        <w:t>separate datasets</w:t>
+      </w:r>
+      <w:r>
+        <w:t xml:space="preserve"> for:</w:t>
+      </w:r>
+    </w:p>
+    <w:p>
+      <w:pPr>
+        <w:pStyle w:val="NormalWeb"/>
+        <w:numPr>
+          <w:ilvl w:val="0"/>
+          <w:numId w:val="11"/>
+        </w:numPr>
+      </w:pPr>
+      <w:r>
+        <w:t>Punjab Rent Law</w:t>
+      </w:r>
+    </w:p>
+    <w:p>
+      <w:pPr>
+        <w:pStyle w:val="NormalWeb"/>
+        <w:numPr>
+          <w:ilvl w:val="0"/>
+          <w:numId w:val="11"/>
+        </w:numPr>
+      </w:pPr>
+      <w:r>
+        <w:t>Sindh Rent Law</w:t>
+      </w:r>
+    </w:p>
+    <w:p>
+      <w:pPr>
+        <w:pStyle w:val="NormalWeb"/>
+        <w:numPr>
+          <w:ilvl w:val="0"/>
+          <w:numId w:val="11"/>
+        </w:numPr>
+      </w:pPr>
+      <w:r>
+        <w:t>KP Rent Law</w:t>
+      </w:r>
+    </w:p>
+    <w:p>
+      <w:pPr>
+        <w:pStyle w:val="NormalWeb"/>
+        <w:numPr>
+          <w:ilvl w:val="0"/>
+          <w:numId w:val="11"/>
+        </w:numPr>
+      </w:pPr>
+      <w:proofErr w:type="spellStart"/>
+      <w:r>
+        <w:t>Balochistan</w:t>
+      </w:r>
+      <w:proofErr w:type="spellEnd"/>
+      <w:r>
+        <w:t xml:space="preserve"> Rent Law</w:t>
+      </w:r>
+    </w:p>
+    <w:p>
+      <w:pPr>
+        <w:pStyle w:val="NormalWeb"/>
+        <w:numPr>
+          <w:ilvl w:val="0"/>
+          <w:numId w:val="11"/>
+        </w:numPr>
+      </w:pPr>
+      <w:r>
+        <w:lastRenderedPageBreak/>
+        <w:t>Islamabad Rent Control Act</w:t>
+      </w:r>
+    </w:p>
+    <w:p>
+      <w:pPr>
+        <w:pStyle w:val="NormalWeb"/>
+      </w:pPr>
+      <w:r>
+        <w:t>This increases accuracy because laws vary province-to-province.</w:t>
+      </w:r>
+    </w:p>
+    <w:p>
+      <w:r>
+        <w:pict w14:anchorId="420CE803">
+          <v:rect id="_x0000_i1036" style="width:0;height:1.5pt" o:hralign="center" o:hrstd="t" o:hr="t" fillcolor="#a0a0a0" stroked="f"/>
+        </w:pict>
+      </w:r>
+    </w:p>
+    <w:p>
+      <w:pPr>
+        <w:pStyle w:val="Heading2"/>
+      </w:pPr>
+      <w:r>
+        <w:rPr>
+          <w:rStyle w:val="Strong"/>
+          <w:b w:val="0"/>
+          <w:bCs w:val="0"/>
+        </w:rPr>
+        <w:t>H. Error-handling + Uncertainty Data</w:t>
+      </w:r>
+    </w:p>
+    <w:p>
+      <w:pPr>
+        <w:pStyle w:val="NormalWeb"/>
+      </w:pPr>
+      <w:r>
+        <w:t>Add examples where the model says:</w:t>
+      </w:r>
+    </w:p>
+    <w:p>
+      <w:pPr>
+        <w:pStyle w:val="NormalWeb"/>
+        <w:numPr>
+          <w:ilvl w:val="0"/>
+          <w:numId w:val="12"/>
+        </w:numPr>
+      </w:pPr>
+      <w:r>
+        <w:t>“I need more information”</w:t>
+      </w:r>
+    </w:p>
+    <w:p>
+      <w:pPr>
+        <w:pStyle w:val="NormalWeb"/>
+        <w:numPr>
+          <w:ilvl w:val="0"/>
+          <w:numId w:val="12"/>
+        </w:numPr>
+      </w:pPr>
+      <w:r>
+        <w:t>“This depends on X and Y”</w:t>
+      </w:r>
+    </w:p>
+    <w:p>
+      <w:pPr>
+        <w:pStyle w:val="NormalWeb"/>
+        <w:numPr>
+          <w:ilvl w:val="0"/>
+          <w:numId w:val="12"/>
+        </w:numPr>
+      </w:pPr>
+      <w:r>
+        <w:t>“Please consult a lawyer if…”</w:t>
+      </w:r>
+    </w:p>
+    <w:p>
+      <w:pPr>
+        <w:pStyle w:val="NormalWeb"/>
+      </w:pPr>
+      <w:r>
+        <w:t xml:space="preserve">This makes your chatbot </w:t>
+      </w:r>
+      <w:r>
+        <w:rPr>
+          <w:rStyle w:val="Strong"/>
+        </w:rPr>
+        <w:t>safe and reliable</w:t>
+      </w:r>
+      <w:r>
+        <w:t>.</w:t>
+      </w:r>
+    </w:p>
+    <w:p>
+      <w:r>
+        <w:pict w14:anchorId="042D9C33">
+          <v:rect id="_x0000_i1037" style="width:0;height:1.5pt" o:hralign="center" o:hrstd="t" o:hr="t" fillcolor="#a0a0a0" stroked="f"/>
+        </w:pict>
+      </w:r>
+    </w:p>
+    <w:p>
+      <w:pPr>
+        <w:pStyle w:val="Heading1"/>
+      </w:pPr>
+      <w:r>
+        <w:rPr>
+          <w:rFonts w:ascii="Segoe UI Emoji" w:hAnsi="Segoe UI Emoji" w:cs="Segoe UI Emoji"/>
+        </w:rPr>
+        <w:t>✅</w:t>
+      </w:r>
+      <w:r>
+        <w:t xml:space="preserve"> </w:t>
+      </w:r>
+      <w:r>
+        <w:rPr>
+          <w:rStyle w:val="Strong"/>
+          <w:b w:val="0"/>
+          <w:bCs w:val="0"/>
+        </w:rPr>
+        <w:t xml:space="preserve">2. How many more datasets you still need for full </w:t>
+      </w:r>
+      <w:proofErr w:type="gramStart"/>
+      <w:r>
+        <w:rPr>
+          <w:rStyle w:val="Strong"/>
+          <w:b w:val="0"/>
+          <w:bCs w:val="0"/>
+        </w:rPr>
+        <w:t>coverage</w:t>
+      </w:r>
+      <w:proofErr w:type="gramEnd"/>
+    </w:p>
+    <w:p>
+      <w:pPr>
+        <w:pStyle w:val="NormalWeb"/>
+      </w:pPr>
+      <w:r>
+        <w:t xml:space="preserve">Below is a realistic estimate for a </w:t>
+      </w:r>
+      <w:r>
+        <w:rPr>
+          <w:rStyle w:val="Strong"/>
+        </w:rPr>
+        <w:t>Pakistan Legal Chatbot</w:t>
+      </w:r>
+      <w:r>
+        <w:t>:</w:t>
+      </w:r>
+    </w:p>
+    <w:tbl>
+      <w:tblPr>
+        <w:tblStyle w:val="TableGridLight"/>
+        <w:tblW w:w="0" w:type="auto"/>
+        <w:tblLook w:val="04A0" w:firstRow="1" w:lastRow="0" w:firstColumn="1" w:lastColumn="0" w:noHBand="0" w:noVBand="1"/>
+      </w:tblPr>
+      <w:tblGrid>
+        <w:gridCol w:w="3225"/>
+        <w:gridCol w:w="1708"/>
+        <w:gridCol w:w="1171"/>
+        <w:gridCol w:w="2912"/>
+      </w:tblGrid>
+      <w:tr>
+        <w:tc>
+          <w:tcPr>
+            <w:tcW w:w="0" w:type="auto"/>
+            <w:hideMark/>
+          </w:tcPr>
+          <w:p>
+            <w:pPr>
+              <w:jc w:val="center"/>
+              <w:rPr>
+                <w:b/>
+                <w:bCs/>
+              </w:rPr>
+            </w:pPr>
+            <w:r>
+              <w:rPr>
+                <w:b/>
+                <w:bCs/>
+              </w:rPr>
+              <w:t>Category</w:t>
+            </w:r>
+          </w:p>
+        </w:tc>
+        <w:tc>
+          <w:tcPr>
+            <w:tcW w:w="0" w:type="auto"/>
+            <w:hideMark/>
+          </w:tcPr>
+          <w:p>
+            <w:pPr>
+              <w:jc w:val="center"/>
+              <w:rPr>
+                <w:b/>
+                <w:bCs/>
+              </w:rPr>
+            </w:pPr>
+            <w:r>
+              <w:rPr>
+                <w:b/>
+                <w:bCs/>
+              </w:rPr>
+              <w:t>Needed Datasets</w:t>
+            </w:r>
+          </w:p>
+        </w:tc>
+        <w:tc>
+          <w:tcPr>
+            <w:tcW w:w="0" w:type="auto"/>
+            <w:hideMark/>
+          </w:tcPr>
+          <w:p>
+            <w:pPr>
+              <w:jc w:val="center"/>
+              <w:rPr>
+                <w:b/>
+                <w:bCs/>
+              </w:rPr>
+            </w:pPr>
+            <w:r>
+              <w:rPr>
+                <w:b/>
+                <w:bCs/>
+              </w:rPr>
+              <w:t>Status</w:t>
+            </w:r>
+          </w:p>
+        </w:tc>
+        <w:tc>
+          <w:tcPr>
+            <w:tcW w:w="0" w:type="auto"/>
+            <w:hideMark/>
+          </w:tcPr>
+          <w:p>
+            <w:pPr>
+              <w:jc w:val="center"/>
+              <w:rPr>
+                <w:b/>
+                <w:bCs/>
+              </w:rPr>
+            </w:pPr>
+            <w:r>
+              <w:rPr>
+                <w:b/>
+                <w:bCs/>
+              </w:rPr>
+              <w:t>Notes</w:t>
+            </w:r>
+          </w:p>
+        </w:tc>
+      </w:tr>
+      <w:tr>
+        <w:tc>
+          <w:tcPr>
+            <w:tcW w:w="0" w:type="auto"/>
+            <w:hideMark/>
+          </w:tcPr>
+          <w:p>
+            <w:r>
+              <w:t>Property laws</w:t>
+            </w:r>
+          </w:p>
+        </w:tc>
+        <w:tc>
+          <w:tcPr>
+            <w:tcW w:w="0" w:type="auto"/>
+            <w:hideMark/>
+          </w:tcPr>
+          <w:p>
+            <w:r>
+              <w:t>1</w:t>
+            </w:r>
+          </w:p>
+        </w:tc>
+        <w:tc>
+          <w:tcPr>
+            <w:tcW w:w="0" w:type="auto"/>
+            <w:hideMark/>
+          </w:tcPr>
+          <w:p>
+            <w:r>
+              <w:rPr>
+                <w:rFonts w:ascii="Segoe UI Emoji" w:hAnsi="Segoe UI Emoji" w:cs="Segoe UI Emoji"/>
+              </w:rPr>
+              <w:t>✔</w:t>
+            </w:r>
+            <w:r>
+              <w:t xml:space="preserve"> Done</w:t>
+            </w:r>
+          </w:p>
+        </w:tc>
+        <w:tc>
+          <w:tcPr>
+            <w:tcW w:w="0" w:type="auto"/>
+            <w:hideMark/>
+          </w:tcPr>
+          <w:p>
+            <w:r>
+              <w:t>Add more application examples</w:t>
+            </w:r>
+          </w:p>
+        </w:tc>
+      </w:tr>
+      <w:tr>
+        <w:tc>
+          <w:tcPr>
+            <w:tcW w:w="0" w:type="auto"/>
+            <w:hideMark/>
+          </w:tcPr>
+          <w:p>
+            <w:r>
+              <w:t>Rental laws</w:t>
+            </w:r>
+          </w:p>
+        </w:tc>
+        <w:tc>
+          <w:tcPr>
+            <w:tcW w:w="0" w:type="auto"/>
+            <w:hideMark/>
+          </w:tcPr>
+          <w:p>
+            <w:r>
+              <w:t>1</w:t>
+            </w:r>
+          </w:p>
+        </w:tc>
+        <w:tc>
+          <w:tcPr>
+            <w:tcW w:w="0" w:type="auto"/>
+            <w:hideMark/>
+          </w:tcPr>
+          <w:p>
+            <w:r>
+              <w:rPr>
+                <w:rFonts w:ascii="Segoe UI Emoji" w:hAnsi="Segoe UI Emoji" w:cs="Segoe UI Emoji"/>
+              </w:rPr>
+              <w:t>✔</w:t>
+            </w:r>
+            <w:r>
+              <w:t xml:space="preserve"> Done</w:t>
+            </w:r>
+          </w:p>
+        </w:tc>
+        <w:tc>
+          <w:tcPr>
+            <w:tcW w:w="0" w:type="auto"/>
+            <w:hideMark/>
+          </w:tcPr>
+          <w:p>
+            <w:r>
+              <w:t>Improve with Q&amp;A style</w:t>
+            </w:r>
+          </w:p>
+        </w:tc>
+      </w:tr>
+      <w:tr>
+        <w:tc>
+          <w:tcPr>
+            <w:tcW w:w="0" w:type="auto"/>
+            <w:hideMark/>
+          </w:tcPr>
+          <w:p>
+            <w:r>
+              <w:t>Land record &amp; transfers</w:t>
+            </w:r>
+          </w:p>
+        </w:tc>
+        <w:tc>
+          <w:tcPr>
+            <w:tcW w:w="0" w:type="auto"/>
+            <w:hideMark/>
+          </w:tcPr>
+          <w:p>
+            <w:r>
+              <w:t>1</w:t>
+            </w:r>
+          </w:p>
+        </w:tc>
+        <w:tc>
+          <w:tcPr>
+            <w:tcW w:w="0" w:type="auto"/>
+            <w:hideMark/>
+          </w:tcPr>
+          <w:p>
+            <w:r>
+              <w:rPr>
+                <w:rFonts w:ascii="Segoe UI Emoji" w:hAnsi="Segoe UI Emoji" w:cs="Segoe UI Emoji"/>
+              </w:rPr>
+              <w:t>✔</w:t>
+            </w:r>
+            <w:r>
+              <w:t xml:space="preserve"> Partial</w:t>
+            </w:r>
+          </w:p>
+        </w:tc>
+        <w:tc>
+          <w:tcPr>
+            <w:tcW w:w="0" w:type="auto"/>
+            <w:hideMark/>
+          </w:tcPr>
+          <w:p>
+            <w:r>
+              <w:t>Add provincial variations</w:t>
+            </w:r>
+          </w:p>
+        </w:tc>
+      </w:tr>
+      <w:tr>
+        <w:tc>
+          <w:tcPr>
+            <w:tcW w:w="0" w:type="auto"/>
+            <w:hideMark/>
+          </w:tcPr>
+          <w:p>
+            <w:r>
+              <w:t>Real legal Q&amp;A</w:t>
+            </w:r>
+          </w:p>
+        </w:tc>
+        <w:tc>
+          <w:tcPr>
+            <w:tcW w:w="0" w:type="auto"/>
+            <w:hideMark/>
+          </w:tcPr>
+          <w:p>
+            <w:r>
+              <w:t>300–500 examples</w:t>
+            </w:r>
+          </w:p>
+        </w:tc>
+        <w:tc>
+          <w:tcPr>
+            <w:tcW w:w="0" w:type="auto"/>
+            <w:hideMark/>
+          </w:tcPr>
+          <w:p>
+            <w:r>
+              <w:rPr>
+                <w:rFonts w:ascii="Segoe UI Emoji" w:hAnsi="Segoe UI Emoji" w:cs="Segoe UI Emoji"/>
+              </w:rPr>
+              <w:t>❌</w:t>
+            </w:r>
+            <w:r>
+              <w:t xml:space="preserve"> Missing</w:t>
+            </w:r>
+          </w:p>
+        </w:tc>
+        <w:tc>
+          <w:tcPr>
+            <w:tcW w:w="0" w:type="auto"/>
+            <w:hideMark/>
+          </w:tcPr>
+          <w:p>
+            <w:r>
+              <w:t>IMPORTANT</w:t>
+            </w:r>
+          </w:p>
+        </w:tc>
+      </w:tr>
+      <w:tr>
+        <w:tc>
+          <w:tcPr>
+            <w:tcW w:w="0" w:type="auto"/>
+            <w:hideMark/>
+          </w:tcPr>
+          <w:p>
+            <w:r>
+              <w:t>Case law interpretations</w:t>
+            </w:r>
+          </w:p>
+        </w:tc>
+        <w:tc>
+          <w:tcPr>
+            <w:tcW w:w="0" w:type="auto"/>
+            <w:hideMark/>
+          </w:tcPr>
+          <w:p>
+            <w:r>
+              <w:t>100–200 examples</w:t>
+            </w:r>
+          </w:p>
+        </w:tc>
+        <w:tc>
+          <w:tcPr>
+            <w:tcW w:w="0" w:type="auto"/>
+            <w:hideMark/>
+          </w:tcPr>
+          <w:p>
+            <w:r>
+              <w:rPr>
+                <w:rFonts w:ascii="Segoe UI Emoji" w:hAnsi="Segoe UI Emoji" w:cs="Segoe UI Emoji"/>
+              </w:rPr>
+              <w:t>❌</w:t>
+            </w:r>
+            <w:r>
+              <w:t xml:space="preserve"> Missing</w:t>
+            </w:r>
+          </w:p>
+        </w:tc>
+        <w:tc>
+          <w:tcPr>
+            <w:tcW w:w="0" w:type="auto"/>
+            <w:hideMark/>
+          </w:tcPr>
+          <w:p>
+            <w:r>
+              <w:t>Boosts reasoning</w:t>
+            </w:r>
+          </w:p>
+        </w:tc>
+      </w:tr>
+      <w:tr>
+        <w:tc>
+          <w:tcPr>
+            <w:tcW w:w="0" w:type="auto"/>
+            <w:hideMark/>
+          </w:tcPr>
+          <w:p>
+            <w:r>
+              <w:t>Civil court procedures</w:t>
+            </w:r>
+          </w:p>
+        </w:tc>
+        <w:tc>
+          <w:tcPr>
+            <w:tcW w:w="0" w:type="auto"/>
+            <w:hideMark/>
+          </w:tcPr>
+          <w:p>
+            <w:r>
+              <w:t>50–100 examples</w:t>
+            </w:r>
+          </w:p>
+        </w:tc>
+        <w:tc>
+          <w:tcPr>
+            <w:tcW w:w="0" w:type="auto"/>
+            <w:hideMark/>
+          </w:tcPr>
+          <w:p>
+            <w:r>
+              <w:rPr>
+                <w:rFonts w:ascii="Segoe UI Emoji" w:hAnsi="Segoe UI Emoji" w:cs="Segoe UI Emoji"/>
+              </w:rPr>
+              <w:t>❌</w:t>
+            </w:r>
+            <w:r>
+              <w:t xml:space="preserve"> Missing</w:t>
+            </w:r>
+          </w:p>
+        </w:tc>
+        <w:tc>
+          <w:tcPr>
+            <w:tcW w:w="0" w:type="auto"/>
+            <w:hideMark/>
+          </w:tcPr>
+          <w:p>
+            <w:r>
+              <w:t>Required for “how to file” answers</w:t>
+            </w:r>
+          </w:p>
+        </w:tc>
+      </w:tr>
+      <w:tr>
+        <w:tc>
+          <w:tcPr>
+            <w:tcW w:w="0" w:type="auto"/>
+            <w:hideMark/>
+          </w:tcPr>
+          <w:p>
+            <w:r>
+              <w:t>Templates &amp; notices</w:t>
+            </w:r>
+          </w:p>
+        </w:tc>
+        <w:tc>
+          <w:tcPr>
+            <w:tcW w:w="0" w:type="auto"/>
+            <w:hideMark/>
+          </w:tcPr>
+          <w:p>
+            <w:r>
+              <w:t>20–40</w:t>
+            </w:r>
+          </w:p>
+        </w:tc>
+        <w:tc>
+          <w:tcPr>
+            <w:tcW w:w="0" w:type="auto"/>
+            <w:hideMark/>
+          </w:tcPr>
+          <w:p>
+            <w:r>
+              <w:rPr>
+                <w:rFonts w:ascii="Segoe UI Emoji" w:hAnsi="Segoe UI Emoji" w:cs="Segoe UI Emoji"/>
+              </w:rPr>
+              <w:t>❌</w:t>
+            </w:r>
+            <w:r>
+              <w:t xml:space="preserve"> Missing</w:t>
+            </w:r>
+          </w:p>
+        </w:tc>
+        <w:tc>
+          <w:tcPr>
+            <w:tcW w:w="0" w:type="auto"/>
+            <w:hideMark/>
+          </w:tcPr>
+          <w:p>
+            <w:r>
+              <w:t>Useful for documents</w:t>
+            </w:r>
+          </w:p>
+        </w:tc>
+      </w:tr>
+      <w:tr>
+        <w:tc>
+          <w:tcPr>
+            <w:tcW w:w="0" w:type="auto"/>
+            <w:hideMark/>
+          </w:tcPr>
+          <w:p>
+            <w:r>
+              <w:t>Glossary</w:t>
+            </w:r>
+          </w:p>
+        </w:tc>
+        <w:tc>
+          <w:tcPr>
+            <w:tcW w:w="0" w:type="auto"/>
+            <w:hideMark/>
+          </w:tcPr>
+          <w:p>
+            <w:r>
+              <w:t>100 terms</w:t>
+            </w:r>
+          </w:p>
+        </w:tc>
+        <w:tc>
+          <w:tcPr>
+            <w:tcW w:w="0" w:type="auto"/>
+            <w:hideMark/>
+          </w:tcPr>
+          <w:p>
+            <w:r>
+              <w:rPr>
+                <w:rFonts w:ascii="Segoe UI Emoji" w:hAnsi="Segoe UI Emoji" w:cs="Segoe UI Emoji"/>
+              </w:rPr>
+              <w:t>❌</w:t>
+            </w:r>
+            <w:r>
+              <w:t xml:space="preserve"> Missing</w:t>
+            </w:r>
+          </w:p>
+        </w:tc>
+        <w:tc>
+          <w:tcPr>
+            <w:tcW w:w="0" w:type="auto"/>
+            <w:hideMark/>
+          </w:tcPr>
+          <w:p>
+            <w:r>
+              <w:t>Easy but valuable</w:t>
+            </w:r>
+          </w:p>
+        </w:tc>
+      </w:tr>
+      <w:tr>
+        <w:tc>
+          <w:tcPr>
+            <w:tcW w:w="0" w:type="auto"/>
+            <w:hideMark/>
+          </w:tcPr>
+          <w:p>
+            <w:r>
+              <w:t>Safety / uncertainty responses</w:t>
+            </w:r>
+          </w:p>
+        </w:tc>
+        <w:tc>
+          <w:tcPr>
+            <w:tcW w:w="0" w:type="auto"/>
+            <w:hideMark/>
+          </w:tcPr>
+          <w:p>
+            <w:r>
+              <w:t>20–30</w:t>
+            </w:r>
+          </w:p>
+        </w:tc>
+        <w:tc>
+          <w:tcPr>
+            <w:tcW w:w="0" w:type="auto"/>
+            <w:hideMark/>
+          </w:tcPr>
+          <w:p>
+            <w:r>
+              <w:rPr>
+                <w:rFonts w:ascii="Segoe UI Emoji" w:hAnsi="Segoe UI Emoji" w:cs="Segoe UI Emoji"/>
+              </w:rPr>
+              <w:t>❌</w:t>
+            </w:r>
+            <w:r>
+              <w:t xml:space="preserve"> Missing</w:t>
+            </w:r>
+          </w:p>
+        </w:tc>
+        <w:tc>
+          <w:tcPr>
+            <w:tcW w:w="0" w:type="auto"/>
+            <w:hideMark/>
+          </w:tcPr>
+          <w:p>
+            <w:r>
+              <w:t>Required for safe deployment</w:t>
+            </w:r>
+          </w:p>
+        </w:tc>
+      </w:tr>
+      <w:tr>
+        <w:tc>
+          <w:tcPr>
+            <w:tcW w:w="0" w:type="auto"/>
+            <w:hideMark/>
+          </w:tcPr>
+          <w:p>
+            <w:r>
+              <w:t>Complaint / FIR / application processes</w:t>
+            </w:r>
+          </w:p>
+        </w:tc>
+        <w:tc>
+          <w:tcPr>
+            <w:tcW w:w="0" w:type="auto"/>
+            <w:hideMark/>
+          </w:tcPr>
+          <w:p>
+            <w:r>
+              <w:t>50–100</w:t>
+            </w:r>
+          </w:p>
+        </w:tc>
+        <w:tc>
+          <w:tcPr>
+            <w:tcW w:w="0" w:type="auto"/>
+            <w:hideMark/>
+          </w:tcPr>
+          <w:p>
+            <w:r>
+              <w:rPr>
+                <w:rFonts w:ascii="Segoe UI Emoji" w:hAnsi="Segoe UI Emoji" w:cs="Segoe UI Emoji"/>
+              </w:rPr>
+              <w:t>❌</w:t>
+            </w:r>
+            <w:r>
+              <w:t xml:space="preserve"> Missing</w:t>
+            </w:r>
+          </w:p>
+        </w:tc>
+        <w:tc>
+          <w:tcPr>
+            <w:tcW w:w="0" w:type="auto"/>
+            <w:hideMark/>
+          </w:tcPr>
+          <w:p>
+            <w:r>
+              <w:t>For police &amp; administrative cases</w:t>
+            </w:r>
+          </w:p>
+        </w:tc>
+      </w:tr>
+    </w:tbl>
+    <w:p>
+      <w:r>
+        <w:pict w14:anchorId="64CE1396">
+          <v:rect id="_x0000_i1038" style="width:0;height:1.5pt" o:hralign="center" o:hrstd="t" o:hr="t" fillcolor="#a0a0a0" stroked="f"/>
+        </w:pict>
+      </w:r>
+    </w:p>
+    <w:p>
+      <w:pPr>
+        <w:pStyle w:val="Heading3"/>
+      </w:pPr>
+      <w:r>
+        <w:rPr>
+          <w:rFonts w:ascii="Segoe UI Emoji" w:hAnsi="Segoe UI Emoji" w:cs="Segoe UI Emoji"/>
+        </w:rPr>
+        <w:t>⭐</w:t>
+      </w:r>
+      <w:r>
+        <w:t xml:space="preserve"> </w:t>
+      </w:r>
+      <w:r>
+        <w:rPr>
+          <w:rStyle w:val="Strong"/>
+          <w:b/>
+          <w:bCs/>
+        </w:rPr>
+        <w:t>Total Recommended Dataset Size</w:t>
+      </w:r>
+    </w:p>
+    <w:p>
+      <w:pPr>
+        <w:pStyle w:val="NormalWeb"/>
+      </w:pPr>
+      <w:r>
+        <w:t>For a properly fine-tuned legal chatbot:</w:t>
+      </w:r>
+    </w:p>
+    <w:p>
+      <w:pPr>
+        <w:pStyle w:val="NormalWeb"/>
+      </w:pPr>
+      <w:r>
+        <w:rPr>
+          <w:rFonts w:ascii="Segoe UI Emoji" w:hAnsi="Segoe UI Emoji" w:cs="Segoe UI Emoji"/>
+        </w:rPr>
+        <w:lastRenderedPageBreak/>
+        <w:t>👉</w:t>
+      </w:r>
+      <w:r>
+        <w:t xml:space="preserve"> </w:t>
+      </w:r>
+      <w:r>
+        <w:rPr>
+          <w:rStyle w:val="Strong"/>
+        </w:rPr>
+        <w:t>600 – 1,000 high-quality instruction samples</w:t>
+      </w:r>
+    </w:p>
+    <w:p>
+      <w:pPr>
+        <w:pStyle w:val="NormalWeb"/>
+      </w:pPr>
+      <w:r>
+        <w:t>You currently have ~</w:t>
+      </w:r>
+      <w:r>
+        <w:rPr>
+          <w:rStyle w:val="Strong"/>
+        </w:rPr>
+        <w:t>150–200</w:t>
+      </w:r>
+      <w:r>
+        <w:t xml:space="preserve"> depending on earlier batches.</w:t>
+      </w:r>
+    </w:p>
+    <w:p>
+      <w:pPr>
+        <w:pStyle w:val="NormalWeb"/>
+      </w:pPr>
+      <w:proofErr w:type="gramStart"/>
+      <w:r>
+        <w:t>So</w:t>
+      </w:r>
+      <w:proofErr w:type="gramEnd"/>
+      <w:r>
+        <w:t xml:space="preserve"> you need </w:t>
+      </w:r>
+      <w:r>
+        <w:rPr>
+          <w:rStyle w:val="Strong"/>
+        </w:rPr>
+        <w:t>at least 400–600 more</w:t>
+      </w:r>
+      <w:r>
+        <w:t>, but in a distributed mix of different categories (NOT just property).</w:t>
+      </w:r>
+    </w:p>
+    <w:p>
+      <w:pPr>
+        <w:rPr>
+          <w:lang w:val="en-US"/>
+        </w:rPr>
+      </w:pPr>
+      <w:r>
+        <w:rPr>
+          <w:lang w:val="en-US"/>
+        </w:rPr>
+        <w:br w:type="page"/>
+      </w:r>
+    </w:p>
+    <w:p>
+      <w:pPr>
+        <w:rPr>
+          <w:lang w:val="en-US"/>
+        </w:rPr>
+      </w:pPr>
+    </w:p>
     <w:p>
       <w:pPr>
         <w:rPr>
@@ -525,6 +3013,1198 @@
     </w:lvl>
   </w:abstractNum>
   <w:abstractNum w:abstractNumId="1" w15:restartNumberingAfterBreak="0">
+    <w:nsid w:val="03697680"/>
+    <w:multiLevelType w:val="multilevel"/>
+    <w:tmpl w:val="D2221136"/>
+    <w:lvl w:ilvl="0">
+      <w:start w:val="1"/>
+      <w:numFmt w:val="bullet"/>
+      <w:lvlText w:val=""/>
+      <w:lvlJc w:val="left"/>
+      <w:pPr>
+        <w:tabs>
+          <w:tab w:val="num" w:pos="720"/>
+        </w:tabs>
+        <w:ind w:left="720" w:hanging="360"/>
+      </w:pPr>
+      <w:rPr>
+        <w:rFonts w:ascii="Symbol" w:hAnsi="Symbol" w:hint="default"/>
+        <w:sz w:val="20"/>
+      </w:rPr>
+    </w:lvl>
+    <w:lvl w:ilvl="1" w:tentative="1">
+      <w:start w:val="1"/>
+      <w:numFmt w:val="bullet"/>
+      <w:lvlText w:val="o"/>
+      <w:lvlJc w:val="left"/>
+      <w:pPr>
+        <w:tabs>
+          <w:tab w:val="num" w:pos="1440"/>
+        </w:tabs>
+        <w:ind w:left="1440" w:hanging="360"/>
+      </w:pPr>
+      <w:rPr>
+        <w:rFonts w:ascii="Courier New" w:hAnsi="Courier New" w:hint="default"/>
+        <w:sz w:val="20"/>
+      </w:rPr>
+    </w:lvl>
+    <w:lvl w:ilvl="2" w:tentative="1">
+      <w:start w:val="1"/>
+      <w:numFmt w:val="bullet"/>
+      <w:lvlText w:val=""/>
+      <w:lvlJc w:val="left"/>
+      <w:pPr>
+        <w:tabs>
+          <w:tab w:val="num" w:pos="2160"/>
+        </w:tabs>
+        <w:ind w:left="2160" w:hanging="360"/>
+      </w:pPr>
+      <w:rPr>
+        <w:rFonts w:ascii="Wingdings" w:hAnsi="Wingdings" w:hint="default"/>
+        <w:sz w:val="20"/>
+      </w:rPr>
+    </w:lvl>
+    <w:lvl w:ilvl="3" w:tentative="1">
+      <w:start w:val="1"/>
+      <w:numFmt w:val="bullet"/>
+      <w:lvlText w:val=""/>
+      <w:lvlJc w:val="left"/>
+      <w:pPr>
+        <w:tabs>
+          <w:tab w:val="num" w:pos="2880"/>
+        </w:tabs>
+        <w:ind w:left="2880" w:hanging="360"/>
+      </w:pPr>
+      <w:rPr>
+        <w:rFonts w:ascii="Wingdings" w:hAnsi="Wingdings" w:hint="default"/>
+        <w:sz w:val="20"/>
+      </w:rPr>
+    </w:lvl>
+    <w:lvl w:ilvl="4" w:tentative="1">
+      <w:start w:val="1"/>
+      <w:numFmt w:val="bullet"/>
+      <w:lvlText w:val=""/>
+      <w:lvlJc w:val="left"/>
+      <w:pPr>
+        <w:tabs>
+          <w:tab w:val="num" w:pos="3600"/>
+        </w:tabs>
+        <w:ind w:left="3600" w:hanging="360"/>
+      </w:pPr>
+      <w:rPr>
+        <w:rFonts w:ascii="Wingdings" w:hAnsi="Wingdings" w:hint="default"/>
+        <w:sz w:val="20"/>
+      </w:rPr>
+    </w:lvl>
+    <w:lvl w:ilvl="5" w:tentative="1">
+      <w:start w:val="1"/>
+      <w:numFmt w:val="bullet"/>
+      <w:lvlText w:val=""/>
+      <w:lvlJc w:val="left"/>
+      <w:pPr>
+        <w:tabs>
+          <w:tab w:val="num" w:pos="4320"/>
+        </w:tabs>
+        <w:ind w:left="4320" w:hanging="360"/>
+      </w:pPr>
+      <w:rPr>
+        <w:rFonts w:ascii="Wingdings" w:hAnsi="Wingdings" w:hint="default"/>
+        <w:sz w:val="20"/>
+      </w:rPr>
+    </w:lvl>
+    <w:lvl w:ilvl="6" w:tentative="1">
+      <w:start w:val="1"/>
+      <w:numFmt w:val="bullet"/>
+      <w:lvlText w:val=""/>
+      <w:lvlJc w:val="left"/>
+      <w:pPr>
+        <w:tabs>
+          <w:tab w:val="num" w:pos="5040"/>
+        </w:tabs>
+        <w:ind w:left="5040" w:hanging="360"/>
+      </w:pPr>
+      <w:rPr>
+        <w:rFonts w:ascii="Wingdings" w:hAnsi="Wingdings" w:hint="default"/>
+        <w:sz w:val="20"/>
+      </w:rPr>
+    </w:lvl>
+    <w:lvl w:ilvl="7" w:tentative="1">
+      <w:start w:val="1"/>
+      <w:numFmt w:val="bullet"/>
+      <w:lvlText w:val=""/>
+      <w:lvlJc w:val="left"/>
+      <w:pPr>
+        <w:tabs>
+          <w:tab w:val="num" w:pos="5760"/>
+        </w:tabs>
+        <w:ind w:left="5760" w:hanging="360"/>
+      </w:pPr>
+      <w:rPr>
+        <w:rFonts w:ascii="Wingdings" w:hAnsi="Wingdings" w:hint="default"/>
+        <w:sz w:val="20"/>
+      </w:rPr>
+    </w:lvl>
+    <w:lvl w:ilvl="8" w:tentative="1">
+      <w:start w:val="1"/>
+      <w:numFmt w:val="bullet"/>
+      <w:lvlText w:val=""/>
+      <w:lvlJc w:val="left"/>
+      <w:pPr>
+        <w:tabs>
+          <w:tab w:val="num" w:pos="6480"/>
+        </w:tabs>
+        <w:ind w:left="6480" w:hanging="360"/>
+      </w:pPr>
+      <w:rPr>
+        <w:rFonts w:ascii="Wingdings" w:hAnsi="Wingdings" w:hint="default"/>
+        <w:sz w:val="20"/>
+      </w:rPr>
+    </w:lvl>
+  </w:abstractNum>
+  <w:abstractNum w:abstractNumId="2" w15:restartNumberingAfterBreak="0">
+    <w:nsid w:val="1A1E29F0"/>
+    <w:multiLevelType w:val="multilevel"/>
+    <w:tmpl w:val="495A5C6E"/>
+    <w:lvl w:ilvl="0">
+      <w:start w:val="1"/>
+      <w:numFmt w:val="bullet"/>
+      <w:lvlText w:val=""/>
+      <w:lvlJc w:val="left"/>
+      <w:pPr>
+        <w:tabs>
+          <w:tab w:val="num" w:pos="720"/>
+        </w:tabs>
+        <w:ind w:left="720" w:hanging="360"/>
+      </w:pPr>
+      <w:rPr>
+        <w:rFonts w:ascii="Symbol" w:hAnsi="Symbol" w:hint="default"/>
+        <w:sz w:val="20"/>
+      </w:rPr>
+    </w:lvl>
+    <w:lvl w:ilvl="1" w:tentative="1">
+      <w:start w:val="1"/>
+      <w:numFmt w:val="bullet"/>
+      <w:lvlText w:val="o"/>
+      <w:lvlJc w:val="left"/>
+      <w:pPr>
+        <w:tabs>
+          <w:tab w:val="num" w:pos="1440"/>
+        </w:tabs>
+        <w:ind w:left="1440" w:hanging="360"/>
+      </w:pPr>
+      <w:rPr>
+        <w:rFonts w:ascii="Courier New" w:hAnsi="Courier New" w:hint="default"/>
+        <w:sz w:val="20"/>
+      </w:rPr>
+    </w:lvl>
+    <w:lvl w:ilvl="2" w:tentative="1">
+      <w:start w:val="1"/>
+      <w:numFmt w:val="bullet"/>
+      <w:lvlText w:val=""/>
+      <w:lvlJc w:val="left"/>
+      <w:pPr>
+        <w:tabs>
+          <w:tab w:val="num" w:pos="2160"/>
+        </w:tabs>
+        <w:ind w:left="2160" w:hanging="360"/>
+      </w:pPr>
+      <w:rPr>
+        <w:rFonts w:ascii="Wingdings" w:hAnsi="Wingdings" w:hint="default"/>
+        <w:sz w:val="20"/>
+      </w:rPr>
+    </w:lvl>
+    <w:lvl w:ilvl="3" w:tentative="1">
+      <w:start w:val="1"/>
+      <w:numFmt w:val="bullet"/>
+      <w:lvlText w:val=""/>
+      <w:lvlJc w:val="left"/>
+      <w:pPr>
+        <w:tabs>
+          <w:tab w:val="num" w:pos="2880"/>
+        </w:tabs>
+        <w:ind w:left="2880" w:hanging="360"/>
+      </w:pPr>
+      <w:rPr>
+        <w:rFonts w:ascii="Wingdings" w:hAnsi="Wingdings" w:hint="default"/>
+        <w:sz w:val="20"/>
+      </w:rPr>
+    </w:lvl>
+    <w:lvl w:ilvl="4" w:tentative="1">
+      <w:start w:val="1"/>
+      <w:numFmt w:val="bullet"/>
+      <w:lvlText w:val=""/>
+      <w:lvlJc w:val="left"/>
+      <w:pPr>
+        <w:tabs>
+          <w:tab w:val="num" w:pos="3600"/>
+        </w:tabs>
+        <w:ind w:left="3600" w:hanging="360"/>
+      </w:pPr>
+      <w:rPr>
+        <w:rFonts w:ascii="Wingdings" w:hAnsi="Wingdings" w:hint="default"/>
+        <w:sz w:val="20"/>
+      </w:rPr>
+    </w:lvl>
+    <w:lvl w:ilvl="5" w:tentative="1">
+      <w:start w:val="1"/>
+      <w:numFmt w:val="bullet"/>
+      <w:lvlText w:val=""/>
+      <w:lvlJc w:val="left"/>
+      <w:pPr>
+        <w:tabs>
+          <w:tab w:val="num" w:pos="4320"/>
+        </w:tabs>
+        <w:ind w:left="4320" w:hanging="360"/>
+      </w:pPr>
+      <w:rPr>
+        <w:rFonts w:ascii="Wingdings" w:hAnsi="Wingdings" w:hint="default"/>
+        <w:sz w:val="20"/>
+      </w:rPr>
+    </w:lvl>
+    <w:lvl w:ilvl="6" w:tentative="1">
+      <w:start w:val="1"/>
+      <w:numFmt w:val="bullet"/>
+      <w:lvlText w:val=""/>
+      <w:lvlJc w:val="left"/>
+      <w:pPr>
+        <w:tabs>
+          <w:tab w:val="num" w:pos="5040"/>
+        </w:tabs>
+        <w:ind w:left="5040" w:hanging="360"/>
+      </w:pPr>
+      <w:rPr>
+        <w:rFonts w:ascii="Wingdings" w:hAnsi="Wingdings" w:hint="default"/>
+        <w:sz w:val="20"/>
+      </w:rPr>
+    </w:lvl>
+    <w:lvl w:ilvl="7" w:tentative="1">
+      <w:start w:val="1"/>
+      <w:numFmt w:val="bullet"/>
+      <w:lvlText w:val=""/>
+      <w:lvlJc w:val="left"/>
+      <w:pPr>
+        <w:tabs>
+          <w:tab w:val="num" w:pos="5760"/>
+        </w:tabs>
+        <w:ind w:left="5760" w:hanging="360"/>
+      </w:pPr>
+      <w:rPr>
+        <w:rFonts w:ascii="Wingdings" w:hAnsi="Wingdings" w:hint="default"/>
+        <w:sz w:val="20"/>
+      </w:rPr>
+    </w:lvl>
+    <w:lvl w:ilvl="8" w:tentative="1">
+      <w:start w:val="1"/>
+      <w:numFmt w:val="bullet"/>
+      <w:lvlText w:val=""/>
+      <w:lvlJc w:val="left"/>
+      <w:pPr>
+        <w:tabs>
+          <w:tab w:val="num" w:pos="6480"/>
+        </w:tabs>
+        <w:ind w:left="6480" w:hanging="360"/>
+      </w:pPr>
+      <w:rPr>
+        <w:rFonts w:ascii="Wingdings" w:hAnsi="Wingdings" w:hint="default"/>
+        <w:sz w:val="20"/>
+      </w:rPr>
+    </w:lvl>
+  </w:abstractNum>
+  <w:abstractNum w:abstractNumId="3" w15:restartNumberingAfterBreak="0">
+    <w:nsid w:val="1BB3509C"/>
+    <w:multiLevelType w:val="multilevel"/>
+    <w:tmpl w:val="8E98D310"/>
+    <w:lvl w:ilvl="0">
+      <w:start w:val="1"/>
+      <w:numFmt w:val="bullet"/>
+      <w:lvlText w:val=""/>
+      <w:lvlJc w:val="left"/>
+      <w:pPr>
+        <w:tabs>
+          <w:tab w:val="num" w:pos="720"/>
+        </w:tabs>
+        <w:ind w:left="720" w:hanging="360"/>
+      </w:pPr>
+      <w:rPr>
+        <w:rFonts w:ascii="Symbol" w:hAnsi="Symbol" w:hint="default"/>
+        <w:sz w:val="20"/>
+      </w:rPr>
+    </w:lvl>
+    <w:lvl w:ilvl="1" w:tentative="1">
+      <w:start w:val="1"/>
+      <w:numFmt w:val="bullet"/>
+      <w:lvlText w:val="o"/>
+      <w:lvlJc w:val="left"/>
+      <w:pPr>
+        <w:tabs>
+          <w:tab w:val="num" w:pos="1440"/>
+        </w:tabs>
+        <w:ind w:left="1440" w:hanging="360"/>
+      </w:pPr>
+      <w:rPr>
+        <w:rFonts w:ascii="Courier New" w:hAnsi="Courier New" w:hint="default"/>
+        <w:sz w:val="20"/>
+      </w:rPr>
+    </w:lvl>
+    <w:lvl w:ilvl="2" w:tentative="1">
+      <w:start w:val="1"/>
+      <w:numFmt w:val="bullet"/>
+      <w:lvlText w:val=""/>
+      <w:lvlJc w:val="left"/>
+      <w:pPr>
+        <w:tabs>
+          <w:tab w:val="num" w:pos="2160"/>
+        </w:tabs>
+        <w:ind w:left="2160" w:hanging="360"/>
+      </w:pPr>
+      <w:rPr>
+        <w:rFonts w:ascii="Wingdings" w:hAnsi="Wingdings" w:hint="default"/>
+        <w:sz w:val="20"/>
+      </w:rPr>
+    </w:lvl>
+    <w:lvl w:ilvl="3" w:tentative="1">
+      <w:start w:val="1"/>
+      <w:numFmt w:val="bullet"/>
+      <w:lvlText w:val=""/>
+      <w:lvlJc w:val="left"/>
+      <w:pPr>
+        <w:tabs>
+          <w:tab w:val="num" w:pos="2880"/>
+        </w:tabs>
+        <w:ind w:left="2880" w:hanging="360"/>
+      </w:pPr>
+      <w:rPr>
+        <w:rFonts w:ascii="Wingdings" w:hAnsi="Wingdings" w:hint="default"/>
+        <w:sz w:val="20"/>
+      </w:rPr>
+    </w:lvl>
+    <w:lvl w:ilvl="4" w:tentative="1">
+      <w:start w:val="1"/>
+      <w:numFmt w:val="bullet"/>
+      <w:lvlText w:val=""/>
+      <w:lvlJc w:val="left"/>
+      <w:pPr>
+        <w:tabs>
+          <w:tab w:val="num" w:pos="3600"/>
+        </w:tabs>
+        <w:ind w:left="3600" w:hanging="360"/>
+      </w:pPr>
+      <w:rPr>
+        <w:rFonts w:ascii="Wingdings" w:hAnsi="Wingdings" w:hint="default"/>
+        <w:sz w:val="20"/>
+      </w:rPr>
+    </w:lvl>
+    <w:lvl w:ilvl="5" w:tentative="1">
+      <w:start w:val="1"/>
+      <w:numFmt w:val="bullet"/>
+      <w:lvlText w:val=""/>
+      <w:lvlJc w:val="left"/>
+      <w:pPr>
+        <w:tabs>
+          <w:tab w:val="num" w:pos="4320"/>
+        </w:tabs>
+        <w:ind w:left="4320" w:hanging="360"/>
+      </w:pPr>
+      <w:rPr>
+        <w:rFonts w:ascii="Wingdings" w:hAnsi="Wingdings" w:hint="default"/>
+        <w:sz w:val="20"/>
+      </w:rPr>
+    </w:lvl>
+    <w:lvl w:ilvl="6" w:tentative="1">
+      <w:start w:val="1"/>
+      <w:numFmt w:val="bullet"/>
+      <w:lvlText w:val=""/>
+      <w:lvlJc w:val="left"/>
+      <w:pPr>
+        <w:tabs>
+          <w:tab w:val="num" w:pos="5040"/>
+        </w:tabs>
+        <w:ind w:left="5040" w:hanging="360"/>
+      </w:pPr>
+      <w:rPr>
+        <w:rFonts w:ascii="Wingdings" w:hAnsi="Wingdings" w:hint="default"/>
+        <w:sz w:val="20"/>
+      </w:rPr>
+    </w:lvl>
+    <w:lvl w:ilvl="7" w:tentative="1">
+      <w:start w:val="1"/>
+      <w:numFmt w:val="bullet"/>
+      <w:lvlText w:val=""/>
+      <w:lvlJc w:val="left"/>
+      <w:pPr>
+        <w:tabs>
+          <w:tab w:val="num" w:pos="5760"/>
+        </w:tabs>
+        <w:ind w:left="5760" w:hanging="360"/>
+      </w:pPr>
+      <w:rPr>
+        <w:rFonts w:ascii="Wingdings" w:hAnsi="Wingdings" w:hint="default"/>
+        <w:sz w:val="20"/>
+      </w:rPr>
+    </w:lvl>
+    <w:lvl w:ilvl="8" w:tentative="1">
+      <w:start w:val="1"/>
+      <w:numFmt w:val="bullet"/>
+      <w:lvlText w:val=""/>
+      <w:lvlJc w:val="left"/>
+      <w:pPr>
+        <w:tabs>
+          <w:tab w:val="num" w:pos="6480"/>
+        </w:tabs>
+        <w:ind w:left="6480" w:hanging="360"/>
+      </w:pPr>
+      <w:rPr>
+        <w:rFonts w:ascii="Wingdings" w:hAnsi="Wingdings" w:hint="default"/>
+        <w:sz w:val="20"/>
+      </w:rPr>
+    </w:lvl>
+  </w:abstractNum>
+  <w:abstractNum w:abstractNumId="4" w15:restartNumberingAfterBreak="0">
+    <w:nsid w:val="229B4B73"/>
+    <w:multiLevelType w:val="multilevel"/>
+    <w:tmpl w:val="862A6E3A"/>
+    <w:lvl w:ilvl="0">
+      <w:start w:val="1"/>
+      <w:numFmt w:val="bullet"/>
+      <w:lvlText w:val=""/>
+      <w:lvlJc w:val="left"/>
+      <w:pPr>
+        <w:tabs>
+          <w:tab w:val="num" w:pos="720"/>
+        </w:tabs>
+        <w:ind w:left="720" w:hanging="360"/>
+      </w:pPr>
+      <w:rPr>
+        <w:rFonts w:ascii="Symbol" w:hAnsi="Symbol" w:hint="default"/>
+        <w:sz w:val="20"/>
+      </w:rPr>
+    </w:lvl>
+    <w:lvl w:ilvl="1" w:tentative="1">
+      <w:start w:val="1"/>
+      <w:numFmt w:val="bullet"/>
+      <w:lvlText w:val="o"/>
+      <w:lvlJc w:val="left"/>
+      <w:pPr>
+        <w:tabs>
+          <w:tab w:val="num" w:pos="1440"/>
+        </w:tabs>
+        <w:ind w:left="1440" w:hanging="360"/>
+      </w:pPr>
+      <w:rPr>
+        <w:rFonts w:ascii="Courier New" w:hAnsi="Courier New" w:hint="default"/>
+        <w:sz w:val="20"/>
+      </w:rPr>
+    </w:lvl>
+    <w:lvl w:ilvl="2" w:tentative="1">
+      <w:start w:val="1"/>
+      <w:numFmt w:val="bullet"/>
+      <w:lvlText w:val=""/>
+      <w:lvlJc w:val="left"/>
+      <w:pPr>
+        <w:tabs>
+          <w:tab w:val="num" w:pos="2160"/>
+        </w:tabs>
+        <w:ind w:left="2160" w:hanging="360"/>
+      </w:pPr>
+      <w:rPr>
+        <w:rFonts w:ascii="Wingdings" w:hAnsi="Wingdings" w:hint="default"/>
+        <w:sz w:val="20"/>
+      </w:rPr>
+    </w:lvl>
+    <w:lvl w:ilvl="3" w:tentative="1">
+      <w:start w:val="1"/>
+      <w:numFmt w:val="bullet"/>
+      <w:lvlText w:val=""/>
+      <w:lvlJc w:val="left"/>
+      <w:pPr>
+        <w:tabs>
+          <w:tab w:val="num" w:pos="2880"/>
+        </w:tabs>
+        <w:ind w:left="2880" w:hanging="360"/>
+      </w:pPr>
+      <w:rPr>
+        <w:rFonts w:ascii="Wingdings" w:hAnsi="Wingdings" w:hint="default"/>
+        <w:sz w:val="20"/>
+      </w:rPr>
+    </w:lvl>
+    <w:lvl w:ilvl="4" w:tentative="1">
+      <w:start w:val="1"/>
+      <w:numFmt w:val="bullet"/>
+      <w:lvlText w:val=""/>
+      <w:lvlJc w:val="left"/>
+      <w:pPr>
+        <w:tabs>
+          <w:tab w:val="num" w:pos="3600"/>
+        </w:tabs>
+        <w:ind w:left="3600" w:hanging="360"/>
+      </w:pPr>
+      <w:rPr>
+        <w:rFonts w:ascii="Wingdings" w:hAnsi="Wingdings" w:hint="default"/>
+        <w:sz w:val="20"/>
+      </w:rPr>
+    </w:lvl>
+    <w:lvl w:ilvl="5" w:tentative="1">
+      <w:start w:val="1"/>
+      <w:numFmt w:val="bullet"/>
+      <w:lvlText w:val=""/>
+      <w:lvlJc w:val="left"/>
+      <w:pPr>
+        <w:tabs>
+          <w:tab w:val="num" w:pos="4320"/>
+        </w:tabs>
+        <w:ind w:left="4320" w:hanging="360"/>
+      </w:pPr>
+      <w:rPr>
+        <w:rFonts w:ascii="Wingdings" w:hAnsi="Wingdings" w:hint="default"/>
+        <w:sz w:val="20"/>
+      </w:rPr>
+    </w:lvl>
+    <w:lvl w:ilvl="6" w:tentative="1">
+      <w:start w:val="1"/>
+      <w:numFmt w:val="bullet"/>
+      <w:lvlText w:val=""/>
+      <w:lvlJc w:val="left"/>
+      <w:pPr>
+        <w:tabs>
+          <w:tab w:val="num" w:pos="5040"/>
+        </w:tabs>
+        <w:ind w:left="5040" w:hanging="360"/>
+      </w:pPr>
+      <w:rPr>
+        <w:rFonts w:ascii="Wingdings" w:hAnsi="Wingdings" w:hint="default"/>
+        <w:sz w:val="20"/>
+      </w:rPr>
+    </w:lvl>
+    <w:lvl w:ilvl="7" w:tentative="1">
+      <w:start w:val="1"/>
+      <w:numFmt w:val="bullet"/>
+      <w:lvlText w:val=""/>
+      <w:lvlJc w:val="left"/>
+      <w:pPr>
+        <w:tabs>
+          <w:tab w:val="num" w:pos="5760"/>
+        </w:tabs>
+        <w:ind w:left="5760" w:hanging="360"/>
+      </w:pPr>
+      <w:rPr>
+        <w:rFonts w:ascii="Wingdings" w:hAnsi="Wingdings" w:hint="default"/>
+        <w:sz w:val="20"/>
+      </w:rPr>
+    </w:lvl>
+    <w:lvl w:ilvl="8" w:tentative="1">
+      <w:start w:val="1"/>
+      <w:numFmt w:val="bullet"/>
+      <w:lvlText w:val=""/>
+      <w:lvlJc w:val="left"/>
+      <w:pPr>
+        <w:tabs>
+          <w:tab w:val="num" w:pos="6480"/>
+        </w:tabs>
+        <w:ind w:left="6480" w:hanging="360"/>
+      </w:pPr>
+      <w:rPr>
+        <w:rFonts w:ascii="Wingdings" w:hAnsi="Wingdings" w:hint="default"/>
+        <w:sz w:val="20"/>
+      </w:rPr>
+    </w:lvl>
+  </w:abstractNum>
+  <w:abstractNum w:abstractNumId="5" w15:restartNumberingAfterBreak="0">
+    <w:nsid w:val="22A42214"/>
+    <w:multiLevelType w:val="multilevel"/>
+    <w:tmpl w:val="4654628E"/>
+    <w:lvl w:ilvl="0">
+      <w:start w:val="1"/>
+      <w:numFmt w:val="bullet"/>
+      <w:lvlText w:val=""/>
+      <w:lvlJc w:val="left"/>
+      <w:pPr>
+        <w:tabs>
+          <w:tab w:val="num" w:pos="720"/>
+        </w:tabs>
+        <w:ind w:left="720" w:hanging="360"/>
+      </w:pPr>
+      <w:rPr>
+        <w:rFonts w:ascii="Symbol" w:hAnsi="Symbol" w:hint="default"/>
+        <w:sz w:val="20"/>
+      </w:rPr>
+    </w:lvl>
+    <w:lvl w:ilvl="1" w:tentative="1">
+      <w:start w:val="1"/>
+      <w:numFmt w:val="bullet"/>
+      <w:lvlText w:val="o"/>
+      <w:lvlJc w:val="left"/>
+      <w:pPr>
+        <w:tabs>
+          <w:tab w:val="num" w:pos="1440"/>
+        </w:tabs>
+        <w:ind w:left="1440" w:hanging="360"/>
+      </w:pPr>
+      <w:rPr>
+        <w:rFonts w:ascii="Courier New" w:hAnsi="Courier New" w:hint="default"/>
+        <w:sz w:val="20"/>
+      </w:rPr>
+    </w:lvl>
+    <w:lvl w:ilvl="2" w:tentative="1">
+      <w:start w:val="1"/>
+      <w:numFmt w:val="bullet"/>
+      <w:lvlText w:val=""/>
+      <w:lvlJc w:val="left"/>
+      <w:pPr>
+        <w:tabs>
+          <w:tab w:val="num" w:pos="2160"/>
+        </w:tabs>
+        <w:ind w:left="2160" w:hanging="360"/>
+      </w:pPr>
+      <w:rPr>
+        <w:rFonts w:ascii="Wingdings" w:hAnsi="Wingdings" w:hint="default"/>
+        <w:sz w:val="20"/>
+      </w:rPr>
+    </w:lvl>
+    <w:lvl w:ilvl="3" w:tentative="1">
+      <w:start w:val="1"/>
+      <w:numFmt w:val="bullet"/>
+      <w:lvlText w:val=""/>
+      <w:lvlJc w:val="left"/>
+      <w:pPr>
+        <w:tabs>
+          <w:tab w:val="num" w:pos="2880"/>
+        </w:tabs>
+        <w:ind w:left="2880" w:hanging="360"/>
+      </w:pPr>
+      <w:rPr>
+        <w:rFonts w:ascii="Wingdings" w:hAnsi="Wingdings" w:hint="default"/>
+        <w:sz w:val="20"/>
+      </w:rPr>
+    </w:lvl>
+    <w:lvl w:ilvl="4" w:tentative="1">
+      <w:start w:val="1"/>
+      <w:numFmt w:val="bullet"/>
+      <w:lvlText w:val=""/>
+      <w:lvlJc w:val="left"/>
+      <w:pPr>
+        <w:tabs>
+          <w:tab w:val="num" w:pos="3600"/>
+        </w:tabs>
+        <w:ind w:left="3600" w:hanging="360"/>
+      </w:pPr>
+      <w:rPr>
+        <w:rFonts w:ascii="Wingdings" w:hAnsi="Wingdings" w:hint="default"/>
+        <w:sz w:val="20"/>
+      </w:rPr>
+    </w:lvl>
+    <w:lvl w:ilvl="5" w:tentative="1">
+      <w:start w:val="1"/>
+      <w:numFmt w:val="bullet"/>
+      <w:lvlText w:val=""/>
+      <w:lvlJc w:val="left"/>
+      <w:pPr>
+        <w:tabs>
+          <w:tab w:val="num" w:pos="4320"/>
+        </w:tabs>
+        <w:ind w:left="4320" w:hanging="360"/>
+      </w:pPr>
+      <w:rPr>
+        <w:rFonts w:ascii="Wingdings" w:hAnsi="Wingdings" w:hint="default"/>
+        <w:sz w:val="20"/>
+      </w:rPr>
+    </w:lvl>
+    <w:lvl w:ilvl="6" w:tentative="1">
+      <w:start w:val="1"/>
+      <w:numFmt w:val="bullet"/>
+      <w:lvlText w:val=""/>
+      <w:lvlJc w:val="left"/>
+      <w:pPr>
+        <w:tabs>
+          <w:tab w:val="num" w:pos="5040"/>
+        </w:tabs>
+        <w:ind w:left="5040" w:hanging="360"/>
+      </w:pPr>
+      <w:rPr>
+        <w:rFonts w:ascii="Wingdings" w:hAnsi="Wingdings" w:hint="default"/>
+        <w:sz w:val="20"/>
+      </w:rPr>
+    </w:lvl>
+    <w:lvl w:ilvl="7" w:tentative="1">
+      <w:start w:val="1"/>
+      <w:numFmt w:val="bullet"/>
+      <w:lvlText w:val=""/>
+      <w:lvlJc w:val="left"/>
+      <w:pPr>
+        <w:tabs>
+          <w:tab w:val="num" w:pos="5760"/>
+        </w:tabs>
+        <w:ind w:left="5760" w:hanging="360"/>
+      </w:pPr>
+      <w:rPr>
+        <w:rFonts w:ascii="Wingdings" w:hAnsi="Wingdings" w:hint="default"/>
+        <w:sz w:val="20"/>
+      </w:rPr>
+    </w:lvl>
+    <w:lvl w:ilvl="8" w:tentative="1">
+      <w:start w:val="1"/>
+      <w:numFmt w:val="bullet"/>
+      <w:lvlText w:val=""/>
+      <w:lvlJc w:val="left"/>
+      <w:pPr>
+        <w:tabs>
+          <w:tab w:val="num" w:pos="6480"/>
+        </w:tabs>
+        <w:ind w:left="6480" w:hanging="360"/>
+      </w:pPr>
+      <w:rPr>
+        <w:rFonts w:ascii="Wingdings" w:hAnsi="Wingdings" w:hint="default"/>
+        <w:sz w:val="20"/>
+      </w:rPr>
+    </w:lvl>
+  </w:abstractNum>
+  <w:abstractNum w:abstractNumId="6" w15:restartNumberingAfterBreak="0">
+    <w:nsid w:val="26C74C92"/>
+    <w:multiLevelType w:val="multilevel"/>
+    <w:tmpl w:val="94560B06"/>
+    <w:lvl w:ilvl="0">
+      <w:start w:val="1"/>
+      <w:numFmt w:val="bullet"/>
+      <w:lvlText w:val=""/>
+      <w:lvlJc w:val="left"/>
+      <w:pPr>
+        <w:tabs>
+          <w:tab w:val="num" w:pos="720"/>
+        </w:tabs>
+        <w:ind w:left="720" w:hanging="360"/>
+      </w:pPr>
+      <w:rPr>
+        <w:rFonts w:ascii="Symbol" w:hAnsi="Symbol" w:hint="default"/>
+        <w:sz w:val="20"/>
+      </w:rPr>
+    </w:lvl>
+    <w:lvl w:ilvl="1" w:tentative="1">
+      <w:start w:val="1"/>
+      <w:numFmt w:val="bullet"/>
+      <w:lvlText w:val="o"/>
+      <w:lvlJc w:val="left"/>
+      <w:pPr>
+        <w:tabs>
+          <w:tab w:val="num" w:pos="1440"/>
+        </w:tabs>
+        <w:ind w:left="1440" w:hanging="360"/>
+      </w:pPr>
+      <w:rPr>
+        <w:rFonts w:ascii="Courier New" w:hAnsi="Courier New" w:hint="default"/>
+        <w:sz w:val="20"/>
+      </w:rPr>
+    </w:lvl>
+    <w:lvl w:ilvl="2" w:tentative="1">
+      <w:start w:val="1"/>
+      <w:numFmt w:val="bullet"/>
+      <w:lvlText w:val=""/>
+      <w:lvlJc w:val="left"/>
+      <w:pPr>
+        <w:tabs>
+          <w:tab w:val="num" w:pos="2160"/>
+        </w:tabs>
+        <w:ind w:left="2160" w:hanging="360"/>
+      </w:pPr>
+      <w:rPr>
+        <w:rFonts w:ascii="Wingdings" w:hAnsi="Wingdings" w:hint="default"/>
+        <w:sz w:val="20"/>
+      </w:rPr>
+    </w:lvl>
+    <w:lvl w:ilvl="3" w:tentative="1">
+      <w:start w:val="1"/>
+      <w:numFmt w:val="bullet"/>
+      <w:lvlText w:val=""/>
+      <w:lvlJc w:val="left"/>
+      <w:pPr>
+        <w:tabs>
+          <w:tab w:val="num" w:pos="2880"/>
+        </w:tabs>
+        <w:ind w:left="2880" w:hanging="360"/>
+      </w:pPr>
+      <w:rPr>
+        <w:rFonts w:ascii="Wingdings" w:hAnsi="Wingdings" w:hint="default"/>
+        <w:sz w:val="20"/>
+      </w:rPr>
+    </w:lvl>
+    <w:lvl w:ilvl="4" w:tentative="1">
+      <w:start w:val="1"/>
+      <w:numFmt w:val="bullet"/>
+      <w:lvlText w:val=""/>
+      <w:lvlJc w:val="left"/>
+      <w:pPr>
+        <w:tabs>
+          <w:tab w:val="num" w:pos="3600"/>
+        </w:tabs>
+        <w:ind w:left="3600" w:hanging="360"/>
+      </w:pPr>
+      <w:rPr>
+        <w:rFonts w:ascii="Wingdings" w:hAnsi="Wingdings" w:hint="default"/>
+        <w:sz w:val="20"/>
+      </w:rPr>
+    </w:lvl>
+    <w:lvl w:ilvl="5" w:tentative="1">
+      <w:start w:val="1"/>
+      <w:numFmt w:val="bullet"/>
+      <w:lvlText w:val=""/>
+      <w:lvlJc w:val="left"/>
+      <w:pPr>
+        <w:tabs>
+          <w:tab w:val="num" w:pos="4320"/>
+        </w:tabs>
+        <w:ind w:left="4320" w:hanging="360"/>
+      </w:pPr>
+      <w:rPr>
+        <w:rFonts w:ascii="Wingdings" w:hAnsi="Wingdings" w:hint="default"/>
+        <w:sz w:val="20"/>
+      </w:rPr>
+    </w:lvl>
+    <w:lvl w:ilvl="6" w:tentative="1">
+      <w:start w:val="1"/>
+      <w:numFmt w:val="bullet"/>
+      <w:lvlText w:val=""/>
+      <w:lvlJc w:val="left"/>
+      <w:pPr>
+        <w:tabs>
+          <w:tab w:val="num" w:pos="5040"/>
+        </w:tabs>
+        <w:ind w:left="5040" w:hanging="360"/>
+      </w:pPr>
+      <w:rPr>
+        <w:rFonts w:ascii="Wingdings" w:hAnsi="Wingdings" w:hint="default"/>
+        <w:sz w:val="20"/>
+      </w:rPr>
+    </w:lvl>
+    <w:lvl w:ilvl="7" w:tentative="1">
+      <w:start w:val="1"/>
+      <w:numFmt w:val="bullet"/>
+      <w:lvlText w:val=""/>
+      <w:lvlJc w:val="left"/>
+      <w:pPr>
+        <w:tabs>
+          <w:tab w:val="num" w:pos="5760"/>
+        </w:tabs>
+        <w:ind w:left="5760" w:hanging="360"/>
+      </w:pPr>
+      <w:rPr>
+        <w:rFonts w:ascii="Wingdings" w:hAnsi="Wingdings" w:hint="default"/>
+        <w:sz w:val="20"/>
+      </w:rPr>
+    </w:lvl>
+    <w:lvl w:ilvl="8" w:tentative="1">
+      <w:start w:val="1"/>
+      <w:numFmt w:val="bullet"/>
+      <w:lvlText w:val=""/>
+      <w:lvlJc w:val="left"/>
+      <w:pPr>
+        <w:tabs>
+          <w:tab w:val="num" w:pos="6480"/>
+        </w:tabs>
+        <w:ind w:left="6480" w:hanging="360"/>
+      </w:pPr>
+      <w:rPr>
+        <w:rFonts w:ascii="Wingdings" w:hAnsi="Wingdings" w:hint="default"/>
+        <w:sz w:val="20"/>
+      </w:rPr>
+    </w:lvl>
+  </w:abstractNum>
+  <w:abstractNum w:abstractNumId="7" w15:restartNumberingAfterBreak="0">
+    <w:nsid w:val="2C8C2443"/>
+    <w:multiLevelType w:val="multilevel"/>
+    <w:tmpl w:val="99783172"/>
+    <w:lvl w:ilvl="0">
+      <w:start w:val="1"/>
+      <w:numFmt w:val="bullet"/>
+      <w:lvlText w:val=""/>
+      <w:lvlJc w:val="left"/>
+      <w:pPr>
+        <w:tabs>
+          <w:tab w:val="num" w:pos="720"/>
+        </w:tabs>
+        <w:ind w:left="720" w:hanging="360"/>
+      </w:pPr>
+      <w:rPr>
+        <w:rFonts w:ascii="Symbol" w:hAnsi="Symbol" w:hint="default"/>
+        <w:sz w:val="20"/>
+      </w:rPr>
+    </w:lvl>
+    <w:lvl w:ilvl="1" w:tentative="1">
+      <w:start w:val="1"/>
+      <w:numFmt w:val="bullet"/>
+      <w:lvlText w:val="o"/>
+      <w:lvlJc w:val="left"/>
+      <w:pPr>
+        <w:tabs>
+          <w:tab w:val="num" w:pos="1440"/>
+        </w:tabs>
+        <w:ind w:left="1440" w:hanging="360"/>
+      </w:pPr>
+      <w:rPr>
+        <w:rFonts w:ascii="Courier New" w:hAnsi="Courier New" w:hint="default"/>
+        <w:sz w:val="20"/>
+      </w:rPr>
+    </w:lvl>
+    <w:lvl w:ilvl="2" w:tentative="1">
+      <w:start w:val="1"/>
+      <w:numFmt w:val="bullet"/>
+      <w:lvlText w:val=""/>
+      <w:lvlJc w:val="left"/>
+      <w:pPr>
+        <w:tabs>
+          <w:tab w:val="num" w:pos="2160"/>
+        </w:tabs>
+        <w:ind w:left="2160" w:hanging="360"/>
+      </w:pPr>
+      <w:rPr>
+        <w:rFonts w:ascii="Wingdings" w:hAnsi="Wingdings" w:hint="default"/>
+        <w:sz w:val="20"/>
+      </w:rPr>
+    </w:lvl>
+    <w:lvl w:ilvl="3" w:tentative="1">
+      <w:start w:val="1"/>
+      <w:numFmt w:val="bullet"/>
+      <w:lvlText w:val=""/>
+      <w:lvlJc w:val="left"/>
+      <w:pPr>
+        <w:tabs>
+          <w:tab w:val="num" w:pos="2880"/>
+        </w:tabs>
+        <w:ind w:left="2880" w:hanging="360"/>
+      </w:pPr>
+      <w:rPr>
+        <w:rFonts w:ascii="Wingdings" w:hAnsi="Wingdings" w:hint="default"/>
+        <w:sz w:val="20"/>
+      </w:rPr>
+    </w:lvl>
+    <w:lvl w:ilvl="4" w:tentative="1">
+      <w:start w:val="1"/>
+      <w:numFmt w:val="bullet"/>
+      <w:lvlText w:val=""/>
+      <w:lvlJc w:val="left"/>
+      <w:pPr>
+        <w:tabs>
+          <w:tab w:val="num" w:pos="3600"/>
+        </w:tabs>
+        <w:ind w:left="3600" w:hanging="360"/>
+      </w:pPr>
+      <w:rPr>
+        <w:rFonts w:ascii="Wingdings" w:hAnsi="Wingdings" w:hint="default"/>
+        <w:sz w:val="20"/>
+      </w:rPr>
+    </w:lvl>
+    <w:lvl w:ilvl="5" w:tentative="1">
+      <w:start w:val="1"/>
+      <w:numFmt w:val="bullet"/>
+      <w:lvlText w:val=""/>
+      <w:lvlJc w:val="left"/>
+      <w:pPr>
+        <w:tabs>
+          <w:tab w:val="num" w:pos="4320"/>
+        </w:tabs>
+        <w:ind w:left="4320" w:hanging="360"/>
+      </w:pPr>
+      <w:rPr>
+        <w:rFonts w:ascii="Wingdings" w:hAnsi="Wingdings" w:hint="default"/>
+        <w:sz w:val="20"/>
+      </w:rPr>
+    </w:lvl>
+    <w:lvl w:ilvl="6" w:tentative="1">
+      <w:start w:val="1"/>
+      <w:numFmt w:val="bullet"/>
+      <w:lvlText w:val=""/>
+      <w:lvlJc w:val="left"/>
+      <w:pPr>
+        <w:tabs>
+          <w:tab w:val="num" w:pos="5040"/>
+        </w:tabs>
+        <w:ind w:left="5040" w:hanging="360"/>
+      </w:pPr>
+      <w:rPr>
+        <w:rFonts w:ascii="Wingdings" w:hAnsi="Wingdings" w:hint="default"/>
+        <w:sz w:val="20"/>
+      </w:rPr>
+    </w:lvl>
+    <w:lvl w:ilvl="7" w:tentative="1">
+      <w:start w:val="1"/>
+      <w:numFmt w:val="bullet"/>
+      <w:lvlText w:val=""/>
+      <w:lvlJc w:val="left"/>
+      <w:pPr>
+        <w:tabs>
+          <w:tab w:val="num" w:pos="5760"/>
+        </w:tabs>
+        <w:ind w:left="5760" w:hanging="360"/>
+      </w:pPr>
+      <w:rPr>
+        <w:rFonts w:ascii="Wingdings" w:hAnsi="Wingdings" w:hint="default"/>
+        <w:sz w:val="20"/>
+      </w:rPr>
+    </w:lvl>
+    <w:lvl w:ilvl="8" w:tentative="1">
+      <w:start w:val="1"/>
+      <w:numFmt w:val="bullet"/>
+      <w:lvlText w:val=""/>
+      <w:lvlJc w:val="left"/>
+      <w:pPr>
+        <w:tabs>
+          <w:tab w:val="num" w:pos="6480"/>
+        </w:tabs>
+        <w:ind w:left="6480" w:hanging="360"/>
+      </w:pPr>
+      <w:rPr>
+        <w:rFonts w:ascii="Wingdings" w:hAnsi="Wingdings" w:hint="default"/>
+        <w:sz w:val="20"/>
+      </w:rPr>
+    </w:lvl>
+  </w:abstractNum>
+  <w:abstractNum w:abstractNumId="8" w15:restartNumberingAfterBreak="0">
+    <w:nsid w:val="304E53B1"/>
+    <w:multiLevelType w:val="multilevel"/>
+    <w:tmpl w:val="FBA453EC"/>
+    <w:lvl w:ilvl="0">
+      <w:start w:val="1"/>
+      <w:numFmt w:val="bullet"/>
+      <w:lvlText w:val=""/>
+      <w:lvlJc w:val="left"/>
+      <w:pPr>
+        <w:tabs>
+          <w:tab w:val="num" w:pos="720"/>
+        </w:tabs>
+        <w:ind w:left="720" w:hanging="360"/>
+      </w:pPr>
+      <w:rPr>
+        <w:rFonts w:ascii="Symbol" w:hAnsi="Symbol" w:hint="default"/>
+        <w:sz w:val="20"/>
+      </w:rPr>
+    </w:lvl>
+    <w:lvl w:ilvl="1" w:tentative="1">
+      <w:start w:val="1"/>
+      <w:numFmt w:val="bullet"/>
+      <w:lvlText w:val="o"/>
+      <w:lvlJc w:val="left"/>
+      <w:pPr>
+        <w:tabs>
+          <w:tab w:val="num" w:pos="1440"/>
+        </w:tabs>
+        <w:ind w:left="1440" w:hanging="360"/>
+      </w:pPr>
+      <w:rPr>
+        <w:rFonts w:ascii="Courier New" w:hAnsi="Courier New" w:hint="default"/>
+        <w:sz w:val="20"/>
+      </w:rPr>
+    </w:lvl>
+    <w:lvl w:ilvl="2" w:tentative="1">
+      <w:start w:val="1"/>
+      <w:numFmt w:val="bullet"/>
+      <w:lvlText w:val=""/>
+      <w:lvlJc w:val="left"/>
+      <w:pPr>
+        <w:tabs>
+          <w:tab w:val="num" w:pos="2160"/>
+        </w:tabs>
+        <w:ind w:left="2160" w:hanging="360"/>
+      </w:pPr>
+      <w:rPr>
+        <w:rFonts w:ascii="Wingdings" w:hAnsi="Wingdings" w:hint="default"/>
+        <w:sz w:val="20"/>
+      </w:rPr>
+    </w:lvl>
+    <w:lvl w:ilvl="3" w:tentative="1">
+      <w:start w:val="1"/>
+      <w:numFmt w:val="bullet"/>
+      <w:lvlText w:val=""/>
+      <w:lvlJc w:val="left"/>
+      <w:pPr>
+        <w:tabs>
+          <w:tab w:val="num" w:pos="2880"/>
+        </w:tabs>
+        <w:ind w:left="2880" w:hanging="360"/>
+      </w:pPr>
+      <w:rPr>
+        <w:rFonts w:ascii="Wingdings" w:hAnsi="Wingdings" w:hint="default"/>
+        <w:sz w:val="20"/>
+      </w:rPr>
+    </w:lvl>
+    <w:lvl w:ilvl="4" w:tentative="1">
+      <w:start w:val="1"/>
+      <w:numFmt w:val="bullet"/>
+      <w:lvlText w:val=""/>
+      <w:lvlJc w:val="left"/>
+      <w:pPr>
+        <w:tabs>
+          <w:tab w:val="num" w:pos="3600"/>
+        </w:tabs>
+        <w:ind w:left="3600" w:hanging="360"/>
+      </w:pPr>
+      <w:rPr>
+        <w:rFonts w:ascii="Wingdings" w:hAnsi="Wingdings" w:hint="default"/>
+        <w:sz w:val="20"/>
+      </w:rPr>
+    </w:lvl>
+    <w:lvl w:ilvl="5" w:tentative="1">
+      <w:start w:val="1"/>
+      <w:numFmt w:val="bullet"/>
+      <w:lvlText w:val=""/>
+      <w:lvlJc w:val="left"/>
+      <w:pPr>
+        <w:tabs>
+          <w:tab w:val="num" w:pos="4320"/>
+        </w:tabs>
+        <w:ind w:left="4320" w:hanging="360"/>
+      </w:pPr>
+      <w:rPr>
+        <w:rFonts w:ascii="Wingdings" w:hAnsi="Wingdings" w:hint="default"/>
+        <w:sz w:val="20"/>
+      </w:rPr>
+    </w:lvl>
+    <w:lvl w:ilvl="6" w:tentative="1">
+      <w:start w:val="1"/>
+      <w:numFmt w:val="bullet"/>
+      <w:lvlText w:val=""/>
+      <w:lvlJc w:val="left"/>
+      <w:pPr>
+        <w:tabs>
+          <w:tab w:val="num" w:pos="5040"/>
+        </w:tabs>
+        <w:ind w:left="5040" w:hanging="360"/>
+      </w:pPr>
+      <w:rPr>
+        <w:rFonts w:ascii="Wingdings" w:hAnsi="Wingdings" w:hint="default"/>
+        <w:sz w:val="20"/>
+      </w:rPr>
+    </w:lvl>
+    <w:lvl w:ilvl="7" w:tentative="1">
+      <w:start w:val="1"/>
+      <w:numFmt w:val="bullet"/>
+      <w:lvlText w:val=""/>
+      <w:lvlJc w:val="left"/>
+      <w:pPr>
+        <w:tabs>
+          <w:tab w:val="num" w:pos="5760"/>
+        </w:tabs>
+        <w:ind w:left="5760" w:hanging="360"/>
+      </w:pPr>
+      <w:rPr>
+        <w:rFonts w:ascii="Wingdings" w:hAnsi="Wingdings" w:hint="default"/>
+        <w:sz w:val="20"/>
+      </w:rPr>
+    </w:lvl>
+    <w:lvl w:ilvl="8" w:tentative="1">
+      <w:start w:val="1"/>
+      <w:numFmt w:val="bullet"/>
+      <w:lvlText w:val=""/>
+      <w:lvlJc w:val="left"/>
+      <w:pPr>
+        <w:tabs>
+          <w:tab w:val="num" w:pos="6480"/>
+        </w:tabs>
+        <w:ind w:left="6480" w:hanging="360"/>
+      </w:pPr>
+      <w:rPr>
+        <w:rFonts w:ascii="Wingdings" w:hAnsi="Wingdings" w:hint="default"/>
+        <w:sz w:val="20"/>
+      </w:rPr>
+    </w:lvl>
+  </w:abstractNum>
+  <w:abstractNum w:abstractNumId="9" w15:restartNumberingAfterBreak="0">
     <w:nsid w:val="31012CDF"/>
     <w:multiLevelType w:val="hybridMultilevel"/>
     <w:tmpl w:val="4FDE6AEE"/>
@@ -611,13 +4291,765 @@
       <w:pPr>
         <w:ind w:left="6480" w:hanging="180"/>
       </w:pPr>
+    </w:lvl>
+  </w:abstractNum>
+  <w:abstractNum w:abstractNumId="10" w15:restartNumberingAfterBreak="0">
+    <w:nsid w:val="422432E9"/>
+    <w:multiLevelType w:val="multilevel"/>
+    <w:tmpl w:val="87F0A25E"/>
+    <w:lvl w:ilvl="0">
+      <w:start w:val="1"/>
+      <w:numFmt w:val="decimal"/>
+      <w:lvlText w:val="%1."/>
+      <w:lvlJc w:val="left"/>
+      <w:pPr>
+        <w:tabs>
+          <w:tab w:val="num" w:pos="720"/>
+        </w:tabs>
+        <w:ind w:left="720" w:hanging="360"/>
+      </w:pPr>
+    </w:lvl>
+    <w:lvl w:ilvl="1">
+      <w:start w:val="1"/>
+      <w:numFmt w:val="bullet"/>
+      <w:lvlText w:val="o"/>
+      <w:lvlJc w:val="left"/>
+      <w:pPr>
+        <w:tabs>
+          <w:tab w:val="num" w:pos="1440"/>
+        </w:tabs>
+        <w:ind w:left="1440" w:hanging="360"/>
+      </w:pPr>
+      <w:rPr>
+        <w:rFonts w:ascii="Courier New" w:hAnsi="Courier New" w:hint="default"/>
+        <w:sz w:val="20"/>
+      </w:rPr>
+    </w:lvl>
+    <w:lvl w:ilvl="2" w:tentative="1">
+      <w:start w:val="1"/>
+      <w:numFmt w:val="decimal"/>
+      <w:lvlText w:val="%3."/>
+      <w:lvlJc w:val="left"/>
+      <w:pPr>
+        <w:tabs>
+          <w:tab w:val="num" w:pos="2160"/>
+        </w:tabs>
+        <w:ind w:left="2160" w:hanging="360"/>
+      </w:pPr>
+    </w:lvl>
+    <w:lvl w:ilvl="3" w:tentative="1">
+      <w:start w:val="1"/>
+      <w:numFmt w:val="decimal"/>
+      <w:lvlText w:val="%4."/>
+      <w:lvlJc w:val="left"/>
+      <w:pPr>
+        <w:tabs>
+          <w:tab w:val="num" w:pos="2880"/>
+        </w:tabs>
+        <w:ind w:left="2880" w:hanging="360"/>
+      </w:pPr>
+    </w:lvl>
+    <w:lvl w:ilvl="4" w:tentative="1">
+      <w:start w:val="1"/>
+      <w:numFmt w:val="decimal"/>
+      <w:lvlText w:val="%5."/>
+      <w:lvlJc w:val="left"/>
+      <w:pPr>
+        <w:tabs>
+          <w:tab w:val="num" w:pos="3600"/>
+        </w:tabs>
+        <w:ind w:left="3600" w:hanging="360"/>
+      </w:pPr>
+    </w:lvl>
+    <w:lvl w:ilvl="5" w:tentative="1">
+      <w:start w:val="1"/>
+      <w:numFmt w:val="decimal"/>
+      <w:lvlText w:val="%6."/>
+      <w:lvlJc w:val="left"/>
+      <w:pPr>
+        <w:tabs>
+          <w:tab w:val="num" w:pos="4320"/>
+        </w:tabs>
+        <w:ind w:left="4320" w:hanging="360"/>
+      </w:pPr>
+    </w:lvl>
+    <w:lvl w:ilvl="6" w:tentative="1">
+      <w:start w:val="1"/>
+      <w:numFmt w:val="decimal"/>
+      <w:lvlText w:val="%7."/>
+      <w:lvlJc w:val="left"/>
+      <w:pPr>
+        <w:tabs>
+          <w:tab w:val="num" w:pos="5040"/>
+        </w:tabs>
+        <w:ind w:left="5040" w:hanging="360"/>
+      </w:pPr>
+    </w:lvl>
+    <w:lvl w:ilvl="7" w:tentative="1">
+      <w:start w:val="1"/>
+      <w:numFmt w:val="decimal"/>
+      <w:lvlText w:val="%8."/>
+      <w:lvlJc w:val="left"/>
+      <w:pPr>
+        <w:tabs>
+          <w:tab w:val="num" w:pos="5760"/>
+        </w:tabs>
+        <w:ind w:left="5760" w:hanging="360"/>
+      </w:pPr>
+    </w:lvl>
+    <w:lvl w:ilvl="8" w:tentative="1">
+      <w:start w:val="1"/>
+      <w:numFmt w:val="decimal"/>
+      <w:lvlText w:val="%9."/>
+      <w:lvlJc w:val="left"/>
+      <w:pPr>
+        <w:tabs>
+          <w:tab w:val="num" w:pos="6480"/>
+        </w:tabs>
+        <w:ind w:left="6480" w:hanging="360"/>
+      </w:pPr>
+    </w:lvl>
+  </w:abstractNum>
+  <w:abstractNum w:abstractNumId="11" w15:restartNumberingAfterBreak="0">
+    <w:nsid w:val="4F9B3CAE"/>
+    <w:multiLevelType w:val="multilevel"/>
+    <w:tmpl w:val="3B185DF8"/>
+    <w:lvl w:ilvl="0">
+      <w:start w:val="1"/>
+      <w:numFmt w:val="bullet"/>
+      <w:lvlText w:val=""/>
+      <w:lvlJc w:val="left"/>
+      <w:pPr>
+        <w:tabs>
+          <w:tab w:val="num" w:pos="720"/>
+        </w:tabs>
+        <w:ind w:left="720" w:hanging="360"/>
+      </w:pPr>
+      <w:rPr>
+        <w:rFonts w:ascii="Symbol" w:hAnsi="Symbol" w:hint="default"/>
+        <w:sz w:val="20"/>
+      </w:rPr>
+    </w:lvl>
+    <w:lvl w:ilvl="1" w:tentative="1">
+      <w:start w:val="1"/>
+      <w:numFmt w:val="bullet"/>
+      <w:lvlText w:val="o"/>
+      <w:lvlJc w:val="left"/>
+      <w:pPr>
+        <w:tabs>
+          <w:tab w:val="num" w:pos="1440"/>
+        </w:tabs>
+        <w:ind w:left="1440" w:hanging="360"/>
+      </w:pPr>
+      <w:rPr>
+        <w:rFonts w:ascii="Courier New" w:hAnsi="Courier New" w:hint="default"/>
+        <w:sz w:val="20"/>
+      </w:rPr>
+    </w:lvl>
+    <w:lvl w:ilvl="2" w:tentative="1">
+      <w:start w:val="1"/>
+      <w:numFmt w:val="bullet"/>
+      <w:lvlText w:val=""/>
+      <w:lvlJc w:val="left"/>
+      <w:pPr>
+        <w:tabs>
+          <w:tab w:val="num" w:pos="2160"/>
+        </w:tabs>
+        <w:ind w:left="2160" w:hanging="360"/>
+      </w:pPr>
+      <w:rPr>
+        <w:rFonts w:ascii="Wingdings" w:hAnsi="Wingdings" w:hint="default"/>
+        <w:sz w:val="20"/>
+      </w:rPr>
+    </w:lvl>
+    <w:lvl w:ilvl="3" w:tentative="1">
+      <w:start w:val="1"/>
+      <w:numFmt w:val="bullet"/>
+      <w:lvlText w:val=""/>
+      <w:lvlJc w:val="left"/>
+      <w:pPr>
+        <w:tabs>
+          <w:tab w:val="num" w:pos="2880"/>
+        </w:tabs>
+        <w:ind w:left="2880" w:hanging="360"/>
+      </w:pPr>
+      <w:rPr>
+        <w:rFonts w:ascii="Wingdings" w:hAnsi="Wingdings" w:hint="default"/>
+        <w:sz w:val="20"/>
+      </w:rPr>
+    </w:lvl>
+    <w:lvl w:ilvl="4" w:tentative="1">
+      <w:start w:val="1"/>
+      <w:numFmt w:val="bullet"/>
+      <w:lvlText w:val=""/>
+      <w:lvlJc w:val="left"/>
+      <w:pPr>
+        <w:tabs>
+          <w:tab w:val="num" w:pos="3600"/>
+        </w:tabs>
+        <w:ind w:left="3600" w:hanging="360"/>
+      </w:pPr>
+      <w:rPr>
+        <w:rFonts w:ascii="Wingdings" w:hAnsi="Wingdings" w:hint="default"/>
+        <w:sz w:val="20"/>
+      </w:rPr>
+    </w:lvl>
+    <w:lvl w:ilvl="5" w:tentative="1">
+      <w:start w:val="1"/>
+      <w:numFmt w:val="bullet"/>
+      <w:lvlText w:val=""/>
+      <w:lvlJc w:val="left"/>
+      <w:pPr>
+        <w:tabs>
+          <w:tab w:val="num" w:pos="4320"/>
+        </w:tabs>
+        <w:ind w:left="4320" w:hanging="360"/>
+      </w:pPr>
+      <w:rPr>
+        <w:rFonts w:ascii="Wingdings" w:hAnsi="Wingdings" w:hint="default"/>
+        <w:sz w:val="20"/>
+      </w:rPr>
+    </w:lvl>
+    <w:lvl w:ilvl="6" w:tentative="1">
+      <w:start w:val="1"/>
+      <w:numFmt w:val="bullet"/>
+      <w:lvlText w:val=""/>
+      <w:lvlJc w:val="left"/>
+      <w:pPr>
+        <w:tabs>
+          <w:tab w:val="num" w:pos="5040"/>
+        </w:tabs>
+        <w:ind w:left="5040" w:hanging="360"/>
+      </w:pPr>
+      <w:rPr>
+        <w:rFonts w:ascii="Wingdings" w:hAnsi="Wingdings" w:hint="default"/>
+        <w:sz w:val="20"/>
+      </w:rPr>
+    </w:lvl>
+    <w:lvl w:ilvl="7" w:tentative="1">
+      <w:start w:val="1"/>
+      <w:numFmt w:val="bullet"/>
+      <w:lvlText w:val=""/>
+      <w:lvlJc w:val="left"/>
+      <w:pPr>
+        <w:tabs>
+          <w:tab w:val="num" w:pos="5760"/>
+        </w:tabs>
+        <w:ind w:left="5760" w:hanging="360"/>
+      </w:pPr>
+      <w:rPr>
+        <w:rFonts w:ascii="Wingdings" w:hAnsi="Wingdings" w:hint="default"/>
+        <w:sz w:val="20"/>
+      </w:rPr>
+    </w:lvl>
+    <w:lvl w:ilvl="8" w:tentative="1">
+      <w:start w:val="1"/>
+      <w:numFmt w:val="bullet"/>
+      <w:lvlText w:val=""/>
+      <w:lvlJc w:val="left"/>
+      <w:pPr>
+        <w:tabs>
+          <w:tab w:val="num" w:pos="6480"/>
+        </w:tabs>
+        <w:ind w:left="6480" w:hanging="360"/>
+      </w:pPr>
+      <w:rPr>
+        <w:rFonts w:ascii="Wingdings" w:hAnsi="Wingdings" w:hint="default"/>
+        <w:sz w:val="20"/>
+      </w:rPr>
+    </w:lvl>
+  </w:abstractNum>
+  <w:abstractNum w:abstractNumId="12" w15:restartNumberingAfterBreak="0">
+    <w:nsid w:val="63D650C0"/>
+    <w:multiLevelType w:val="multilevel"/>
+    <w:tmpl w:val="3AB0EB72"/>
+    <w:lvl w:ilvl="0">
+      <w:start w:val="1"/>
+      <w:numFmt w:val="bullet"/>
+      <w:lvlText w:val=""/>
+      <w:lvlJc w:val="left"/>
+      <w:pPr>
+        <w:tabs>
+          <w:tab w:val="num" w:pos="720"/>
+        </w:tabs>
+        <w:ind w:left="720" w:hanging="360"/>
+      </w:pPr>
+      <w:rPr>
+        <w:rFonts w:ascii="Symbol" w:hAnsi="Symbol" w:hint="default"/>
+        <w:sz w:val="20"/>
+      </w:rPr>
+    </w:lvl>
+    <w:lvl w:ilvl="1" w:tentative="1">
+      <w:start w:val="1"/>
+      <w:numFmt w:val="bullet"/>
+      <w:lvlText w:val="o"/>
+      <w:lvlJc w:val="left"/>
+      <w:pPr>
+        <w:tabs>
+          <w:tab w:val="num" w:pos="1440"/>
+        </w:tabs>
+        <w:ind w:left="1440" w:hanging="360"/>
+      </w:pPr>
+      <w:rPr>
+        <w:rFonts w:ascii="Courier New" w:hAnsi="Courier New" w:hint="default"/>
+        <w:sz w:val="20"/>
+      </w:rPr>
+    </w:lvl>
+    <w:lvl w:ilvl="2" w:tentative="1">
+      <w:start w:val="1"/>
+      <w:numFmt w:val="bullet"/>
+      <w:lvlText w:val=""/>
+      <w:lvlJc w:val="left"/>
+      <w:pPr>
+        <w:tabs>
+          <w:tab w:val="num" w:pos="2160"/>
+        </w:tabs>
+        <w:ind w:left="2160" w:hanging="360"/>
+      </w:pPr>
+      <w:rPr>
+        <w:rFonts w:ascii="Wingdings" w:hAnsi="Wingdings" w:hint="default"/>
+        <w:sz w:val="20"/>
+      </w:rPr>
+    </w:lvl>
+    <w:lvl w:ilvl="3" w:tentative="1">
+      <w:start w:val="1"/>
+      <w:numFmt w:val="bullet"/>
+      <w:lvlText w:val=""/>
+      <w:lvlJc w:val="left"/>
+      <w:pPr>
+        <w:tabs>
+          <w:tab w:val="num" w:pos="2880"/>
+        </w:tabs>
+        <w:ind w:left="2880" w:hanging="360"/>
+      </w:pPr>
+      <w:rPr>
+        <w:rFonts w:ascii="Wingdings" w:hAnsi="Wingdings" w:hint="default"/>
+        <w:sz w:val="20"/>
+      </w:rPr>
+    </w:lvl>
+    <w:lvl w:ilvl="4" w:tentative="1">
+      <w:start w:val="1"/>
+      <w:numFmt w:val="bullet"/>
+      <w:lvlText w:val=""/>
+      <w:lvlJc w:val="left"/>
+      <w:pPr>
+        <w:tabs>
+          <w:tab w:val="num" w:pos="3600"/>
+        </w:tabs>
+        <w:ind w:left="3600" w:hanging="360"/>
+      </w:pPr>
+      <w:rPr>
+        <w:rFonts w:ascii="Wingdings" w:hAnsi="Wingdings" w:hint="default"/>
+        <w:sz w:val="20"/>
+      </w:rPr>
+    </w:lvl>
+    <w:lvl w:ilvl="5" w:tentative="1">
+      <w:start w:val="1"/>
+      <w:numFmt w:val="bullet"/>
+      <w:lvlText w:val=""/>
+      <w:lvlJc w:val="left"/>
+      <w:pPr>
+        <w:tabs>
+          <w:tab w:val="num" w:pos="4320"/>
+        </w:tabs>
+        <w:ind w:left="4320" w:hanging="360"/>
+      </w:pPr>
+      <w:rPr>
+        <w:rFonts w:ascii="Wingdings" w:hAnsi="Wingdings" w:hint="default"/>
+        <w:sz w:val="20"/>
+      </w:rPr>
+    </w:lvl>
+    <w:lvl w:ilvl="6" w:tentative="1">
+      <w:start w:val="1"/>
+      <w:numFmt w:val="bullet"/>
+      <w:lvlText w:val=""/>
+      <w:lvlJc w:val="left"/>
+      <w:pPr>
+        <w:tabs>
+          <w:tab w:val="num" w:pos="5040"/>
+        </w:tabs>
+        <w:ind w:left="5040" w:hanging="360"/>
+      </w:pPr>
+      <w:rPr>
+        <w:rFonts w:ascii="Wingdings" w:hAnsi="Wingdings" w:hint="default"/>
+        <w:sz w:val="20"/>
+      </w:rPr>
+    </w:lvl>
+    <w:lvl w:ilvl="7" w:tentative="1">
+      <w:start w:val="1"/>
+      <w:numFmt w:val="bullet"/>
+      <w:lvlText w:val=""/>
+      <w:lvlJc w:val="left"/>
+      <w:pPr>
+        <w:tabs>
+          <w:tab w:val="num" w:pos="5760"/>
+        </w:tabs>
+        <w:ind w:left="5760" w:hanging="360"/>
+      </w:pPr>
+      <w:rPr>
+        <w:rFonts w:ascii="Wingdings" w:hAnsi="Wingdings" w:hint="default"/>
+        <w:sz w:val="20"/>
+      </w:rPr>
+    </w:lvl>
+    <w:lvl w:ilvl="8" w:tentative="1">
+      <w:start w:val="1"/>
+      <w:numFmt w:val="bullet"/>
+      <w:lvlText w:val=""/>
+      <w:lvlJc w:val="left"/>
+      <w:pPr>
+        <w:tabs>
+          <w:tab w:val="num" w:pos="6480"/>
+        </w:tabs>
+        <w:ind w:left="6480" w:hanging="360"/>
+      </w:pPr>
+      <w:rPr>
+        <w:rFonts w:ascii="Wingdings" w:hAnsi="Wingdings" w:hint="default"/>
+        <w:sz w:val="20"/>
+      </w:rPr>
+    </w:lvl>
+  </w:abstractNum>
+  <w:abstractNum w:abstractNumId="13" w15:restartNumberingAfterBreak="0">
+    <w:nsid w:val="6C3D1E91"/>
+    <w:multiLevelType w:val="multilevel"/>
+    <w:tmpl w:val="A52AD072"/>
+    <w:lvl w:ilvl="0">
+      <w:start w:val="1"/>
+      <w:numFmt w:val="bullet"/>
+      <w:lvlText w:val=""/>
+      <w:lvlJc w:val="left"/>
+      <w:pPr>
+        <w:tabs>
+          <w:tab w:val="num" w:pos="720"/>
+        </w:tabs>
+        <w:ind w:left="720" w:hanging="360"/>
+      </w:pPr>
+      <w:rPr>
+        <w:rFonts w:ascii="Symbol" w:hAnsi="Symbol" w:hint="default"/>
+        <w:sz w:val="20"/>
+      </w:rPr>
+    </w:lvl>
+    <w:lvl w:ilvl="1" w:tentative="1">
+      <w:start w:val="1"/>
+      <w:numFmt w:val="bullet"/>
+      <w:lvlText w:val="o"/>
+      <w:lvlJc w:val="left"/>
+      <w:pPr>
+        <w:tabs>
+          <w:tab w:val="num" w:pos="1440"/>
+        </w:tabs>
+        <w:ind w:left="1440" w:hanging="360"/>
+      </w:pPr>
+      <w:rPr>
+        <w:rFonts w:ascii="Courier New" w:hAnsi="Courier New" w:hint="default"/>
+        <w:sz w:val="20"/>
+      </w:rPr>
+    </w:lvl>
+    <w:lvl w:ilvl="2" w:tentative="1">
+      <w:start w:val="1"/>
+      <w:numFmt w:val="bullet"/>
+      <w:lvlText w:val=""/>
+      <w:lvlJc w:val="left"/>
+      <w:pPr>
+        <w:tabs>
+          <w:tab w:val="num" w:pos="2160"/>
+        </w:tabs>
+        <w:ind w:left="2160" w:hanging="360"/>
+      </w:pPr>
+      <w:rPr>
+        <w:rFonts w:ascii="Wingdings" w:hAnsi="Wingdings" w:hint="default"/>
+        <w:sz w:val="20"/>
+      </w:rPr>
+    </w:lvl>
+    <w:lvl w:ilvl="3" w:tentative="1">
+      <w:start w:val="1"/>
+      <w:numFmt w:val="bullet"/>
+      <w:lvlText w:val=""/>
+      <w:lvlJc w:val="left"/>
+      <w:pPr>
+        <w:tabs>
+          <w:tab w:val="num" w:pos="2880"/>
+        </w:tabs>
+        <w:ind w:left="2880" w:hanging="360"/>
+      </w:pPr>
+      <w:rPr>
+        <w:rFonts w:ascii="Wingdings" w:hAnsi="Wingdings" w:hint="default"/>
+        <w:sz w:val="20"/>
+      </w:rPr>
+    </w:lvl>
+    <w:lvl w:ilvl="4" w:tentative="1">
+      <w:start w:val="1"/>
+      <w:numFmt w:val="bullet"/>
+      <w:lvlText w:val=""/>
+      <w:lvlJc w:val="left"/>
+      <w:pPr>
+        <w:tabs>
+          <w:tab w:val="num" w:pos="3600"/>
+        </w:tabs>
+        <w:ind w:left="3600" w:hanging="360"/>
+      </w:pPr>
+      <w:rPr>
+        <w:rFonts w:ascii="Wingdings" w:hAnsi="Wingdings" w:hint="default"/>
+        <w:sz w:val="20"/>
+      </w:rPr>
+    </w:lvl>
+    <w:lvl w:ilvl="5" w:tentative="1">
+      <w:start w:val="1"/>
+      <w:numFmt w:val="bullet"/>
+      <w:lvlText w:val=""/>
+      <w:lvlJc w:val="left"/>
+      <w:pPr>
+        <w:tabs>
+          <w:tab w:val="num" w:pos="4320"/>
+        </w:tabs>
+        <w:ind w:left="4320" w:hanging="360"/>
+      </w:pPr>
+      <w:rPr>
+        <w:rFonts w:ascii="Wingdings" w:hAnsi="Wingdings" w:hint="default"/>
+        <w:sz w:val="20"/>
+      </w:rPr>
+    </w:lvl>
+    <w:lvl w:ilvl="6" w:tentative="1">
+      <w:start w:val="1"/>
+      <w:numFmt w:val="bullet"/>
+      <w:lvlText w:val=""/>
+      <w:lvlJc w:val="left"/>
+      <w:pPr>
+        <w:tabs>
+          <w:tab w:val="num" w:pos="5040"/>
+        </w:tabs>
+        <w:ind w:left="5040" w:hanging="360"/>
+      </w:pPr>
+      <w:rPr>
+        <w:rFonts w:ascii="Wingdings" w:hAnsi="Wingdings" w:hint="default"/>
+        <w:sz w:val="20"/>
+      </w:rPr>
+    </w:lvl>
+    <w:lvl w:ilvl="7" w:tentative="1">
+      <w:start w:val="1"/>
+      <w:numFmt w:val="bullet"/>
+      <w:lvlText w:val=""/>
+      <w:lvlJc w:val="left"/>
+      <w:pPr>
+        <w:tabs>
+          <w:tab w:val="num" w:pos="5760"/>
+        </w:tabs>
+        <w:ind w:left="5760" w:hanging="360"/>
+      </w:pPr>
+      <w:rPr>
+        <w:rFonts w:ascii="Wingdings" w:hAnsi="Wingdings" w:hint="default"/>
+        <w:sz w:val="20"/>
+      </w:rPr>
+    </w:lvl>
+    <w:lvl w:ilvl="8" w:tentative="1">
+      <w:start w:val="1"/>
+      <w:numFmt w:val="bullet"/>
+      <w:lvlText w:val=""/>
+      <w:lvlJc w:val="left"/>
+      <w:pPr>
+        <w:tabs>
+          <w:tab w:val="num" w:pos="6480"/>
+        </w:tabs>
+        <w:ind w:left="6480" w:hanging="360"/>
+      </w:pPr>
+      <w:rPr>
+        <w:rFonts w:ascii="Wingdings" w:hAnsi="Wingdings" w:hint="default"/>
+        <w:sz w:val="20"/>
+      </w:rPr>
+    </w:lvl>
+  </w:abstractNum>
+  <w:abstractNum w:abstractNumId="14" w15:restartNumberingAfterBreak="0">
+    <w:nsid w:val="7993547D"/>
+    <w:multiLevelType w:val="multilevel"/>
+    <w:tmpl w:val="21645580"/>
+    <w:lvl w:ilvl="0">
+      <w:start w:val="1"/>
+      <w:numFmt w:val="bullet"/>
+      <w:lvlText w:val=""/>
+      <w:lvlJc w:val="left"/>
+      <w:pPr>
+        <w:tabs>
+          <w:tab w:val="num" w:pos="720"/>
+        </w:tabs>
+        <w:ind w:left="720" w:hanging="360"/>
+      </w:pPr>
+      <w:rPr>
+        <w:rFonts w:ascii="Symbol" w:hAnsi="Symbol" w:hint="default"/>
+        <w:sz w:val="20"/>
+      </w:rPr>
+    </w:lvl>
+    <w:lvl w:ilvl="1" w:tentative="1">
+      <w:start w:val="1"/>
+      <w:numFmt w:val="bullet"/>
+      <w:lvlText w:val="o"/>
+      <w:lvlJc w:val="left"/>
+      <w:pPr>
+        <w:tabs>
+          <w:tab w:val="num" w:pos="1440"/>
+        </w:tabs>
+        <w:ind w:left="1440" w:hanging="360"/>
+      </w:pPr>
+      <w:rPr>
+        <w:rFonts w:ascii="Courier New" w:hAnsi="Courier New" w:hint="default"/>
+        <w:sz w:val="20"/>
+      </w:rPr>
+    </w:lvl>
+    <w:lvl w:ilvl="2" w:tentative="1">
+      <w:start w:val="1"/>
+      <w:numFmt w:val="bullet"/>
+      <w:lvlText w:val=""/>
+      <w:lvlJc w:val="left"/>
+      <w:pPr>
+        <w:tabs>
+          <w:tab w:val="num" w:pos="2160"/>
+        </w:tabs>
+        <w:ind w:left="2160" w:hanging="360"/>
+      </w:pPr>
+      <w:rPr>
+        <w:rFonts w:ascii="Wingdings" w:hAnsi="Wingdings" w:hint="default"/>
+        <w:sz w:val="20"/>
+      </w:rPr>
+    </w:lvl>
+    <w:lvl w:ilvl="3" w:tentative="1">
+      <w:start w:val="1"/>
+      <w:numFmt w:val="bullet"/>
+      <w:lvlText w:val=""/>
+      <w:lvlJc w:val="left"/>
+      <w:pPr>
+        <w:tabs>
+          <w:tab w:val="num" w:pos="2880"/>
+        </w:tabs>
+        <w:ind w:left="2880" w:hanging="360"/>
+      </w:pPr>
+      <w:rPr>
+        <w:rFonts w:ascii="Wingdings" w:hAnsi="Wingdings" w:hint="default"/>
+        <w:sz w:val="20"/>
+      </w:rPr>
+    </w:lvl>
+    <w:lvl w:ilvl="4" w:tentative="1">
+      <w:start w:val="1"/>
+      <w:numFmt w:val="bullet"/>
+      <w:lvlText w:val=""/>
+      <w:lvlJc w:val="left"/>
+      <w:pPr>
+        <w:tabs>
+          <w:tab w:val="num" w:pos="3600"/>
+        </w:tabs>
+        <w:ind w:left="3600" w:hanging="360"/>
+      </w:pPr>
+      <w:rPr>
+        <w:rFonts w:ascii="Wingdings" w:hAnsi="Wingdings" w:hint="default"/>
+        <w:sz w:val="20"/>
+      </w:rPr>
+    </w:lvl>
+    <w:lvl w:ilvl="5" w:tentative="1">
+      <w:start w:val="1"/>
+      <w:numFmt w:val="bullet"/>
+      <w:lvlText w:val=""/>
+      <w:lvlJc w:val="left"/>
+      <w:pPr>
+        <w:tabs>
+          <w:tab w:val="num" w:pos="4320"/>
+        </w:tabs>
+        <w:ind w:left="4320" w:hanging="360"/>
+      </w:pPr>
+      <w:rPr>
+        <w:rFonts w:ascii="Wingdings" w:hAnsi="Wingdings" w:hint="default"/>
+        <w:sz w:val="20"/>
+      </w:rPr>
+    </w:lvl>
+    <w:lvl w:ilvl="6" w:tentative="1">
+      <w:start w:val="1"/>
+      <w:numFmt w:val="bullet"/>
+      <w:lvlText w:val=""/>
+      <w:lvlJc w:val="left"/>
+      <w:pPr>
+        <w:tabs>
+          <w:tab w:val="num" w:pos="5040"/>
+        </w:tabs>
+        <w:ind w:left="5040" w:hanging="360"/>
+      </w:pPr>
+      <w:rPr>
+        <w:rFonts w:ascii="Wingdings" w:hAnsi="Wingdings" w:hint="default"/>
+        <w:sz w:val="20"/>
+      </w:rPr>
+    </w:lvl>
+    <w:lvl w:ilvl="7" w:tentative="1">
+      <w:start w:val="1"/>
+      <w:numFmt w:val="bullet"/>
+      <w:lvlText w:val=""/>
+      <w:lvlJc w:val="left"/>
+      <w:pPr>
+        <w:tabs>
+          <w:tab w:val="num" w:pos="5760"/>
+        </w:tabs>
+        <w:ind w:left="5760" w:hanging="360"/>
+      </w:pPr>
+      <w:rPr>
+        <w:rFonts w:ascii="Wingdings" w:hAnsi="Wingdings" w:hint="default"/>
+        <w:sz w:val="20"/>
+      </w:rPr>
+    </w:lvl>
+    <w:lvl w:ilvl="8" w:tentative="1">
+      <w:start w:val="1"/>
+      <w:numFmt w:val="bullet"/>
+      <w:lvlText w:val=""/>
+      <w:lvlJc w:val="left"/>
+      <w:pPr>
+        <w:tabs>
+          <w:tab w:val="num" w:pos="6480"/>
+        </w:tabs>
+        <w:ind w:left="6480" w:hanging="360"/>
+      </w:pPr>
+      <w:rPr>
+        <w:rFonts w:ascii="Wingdings" w:hAnsi="Wingdings" w:hint="default"/>
+        <w:sz w:val="20"/>
+      </w:rPr>
     </w:lvl>
   </w:abstractNum>
   <w:num w:numId="1">
     <w:abstractNumId w:val="0"/>
   </w:num>
   <w:num w:numId="2">
+    <w:abstractNumId w:val="9"/>
+  </w:num>
+  <w:num w:numId="3">
+    <w:abstractNumId w:val="10"/>
+  </w:num>
+  <w:num w:numId="4">
+    <w:abstractNumId w:val="11"/>
+  </w:num>
+  <w:num w:numId="5">
+    <w:abstractNumId w:val="6"/>
+  </w:num>
+  <w:num w:numId="6">
+    <w:abstractNumId w:val="2"/>
+  </w:num>
+  <w:num w:numId="7">
+    <w:abstractNumId w:val="5"/>
+  </w:num>
+  <w:num w:numId="8">
+    <w:abstractNumId w:val="7"/>
+  </w:num>
+  <w:num w:numId="9">
+    <w:abstractNumId w:val="4"/>
+  </w:num>
+  <w:num w:numId="10">
     <w:abstractNumId w:val="1"/>
+  </w:num>
+  <w:num w:numId="11">
+    <w:abstractNumId w:val="12"/>
+  </w:num>
+  <w:num w:numId="12">
+    <w:abstractNumId w:val="14"/>
+  </w:num>
+  <w:num w:numId="13">
+    <w:abstractNumId w:val="8"/>
+  </w:num>
+  <w:num w:numId="14">
+    <w:abstractNumId w:val="13"/>
+  </w:num>
+  <w:num w:numId="15">
+    <w:abstractNumId w:val="3"/>
   </w:num>
 </w:numbering>
 </file>
@@ -1021,6 +5453,70 @@
     <w:name w:val="Normal"/>
     <w:qFormat/>
   </w:style>
+  <w:style w:type="paragraph" w:styleId="Heading1">
+    <w:name w:val="heading 1"/>
+    <w:basedOn w:val="Normal"/>
+    <w:next w:val="Normal"/>
+    <w:link w:val="Heading1Char"/>
+    <w:uiPriority w:val="9"/>
+    <w:qFormat/>
+    <w:rsid w:val="005706CE"/>
+    <w:pPr>
+      <w:keepNext/>
+      <w:keepLines/>
+      <w:spacing w:before="240" w:after="0"/>
+      <w:outlineLvl w:val="0"/>
+    </w:pPr>
+    <w:rPr>
+      <w:rFonts w:asciiTheme="majorHAnsi" w:eastAsiaTheme="majorEastAsia" w:hAnsiTheme="majorHAnsi" w:cstheme="majorBidi"/>
+      <w:color w:val="2F5496" w:themeColor="accent1" w:themeShade="BF"/>
+      <w:sz w:val="32"/>
+      <w:szCs w:val="32"/>
+    </w:rPr>
+  </w:style>
+  <w:style w:type="paragraph" w:styleId="Heading2">
+    <w:name w:val="heading 2"/>
+    <w:basedOn w:val="Normal"/>
+    <w:next w:val="Normal"/>
+    <w:link w:val="Heading2Char"/>
+    <w:uiPriority w:val="9"/>
+    <w:semiHidden/>
+    <w:unhideWhenUsed/>
+    <w:qFormat/>
+    <w:rsid w:val="005706CE"/>
+    <w:pPr>
+      <w:keepNext/>
+      <w:keepLines/>
+      <w:spacing w:before="40" w:after="0"/>
+      <w:outlineLvl w:val="1"/>
+    </w:pPr>
+    <w:rPr>
+      <w:rFonts w:asciiTheme="majorHAnsi" w:eastAsiaTheme="majorEastAsia" w:hAnsiTheme="majorHAnsi" w:cstheme="majorBidi"/>
+      <w:color w:val="2F5496" w:themeColor="accent1" w:themeShade="BF"/>
+      <w:sz w:val="26"/>
+      <w:szCs w:val="26"/>
+    </w:rPr>
+  </w:style>
+  <w:style w:type="paragraph" w:styleId="Heading3">
+    <w:name w:val="heading 3"/>
+    <w:basedOn w:val="Normal"/>
+    <w:link w:val="Heading3Char"/>
+    <w:uiPriority w:val="9"/>
+    <w:qFormat/>
+    <w:rsid w:val="00827B2B"/>
+    <w:pPr>
+      <w:spacing w:before="100" w:beforeAutospacing="1" w:after="100" w:afterAutospacing="1" w:line="240" w:lineRule="auto"/>
+      <w:outlineLvl w:val="2"/>
+    </w:pPr>
+    <w:rPr>
+      <w:rFonts w:ascii="Times New Roman" w:eastAsia="Times New Roman" w:hAnsi="Times New Roman" w:cs="Times New Roman"/>
+      <w:b/>
+      <w:bCs/>
+      <w:sz w:val="27"/>
+      <w:szCs w:val="27"/>
+      <w:lang w:val="en-PK" w:eastAsia="en-PK"/>
+    </w:rPr>
+  </w:style>
   <w:style w:type="character" w:default="1" w:styleId="DefaultParagraphFont">
     <w:name w:val="Default Paragraph Font"/>
     <w:uiPriority w:val="1"/>
@@ -1058,6 +5554,187 @@
       <w:ind w:left="720"/>
       <w:contextualSpacing/>
     </w:pPr>
+  </w:style>
+  <w:style w:type="character" w:customStyle="1" w:styleId="Heading3Char">
+    <w:name w:val="Heading 3 Char"/>
+    <w:basedOn w:val="DefaultParagraphFont"/>
+    <w:link w:val="Heading3"/>
+    <w:uiPriority w:val="9"/>
+    <w:rsid w:val="00827B2B"/>
+    <w:rPr>
+      <w:rFonts w:ascii="Times New Roman" w:eastAsia="Times New Roman" w:hAnsi="Times New Roman" w:cs="Times New Roman"/>
+      <w:b/>
+      <w:bCs/>
+      <w:sz w:val="27"/>
+      <w:szCs w:val="27"/>
+      <w:lang w:val="en-PK" w:eastAsia="en-PK"/>
+    </w:rPr>
+  </w:style>
+  <w:style w:type="paragraph" w:styleId="NormalWeb">
+    <w:name w:val="Normal (Web)"/>
+    <w:basedOn w:val="Normal"/>
+    <w:uiPriority w:val="99"/>
+    <w:unhideWhenUsed/>
+    <w:rsid w:val="00827B2B"/>
+    <w:pPr>
+      <w:spacing w:before="100" w:beforeAutospacing="1" w:after="100" w:afterAutospacing="1" w:line="240" w:lineRule="auto"/>
+    </w:pPr>
+    <w:rPr>
+      <w:rFonts w:ascii="Times New Roman" w:eastAsia="Times New Roman" w:hAnsi="Times New Roman" w:cs="Times New Roman"/>
+      <w:sz w:val="24"/>
+      <w:szCs w:val="24"/>
+      <w:lang w:val="en-PK" w:eastAsia="en-PK"/>
+    </w:rPr>
+  </w:style>
+  <w:style w:type="character" w:styleId="Strong">
+    <w:name w:val="Strong"/>
+    <w:basedOn w:val="DefaultParagraphFont"/>
+    <w:uiPriority w:val="22"/>
+    <w:qFormat/>
+    <w:rsid w:val="00827B2B"/>
+    <w:rPr>
+      <w:b/>
+      <w:bCs/>
+    </w:rPr>
+  </w:style>
+  <w:style w:type="character" w:styleId="Emphasis">
+    <w:name w:val="Emphasis"/>
+    <w:basedOn w:val="DefaultParagraphFont"/>
+    <w:uiPriority w:val="20"/>
+    <w:qFormat/>
+    <w:rsid w:val="00827B2B"/>
+    <w:rPr>
+      <w:i/>
+      <w:iCs/>
+    </w:rPr>
+  </w:style>
+  <w:style w:type="paragraph" w:styleId="HTMLPreformatted">
+    <w:name w:val="HTML Preformatted"/>
+    <w:basedOn w:val="Normal"/>
+    <w:link w:val="HTMLPreformattedChar"/>
+    <w:uiPriority w:val="99"/>
+    <w:semiHidden/>
+    <w:unhideWhenUsed/>
+    <w:rsid w:val="00827B2B"/>
+    <w:pPr>
+      <w:tabs>
+        <w:tab w:val="left" w:pos="916"/>
+        <w:tab w:val="left" w:pos="1832"/>
+        <w:tab w:val="left" w:pos="2748"/>
+        <w:tab w:val="left" w:pos="3664"/>
+        <w:tab w:val="left" w:pos="4580"/>
+        <w:tab w:val="left" w:pos="5496"/>
+        <w:tab w:val="left" w:pos="6412"/>
+        <w:tab w:val="left" w:pos="7328"/>
+        <w:tab w:val="left" w:pos="8244"/>
+        <w:tab w:val="left" w:pos="9160"/>
+        <w:tab w:val="left" w:pos="10076"/>
+        <w:tab w:val="left" w:pos="10992"/>
+        <w:tab w:val="left" w:pos="11908"/>
+        <w:tab w:val="left" w:pos="12824"/>
+        <w:tab w:val="left" w:pos="13740"/>
+        <w:tab w:val="left" w:pos="14656"/>
+      </w:tabs>
+      <w:spacing w:after="0" w:line="240" w:lineRule="auto"/>
+    </w:pPr>
+    <w:rPr>
+      <w:rFonts w:ascii="Courier New" w:eastAsia="Times New Roman" w:hAnsi="Courier New" w:cs="Courier New"/>
+      <w:sz w:val="20"/>
+      <w:szCs w:val="20"/>
+      <w:lang w:val="en-PK" w:eastAsia="en-PK"/>
+    </w:rPr>
+  </w:style>
+  <w:style w:type="character" w:customStyle="1" w:styleId="HTMLPreformattedChar">
+    <w:name w:val="HTML Preformatted Char"/>
+    <w:basedOn w:val="DefaultParagraphFont"/>
+    <w:link w:val="HTMLPreformatted"/>
+    <w:uiPriority w:val="99"/>
+    <w:semiHidden/>
+    <w:rsid w:val="00827B2B"/>
+    <w:rPr>
+      <w:rFonts w:ascii="Courier New" w:eastAsia="Times New Roman" w:hAnsi="Courier New" w:cs="Courier New"/>
+      <w:sz w:val="20"/>
+      <w:szCs w:val="20"/>
+      <w:lang w:val="en-PK" w:eastAsia="en-PK"/>
+    </w:rPr>
+  </w:style>
+  <w:style w:type="character" w:styleId="HTMLCode">
+    <w:name w:val="HTML Code"/>
+    <w:basedOn w:val="DefaultParagraphFont"/>
+    <w:uiPriority w:val="99"/>
+    <w:semiHidden/>
+    <w:unhideWhenUsed/>
+    <w:rsid w:val="00827B2B"/>
+    <w:rPr>
+      <w:rFonts w:ascii="Courier New" w:eastAsia="Times New Roman" w:hAnsi="Courier New" w:cs="Courier New"/>
+      <w:sz w:val="20"/>
+      <w:szCs w:val="20"/>
+    </w:rPr>
+  </w:style>
+  <w:style w:type="character" w:customStyle="1" w:styleId="Heading1Char">
+    <w:name w:val="Heading 1 Char"/>
+    <w:basedOn w:val="DefaultParagraphFont"/>
+    <w:link w:val="Heading1"/>
+    <w:uiPriority w:val="9"/>
+    <w:rsid w:val="005706CE"/>
+    <w:rPr>
+      <w:rFonts w:asciiTheme="majorHAnsi" w:eastAsiaTheme="majorEastAsia" w:hAnsiTheme="majorHAnsi" w:cstheme="majorBidi"/>
+      <w:color w:val="2F5496" w:themeColor="accent1" w:themeShade="BF"/>
+      <w:sz w:val="32"/>
+      <w:szCs w:val="32"/>
+    </w:rPr>
+  </w:style>
+  <w:style w:type="character" w:customStyle="1" w:styleId="Heading2Char">
+    <w:name w:val="Heading 2 Char"/>
+    <w:basedOn w:val="DefaultParagraphFont"/>
+    <w:link w:val="Heading2"/>
+    <w:uiPriority w:val="9"/>
+    <w:semiHidden/>
+    <w:rsid w:val="005706CE"/>
+    <w:rPr>
+      <w:rFonts w:asciiTheme="majorHAnsi" w:eastAsiaTheme="majorEastAsia" w:hAnsiTheme="majorHAnsi" w:cstheme="majorBidi"/>
+      <w:color w:val="2F5496" w:themeColor="accent1" w:themeShade="BF"/>
+      <w:sz w:val="26"/>
+      <w:szCs w:val="26"/>
+    </w:rPr>
+  </w:style>
+  <w:style w:type="table" w:styleId="TableGrid">
+    <w:name w:val="Table Grid"/>
+    <w:basedOn w:val="TableNormal"/>
+    <w:uiPriority w:val="39"/>
+    <w:rsid w:val="005706CE"/>
+    <w:pPr>
+      <w:spacing w:after="0" w:line="240" w:lineRule="auto"/>
+    </w:pPr>
+    <w:tblPr>
+      <w:tblBorders>
+        <w:top w:val="single" w:sz="4" w:space="0" w:color="auto"/>
+        <w:left w:val="single" w:sz="4" w:space="0" w:color="auto"/>
+        <w:bottom w:val="single" w:sz="4" w:space="0" w:color="auto"/>
+        <w:right w:val="single" w:sz="4" w:space="0" w:color="auto"/>
+        <w:insideH w:val="single" w:sz="4" w:space="0" w:color="auto"/>
+        <w:insideV w:val="single" w:sz="4" w:space="0" w:color="auto"/>
+      </w:tblBorders>
+    </w:tblPr>
+  </w:style>
+  <w:style w:type="table" w:styleId="TableGridLight">
+    <w:name w:val="Grid Table Light"/>
+    <w:basedOn w:val="TableNormal"/>
+    <w:uiPriority w:val="40"/>
+    <w:rsid w:val="005706CE"/>
+    <w:pPr>
+      <w:spacing w:after="0" w:line="240" w:lineRule="auto"/>
+    </w:pPr>
+    <w:tblPr>
+      <w:tblBorders>
+        <w:top w:val="single" w:sz="4" w:space="0" w:color="BFBFBF" w:themeColor="background1" w:themeShade="BF"/>
+        <w:left w:val="single" w:sz="4" w:space="0" w:color="BFBFBF" w:themeColor="background1" w:themeShade="BF"/>
+        <w:bottom w:val="single" w:sz="4" w:space="0" w:color="BFBFBF" w:themeColor="background1" w:themeShade="BF"/>
+        <w:right w:val="single" w:sz="4" w:space="0" w:color="BFBFBF" w:themeColor="background1" w:themeShade="BF"/>
+        <w:insideH w:val="single" w:sz="4" w:space="0" w:color="BFBFBF" w:themeColor="background1" w:themeShade="BF"/>
+        <w:insideV w:val="single" w:sz="4" w:space="0" w:color="BFBFBF" w:themeColor="background1" w:themeShade="BF"/>
+      </w:tblBorders>
+    </w:tblPr>
   </w:style>
 </w:styles>
 </file>

</xml_diff>

<commit_message>
lates proper data for tunning
</commit_message>
<xml_diff>
--- a/docs/dataForTaining-chatBot/type of data.docx
+++ b/docs/dataForTaining-chatBot/type of data.docx
@@ -16,25 +16,7 @@
           <w:szCs w:val="24"/>
           <w:lang w:val="en-US"/>
         </w:rPr>
-        <w:t xml:space="preserve">Steps to perform on data before fine </w:t>
-      </w:r>
-      <w:proofErr w:type="spellStart"/>
-      <w:r>
-        <w:rPr>
-          <w:sz w:val="24"/>
-          <w:szCs w:val="24"/>
-          <w:lang w:val="en-US"/>
-        </w:rPr>
-        <w:t>tunning</w:t>
-      </w:r>
-      <w:proofErr w:type="spellEnd"/>
-      <w:r>
-        <w:rPr>
-          <w:sz w:val="24"/>
-          <w:szCs w:val="24"/>
-          <w:lang w:val="en-US"/>
-        </w:rPr>
-        <w:t>:</w:t>
+        <w:t>Steps to perform on data before fine tunning:</w:t>
       </w:r>
     </w:p>
     <w:p>
@@ -48,7 +30,7 @@
           <w:rFonts w:eastAsia="Times New Roman" w:cstheme="minorHAnsi"/>
           <w:sz w:val="24"/>
           <w:szCs w:val="24"/>
-          <w:lang w:val="en-PK" w:eastAsia="en-PK"/>
+          <w:lang w:eastAsia="en-PK"/>
         </w:rPr>
       </w:pPr>
       <w:r>
@@ -58,7 +40,7 @@
           <w:bCs/>
           <w:sz w:val="24"/>
           <w:szCs w:val="24"/>
-          <w:lang w:val="en-PK" w:eastAsia="en-PK"/>
+          <w:lang w:eastAsia="en-PK"/>
         </w:rPr>
         <w:t>Collect all datasets</w:t>
       </w:r>
@@ -67,7 +49,7 @@
           <w:rFonts w:eastAsia="Times New Roman" w:cstheme="minorHAnsi"/>
           <w:sz w:val="24"/>
           <w:szCs w:val="24"/>
-          <w:lang w:val="en-PK" w:eastAsia="en-PK"/>
+          <w:lang w:eastAsia="en-PK"/>
         </w:rPr>
         <w:br/>
         <w:t>Gather all judgments, laws, summaries, PDFs, scraped text, etc.</w:t>
@@ -84,7 +66,7 @@
           <w:rFonts w:eastAsia="Times New Roman" w:cstheme="minorHAnsi"/>
           <w:sz w:val="24"/>
           <w:szCs w:val="24"/>
-          <w:lang w:val="en-PK" w:eastAsia="en-PK"/>
+          <w:lang w:eastAsia="en-PK"/>
         </w:rPr>
       </w:pPr>
       <w:r>
@@ -94,7 +76,7 @@
           <w:bCs/>
           <w:sz w:val="24"/>
           <w:szCs w:val="24"/>
-          <w:lang w:val="en-PK" w:eastAsia="en-PK"/>
+          <w:lang w:eastAsia="en-PK"/>
         </w:rPr>
         <w:t>Convert to uniform text format</w:t>
       </w:r>
@@ -103,44 +85,24 @@
           <w:rFonts w:eastAsia="Times New Roman" w:cstheme="minorHAnsi"/>
           <w:sz w:val="24"/>
           <w:szCs w:val="24"/>
-          <w:lang w:val="en-PK" w:eastAsia="en-PK"/>
+          <w:lang w:eastAsia="en-PK"/>
         </w:rPr>
         <w:br/>
-        <w:t>Convert PDFs/HTML/</w:t>
-      </w:r>
-      <w:proofErr w:type="spellStart"/>
-      <w:r>
+        <w:t>Convert PDFs/HTML/DOCs → clean plain text (UTF-8).</w:t>
+      </w:r>
+    </w:p>
+    <w:p>
+      <w:pPr>
+        <w:numPr>
+          <w:ilvl w:val="0"/>
+          <w:numId w:val="3"/>
+        </w:numPr>
+        <w:spacing w:before="100" w:beforeAutospacing="1" w:after="100" w:afterAutospacing="1" w:line="240" w:lineRule="auto"/>
         <w:rPr>
           <w:rFonts w:eastAsia="Times New Roman" w:cstheme="minorHAnsi"/>
           <w:sz w:val="24"/>
           <w:szCs w:val="24"/>
-          <w:lang w:val="en-PK" w:eastAsia="en-PK"/>
-        </w:rPr>
-        <w:t>DOCs</w:t>
-      </w:r>
-      <w:proofErr w:type="spellEnd"/>
-      <w:r>
-        <w:rPr>
-          <w:rFonts w:eastAsia="Times New Roman" w:cstheme="minorHAnsi"/>
-          <w:sz w:val="24"/>
-          <w:szCs w:val="24"/>
-          <w:lang w:val="en-PK" w:eastAsia="en-PK"/>
-        </w:rPr>
-        <w:t xml:space="preserve"> → clean plain text (UTF-8).</w:t>
-      </w:r>
-    </w:p>
-    <w:p>
-      <w:pPr>
-        <w:numPr>
-          <w:ilvl w:val="0"/>
-          <w:numId w:val="3"/>
-        </w:numPr>
-        <w:spacing w:before="100" w:beforeAutospacing="1" w:after="100" w:afterAutospacing="1" w:line="240" w:lineRule="auto"/>
-        <w:rPr>
-          <w:rFonts w:eastAsia="Times New Roman" w:cstheme="minorHAnsi"/>
-          <w:sz w:val="24"/>
-          <w:szCs w:val="24"/>
-          <w:lang w:val="en-PK" w:eastAsia="en-PK"/>
+          <w:lang w:eastAsia="en-PK"/>
         </w:rPr>
       </w:pPr>
       <w:r>
@@ -150,7 +112,7 @@
           <w:bCs/>
           <w:sz w:val="24"/>
           <w:szCs w:val="24"/>
-          <w:lang w:val="en-PK" w:eastAsia="en-PK"/>
+          <w:lang w:eastAsia="en-PK"/>
         </w:rPr>
         <w:t>Clean the raw text</w:t>
       </w:r>
@@ -166,7 +128,7 @@
           <w:rFonts w:eastAsia="Times New Roman" w:cstheme="minorHAnsi"/>
           <w:sz w:val="24"/>
           <w:szCs w:val="24"/>
-          <w:lang w:val="en-PK" w:eastAsia="en-PK"/>
+          <w:lang w:eastAsia="en-PK"/>
         </w:rPr>
       </w:pPr>
       <w:r>
@@ -174,7 +136,7 @@
           <w:rFonts w:eastAsia="Times New Roman" w:cstheme="minorHAnsi"/>
           <w:sz w:val="24"/>
           <w:szCs w:val="24"/>
-          <w:lang w:val="en-PK" w:eastAsia="en-PK"/>
+          <w:lang w:eastAsia="en-PK"/>
         </w:rPr>
         <w:t>Remove headers/footers</w:t>
       </w:r>
@@ -190,7 +152,7 @@
           <w:rFonts w:eastAsia="Times New Roman" w:cstheme="minorHAnsi"/>
           <w:sz w:val="24"/>
           <w:szCs w:val="24"/>
-          <w:lang w:val="en-PK" w:eastAsia="en-PK"/>
+          <w:lang w:eastAsia="en-PK"/>
         </w:rPr>
       </w:pPr>
       <w:r>
@@ -198,7 +160,7 @@
           <w:rFonts w:eastAsia="Times New Roman" w:cstheme="minorHAnsi"/>
           <w:sz w:val="24"/>
           <w:szCs w:val="24"/>
-          <w:lang w:val="en-PK" w:eastAsia="en-PK"/>
+          <w:lang w:eastAsia="en-PK"/>
         </w:rPr>
         <w:t>Remove page numbers, dates, junk symbols</w:t>
       </w:r>
@@ -214,7 +176,7 @@
           <w:rFonts w:eastAsia="Times New Roman" w:cstheme="minorHAnsi"/>
           <w:sz w:val="24"/>
           <w:szCs w:val="24"/>
-          <w:lang w:val="en-PK" w:eastAsia="en-PK"/>
+          <w:lang w:eastAsia="en-PK"/>
         </w:rPr>
       </w:pPr>
       <w:r>
@@ -222,7 +184,7 @@
           <w:rFonts w:eastAsia="Times New Roman" w:cstheme="minorHAnsi"/>
           <w:sz w:val="24"/>
           <w:szCs w:val="24"/>
-          <w:lang w:val="en-PK" w:eastAsia="en-PK"/>
+          <w:lang w:eastAsia="en-PK"/>
         </w:rPr>
         <w:t>Fix spacing, line breaks</w:t>
       </w:r>
@@ -238,7 +200,7 @@
           <w:rFonts w:eastAsia="Times New Roman" w:cstheme="minorHAnsi"/>
           <w:sz w:val="24"/>
           <w:szCs w:val="24"/>
-          <w:lang w:val="en-PK" w:eastAsia="en-PK"/>
+          <w:lang w:eastAsia="en-PK"/>
         </w:rPr>
       </w:pPr>
       <w:r>
@@ -246,7 +208,7 @@
           <w:rFonts w:eastAsia="Times New Roman" w:cstheme="minorHAnsi"/>
           <w:sz w:val="24"/>
           <w:szCs w:val="24"/>
-          <w:lang w:val="en-PK" w:eastAsia="en-PK"/>
+          <w:lang w:eastAsia="en-PK"/>
         </w:rPr>
         <w:t>Remove duplicate cases</w:t>
       </w:r>
@@ -262,7 +224,7 @@
           <w:rFonts w:eastAsia="Times New Roman" w:cstheme="minorHAnsi"/>
           <w:sz w:val="24"/>
           <w:szCs w:val="24"/>
-          <w:lang w:val="en-PK" w:eastAsia="en-PK"/>
+          <w:lang w:eastAsia="en-PK"/>
         </w:rPr>
       </w:pPr>
       <w:r>
@@ -272,7 +234,7 @@
           <w:bCs/>
           <w:sz w:val="24"/>
           <w:szCs w:val="24"/>
-          <w:lang w:val="en-PK" w:eastAsia="en-PK"/>
+          <w:lang w:eastAsia="en-PK"/>
         </w:rPr>
         <w:t>Standardize structure</w:t>
       </w:r>
@@ -288,7 +250,7 @@
           <w:rFonts w:eastAsia="Times New Roman" w:cstheme="minorHAnsi"/>
           <w:sz w:val="24"/>
           <w:szCs w:val="24"/>
-          <w:lang w:val="en-PK" w:eastAsia="en-PK"/>
+          <w:lang w:eastAsia="en-PK"/>
         </w:rPr>
       </w:pPr>
       <w:r>
@@ -296,7 +258,7 @@
           <w:rFonts w:eastAsia="Times New Roman" w:cstheme="minorHAnsi"/>
           <w:sz w:val="24"/>
           <w:szCs w:val="24"/>
-          <w:lang w:val="en-PK" w:eastAsia="en-PK"/>
+          <w:lang w:eastAsia="en-PK"/>
         </w:rPr>
         <w:t xml:space="preserve">Extract and label sections (e.g., </w:t>
       </w:r>
@@ -307,7 +269,7 @@
           <w:iCs/>
           <w:sz w:val="24"/>
           <w:szCs w:val="24"/>
-          <w:lang w:val="en-PK" w:eastAsia="en-PK"/>
+          <w:lang w:eastAsia="en-PK"/>
         </w:rPr>
         <w:t>Facts, Issue, Arguments, Decision</w:t>
       </w:r>
@@ -316,7 +278,7 @@
           <w:rFonts w:eastAsia="Times New Roman" w:cstheme="minorHAnsi"/>
           <w:sz w:val="24"/>
           <w:szCs w:val="24"/>
-          <w:lang w:val="en-PK" w:eastAsia="en-PK"/>
+          <w:lang w:eastAsia="en-PK"/>
         </w:rPr>
         <w:t>)</w:t>
       </w:r>
@@ -332,7 +294,7 @@
           <w:rFonts w:eastAsia="Times New Roman" w:cstheme="minorHAnsi"/>
           <w:sz w:val="24"/>
           <w:szCs w:val="24"/>
-          <w:lang w:val="en-PK" w:eastAsia="en-PK"/>
+          <w:lang w:eastAsia="en-PK"/>
         </w:rPr>
       </w:pPr>
       <w:r>
@@ -340,7 +302,7 @@
           <w:rFonts w:eastAsia="Times New Roman" w:cstheme="minorHAnsi"/>
           <w:sz w:val="24"/>
           <w:szCs w:val="24"/>
-          <w:lang w:val="en-PK" w:eastAsia="en-PK"/>
+          <w:lang w:eastAsia="en-PK"/>
         </w:rPr>
         <w:t>Ensure every file follows the same structure.</w:t>
       </w:r>
@@ -356,7 +318,7 @@
           <w:rFonts w:eastAsia="Times New Roman" w:cstheme="minorHAnsi"/>
           <w:sz w:val="24"/>
           <w:szCs w:val="24"/>
-          <w:lang w:val="en-PK" w:eastAsia="en-PK"/>
+          <w:lang w:eastAsia="en-PK"/>
         </w:rPr>
       </w:pPr>
       <w:r>
@@ -366,7 +328,7 @@
           <w:bCs/>
           <w:sz w:val="24"/>
           <w:szCs w:val="24"/>
-          <w:lang w:val="en-PK" w:eastAsia="en-PK"/>
+          <w:lang w:eastAsia="en-PK"/>
         </w:rPr>
         <w:t>Normalize content</w:t>
       </w:r>
@@ -382,7 +344,7 @@
           <w:rFonts w:eastAsia="Times New Roman" w:cstheme="minorHAnsi"/>
           <w:sz w:val="24"/>
           <w:szCs w:val="24"/>
-          <w:lang w:val="en-PK" w:eastAsia="en-PK"/>
+          <w:lang w:eastAsia="en-PK"/>
         </w:rPr>
       </w:pPr>
       <w:r>
@@ -390,7 +352,7 @@
           <w:rFonts w:eastAsia="Times New Roman" w:cstheme="minorHAnsi"/>
           <w:sz w:val="24"/>
           <w:szCs w:val="24"/>
-          <w:lang w:val="en-PK" w:eastAsia="en-PK"/>
+          <w:lang w:eastAsia="en-PK"/>
         </w:rPr>
         <w:t>Standardize case names</w:t>
       </w:r>
@@ -406,7 +368,7 @@
           <w:rFonts w:eastAsia="Times New Roman" w:cstheme="minorHAnsi"/>
           <w:sz w:val="24"/>
           <w:szCs w:val="24"/>
-          <w:lang w:val="en-PK" w:eastAsia="en-PK"/>
+          <w:lang w:eastAsia="en-PK"/>
         </w:rPr>
       </w:pPr>
       <w:r>
@@ -414,7 +376,7 @@
           <w:rFonts w:eastAsia="Times New Roman" w:cstheme="minorHAnsi"/>
           <w:sz w:val="24"/>
           <w:szCs w:val="24"/>
-          <w:lang w:val="en-PK" w:eastAsia="en-PK"/>
+          <w:lang w:eastAsia="en-PK"/>
         </w:rPr>
         <w:t>Fix inconsistent punctuation</w:t>
       </w:r>
@@ -430,7 +392,7 @@
           <w:rFonts w:eastAsia="Times New Roman" w:cstheme="minorHAnsi"/>
           <w:sz w:val="24"/>
           <w:szCs w:val="24"/>
-          <w:lang w:val="en-PK" w:eastAsia="en-PK"/>
+          <w:lang w:eastAsia="en-PK"/>
         </w:rPr>
       </w:pPr>
       <w:r>
@@ -438,7 +400,7 @@
           <w:rFonts w:eastAsia="Times New Roman" w:cstheme="minorHAnsi"/>
           <w:sz w:val="24"/>
           <w:szCs w:val="24"/>
-          <w:lang w:val="en-PK" w:eastAsia="en-PK"/>
+          <w:lang w:eastAsia="en-PK"/>
         </w:rPr>
         <w:t>Normalize legal citations format</w:t>
       </w:r>
@@ -454,7 +416,7 @@
           <w:rFonts w:eastAsia="Times New Roman" w:cstheme="minorHAnsi"/>
           <w:sz w:val="24"/>
           <w:szCs w:val="24"/>
-          <w:lang w:val="en-PK" w:eastAsia="en-PK"/>
+          <w:lang w:eastAsia="en-PK"/>
         </w:rPr>
       </w:pPr>
       <w:r>
@@ -462,7 +424,7 @@
           <w:rFonts w:eastAsia="Times New Roman" w:cstheme="minorHAnsi"/>
           <w:sz w:val="24"/>
           <w:szCs w:val="24"/>
-          <w:lang w:val="en-PK" w:eastAsia="en-PK"/>
+          <w:lang w:eastAsia="en-PK"/>
         </w:rPr>
         <w:t>Standardize glossary terms</w:t>
       </w:r>
@@ -478,7 +440,7 @@
           <w:rFonts w:eastAsia="Times New Roman" w:cstheme="minorHAnsi"/>
           <w:sz w:val="24"/>
           <w:szCs w:val="24"/>
-          <w:lang w:val="en-PK" w:eastAsia="en-PK"/>
+          <w:lang w:eastAsia="en-PK"/>
         </w:rPr>
       </w:pPr>
       <w:r>
@@ -488,7 +450,7 @@
           <w:bCs/>
           <w:sz w:val="24"/>
           <w:szCs w:val="24"/>
-          <w:lang w:val="en-PK" w:eastAsia="en-PK"/>
+          <w:lang w:eastAsia="en-PK"/>
         </w:rPr>
         <w:t>Remove irrelevant content</w:t>
       </w:r>
@@ -504,7 +466,7 @@
           <w:rFonts w:eastAsia="Times New Roman" w:cstheme="minorHAnsi"/>
           <w:sz w:val="24"/>
           <w:szCs w:val="24"/>
-          <w:lang w:val="en-PK" w:eastAsia="en-PK"/>
+          <w:lang w:eastAsia="en-PK"/>
         </w:rPr>
       </w:pPr>
       <w:r>
@@ -512,7 +474,7 @@
           <w:rFonts w:eastAsia="Times New Roman" w:cstheme="minorHAnsi"/>
           <w:sz w:val="24"/>
           <w:szCs w:val="24"/>
-          <w:lang w:val="en-PK" w:eastAsia="en-PK"/>
+          <w:lang w:eastAsia="en-PK"/>
         </w:rPr>
         <w:t>Ads, website menus, copyright stamps</w:t>
       </w:r>
@@ -528,7 +490,7 @@
           <w:rFonts w:eastAsia="Times New Roman" w:cstheme="minorHAnsi"/>
           <w:sz w:val="24"/>
           <w:szCs w:val="24"/>
-          <w:lang w:val="en-PK" w:eastAsia="en-PK"/>
+          <w:lang w:eastAsia="en-PK"/>
         </w:rPr>
       </w:pPr>
       <w:r>
@@ -536,7 +498,7 @@
           <w:rFonts w:eastAsia="Times New Roman" w:cstheme="minorHAnsi"/>
           <w:sz w:val="24"/>
           <w:szCs w:val="24"/>
-          <w:lang w:val="en-PK" w:eastAsia="en-PK"/>
+          <w:lang w:eastAsia="en-PK"/>
         </w:rPr>
         <w:t>Unnecessary references</w:t>
       </w:r>
@@ -552,7 +514,7 @@
           <w:rFonts w:eastAsia="Times New Roman" w:cstheme="minorHAnsi"/>
           <w:sz w:val="24"/>
           <w:szCs w:val="24"/>
-          <w:lang w:val="en-PK" w:eastAsia="en-PK"/>
+          <w:lang w:eastAsia="en-PK"/>
         </w:rPr>
       </w:pPr>
       <w:r>
@@ -560,7 +522,7 @@
           <w:rFonts w:eastAsia="Times New Roman" w:cstheme="minorHAnsi"/>
           <w:sz w:val="24"/>
           <w:szCs w:val="24"/>
-          <w:lang w:val="en-PK" w:eastAsia="en-PK"/>
+          <w:lang w:eastAsia="en-PK"/>
         </w:rPr>
         <w:t>Boilerplate text</w:t>
       </w:r>
@@ -576,7 +538,7 @@
           <w:rFonts w:eastAsia="Times New Roman" w:cstheme="minorHAnsi"/>
           <w:sz w:val="24"/>
           <w:szCs w:val="24"/>
-          <w:lang w:val="en-PK" w:eastAsia="en-PK"/>
+          <w:lang w:eastAsia="en-PK"/>
         </w:rPr>
       </w:pPr>
       <w:r>
@@ -586,7 +548,7 @@
           <w:bCs/>
           <w:sz w:val="24"/>
           <w:szCs w:val="24"/>
-          <w:lang w:val="en-PK" w:eastAsia="en-PK"/>
+          <w:lang w:eastAsia="en-PK"/>
         </w:rPr>
         <w:t>Balance the dataset</w:t>
       </w:r>
@@ -595,7 +557,7 @@
           <w:rFonts w:eastAsia="Times New Roman" w:cstheme="minorHAnsi"/>
           <w:sz w:val="24"/>
           <w:szCs w:val="24"/>
-          <w:lang w:val="en-PK" w:eastAsia="en-PK"/>
+          <w:lang w:eastAsia="en-PK"/>
         </w:rPr>
         <w:br/>
         <w:t>Ensure you don’t have too many cases from one topic.</w:t>
@@ -612,7 +574,7 @@
           <w:rFonts w:eastAsia="Times New Roman" w:cstheme="minorHAnsi"/>
           <w:sz w:val="24"/>
           <w:szCs w:val="24"/>
-          <w:lang w:val="en-PK" w:eastAsia="en-PK"/>
+          <w:lang w:eastAsia="en-PK"/>
         </w:rPr>
       </w:pPr>
       <w:r>
@@ -622,7 +584,7 @@
           <w:bCs/>
           <w:sz w:val="24"/>
           <w:szCs w:val="24"/>
-          <w:lang w:val="en-PK" w:eastAsia="en-PK"/>
+          <w:lang w:eastAsia="en-PK"/>
         </w:rPr>
         <w:t>Prepare supervised instruction format</w:t>
       </w:r>
@@ -631,7 +593,7 @@
           <w:rFonts w:eastAsia="Times New Roman" w:cstheme="minorHAnsi"/>
           <w:sz w:val="24"/>
           <w:szCs w:val="24"/>
-          <w:lang w:val="en-PK" w:eastAsia="en-PK"/>
+          <w:lang w:eastAsia="en-PK"/>
         </w:rPr>
         <w:br/>
         <w:t>Convert each item to the format:</w:t>
@@ -667,7 +629,7 @@
           <w:rFonts w:eastAsia="Times New Roman" w:cstheme="minorHAnsi"/>
           <w:sz w:val="20"/>
           <w:szCs w:val="20"/>
-          <w:lang w:val="en-PK" w:eastAsia="en-PK"/>
+          <w:lang w:eastAsia="en-PK"/>
         </w:rPr>
       </w:pPr>
       <w:r>
@@ -675,7 +637,7 @@
           <w:rFonts w:eastAsia="Times New Roman" w:cstheme="minorHAnsi"/>
           <w:sz w:val="20"/>
           <w:szCs w:val="20"/>
-          <w:lang w:val="en-PK" w:eastAsia="en-PK"/>
+          <w:lang w:eastAsia="en-PK"/>
         </w:rPr>
         <w:t>{"instruction": "...", "input": "...", "output": "..."}</w:t>
       </w:r>
@@ -691,7 +653,7 @@
           <w:rFonts w:eastAsia="Times New Roman" w:cstheme="minorHAnsi"/>
           <w:sz w:val="24"/>
           <w:szCs w:val="24"/>
-          <w:lang w:val="en-PK" w:eastAsia="en-PK"/>
+          <w:lang w:eastAsia="en-PK"/>
         </w:rPr>
       </w:pPr>
       <w:r>
@@ -701,7 +663,7 @@
           <w:bCs/>
           <w:sz w:val="24"/>
           <w:szCs w:val="24"/>
-          <w:lang w:val="en-PK" w:eastAsia="en-PK"/>
+          <w:lang w:eastAsia="en-PK"/>
         </w:rPr>
         <w:t>Validate and test</w:t>
       </w:r>
@@ -717,7 +679,7 @@
           <w:rFonts w:eastAsia="Times New Roman" w:cstheme="minorHAnsi"/>
           <w:sz w:val="24"/>
           <w:szCs w:val="24"/>
-          <w:lang w:val="en-PK" w:eastAsia="en-PK"/>
+          <w:lang w:eastAsia="en-PK"/>
         </w:rPr>
       </w:pPr>
       <w:r>
@@ -725,7 +687,7 @@
           <w:rFonts w:eastAsia="Times New Roman" w:cstheme="minorHAnsi"/>
           <w:sz w:val="24"/>
           <w:szCs w:val="24"/>
-          <w:lang w:val="en-PK" w:eastAsia="en-PK"/>
+          <w:lang w:eastAsia="en-PK"/>
         </w:rPr>
         <w:t>Check for broken JSON</w:t>
       </w:r>
@@ -741,7 +703,7 @@
           <w:rFonts w:eastAsia="Times New Roman" w:cstheme="minorHAnsi"/>
           <w:sz w:val="24"/>
           <w:szCs w:val="24"/>
-          <w:lang w:val="en-PK" w:eastAsia="en-PK"/>
+          <w:lang w:eastAsia="en-PK"/>
         </w:rPr>
       </w:pPr>
       <w:r>
@@ -749,7 +711,7 @@
           <w:rFonts w:eastAsia="Times New Roman" w:cstheme="minorHAnsi"/>
           <w:sz w:val="24"/>
           <w:szCs w:val="24"/>
-          <w:lang w:val="en-PK" w:eastAsia="en-PK"/>
+          <w:lang w:eastAsia="en-PK"/>
         </w:rPr>
         <w:t>Remove extremely long outputs</w:t>
       </w:r>
@@ -765,7 +727,7 @@
           <w:rFonts w:ascii="Times New Roman" w:eastAsia="Times New Roman" w:hAnsi="Times New Roman" w:cs="Times New Roman"/>
           <w:sz w:val="24"/>
           <w:szCs w:val="24"/>
-          <w:lang w:val="en-PK" w:eastAsia="en-PK"/>
+          <w:lang w:eastAsia="en-PK"/>
         </w:rPr>
       </w:pPr>
       <w:r>
@@ -773,7 +735,7 @@
           <w:rFonts w:eastAsia="Times New Roman" w:cstheme="minorHAnsi"/>
           <w:sz w:val="24"/>
           <w:szCs w:val="24"/>
-          <w:lang w:val="en-PK" w:eastAsia="en-PK"/>
+          <w:lang w:eastAsia="en-PK"/>
         </w:rPr>
         <w:t>Ensure clear Q/A structur</w:t>
       </w:r>
@@ -782,7 +744,7 @@
           <w:rFonts w:ascii="Times New Roman" w:eastAsia="Times New Roman" w:hAnsi="Times New Roman" w:cs="Times New Roman"/>
           <w:sz w:val="24"/>
           <w:szCs w:val="24"/>
-          <w:lang w:val="en-PK" w:eastAsia="en-PK"/>
+          <w:lang w:eastAsia="en-PK"/>
         </w:rPr>
         <w:t>e</w:t>
       </w:r>
@@ -933,25 +895,7 @@
           <w:bCs w:val="0"/>
           <w:lang w:val="en-US"/>
         </w:rPr>
-        <w:t xml:space="preserve">From the above link </w:t>
-      </w:r>
-      <w:proofErr w:type="gramStart"/>
-      <w:r>
-        <w:rPr>
-          <w:b w:val="0"/>
-          <w:bCs w:val="0"/>
-          <w:lang w:val="en-US"/>
-        </w:rPr>
-        <w:t>only</w:t>
-      </w:r>
-      <w:proofErr w:type="gramEnd"/>
-      <w:r>
-        <w:rPr>
-          <w:b w:val="0"/>
-          <w:bCs w:val="0"/>
-          <w:lang w:val="en-US"/>
-        </w:rPr>
-        <w:t xml:space="preserve"> property related laws were filtered out.</w:t>
+        <w:t>From the above link only property related laws were filtered out.</w:t>
       </w:r>
     </w:p>
     <w:p>
@@ -1053,25 +997,7 @@
           <w:bCs w:val="0"/>
           <w:lang w:val="en-US"/>
         </w:rPr>
-        <w:t xml:space="preserve">All of the </w:t>
-      </w:r>
-      <w:proofErr w:type="gramStart"/>
-      <w:r>
-        <w:rPr>
-          <w:b w:val="0"/>
-          <w:bCs w:val="0"/>
-          <w:lang w:val="en-US"/>
-        </w:rPr>
-        <w:t>above mentioned</w:t>
-      </w:r>
-      <w:proofErr w:type="gramEnd"/>
-      <w:r>
-        <w:rPr>
-          <w:b w:val="0"/>
-          <w:bCs w:val="0"/>
-          <w:lang w:val="en-US"/>
-        </w:rPr>
-        <w:t xml:space="preserve"> data was converted to instruction style json.</w:t>
+        <w:t>All of the above mentioned data was converted to instruction style json.</w:t>
       </w:r>
     </w:p>
     <w:p>
@@ -1102,7 +1028,6 @@
         </w:rPr>
         <w:t xml:space="preserve">Working on </w:t>
       </w:r>
-      <w:proofErr w:type="spellStart"/>
       <w:r>
         <w:rPr>
           <w:b/>
@@ -1114,7 +1039,6 @@
         </w:rPr>
         <w:t>LegalUQA</w:t>
       </w:r>
-      <w:proofErr w:type="spellEnd"/>
       <w:r>
         <w:rPr>
           <w:color w:val="FF0000"/>
@@ -1180,21 +1104,7 @@
         <w:rPr>
           <w:lang w:val="en-US"/>
         </w:rPr>
-        <w:t xml:space="preserve">Legal </w:t>
-      </w:r>
-      <w:proofErr w:type="spellStart"/>
-      <w:r>
-        <w:rPr>
-          <w:lang w:val="en-US"/>
-        </w:rPr>
-        <w:t>uqa</w:t>
-      </w:r>
-      <w:proofErr w:type="spellEnd"/>
-      <w:r>
-        <w:rPr>
-          <w:lang w:val="en-US"/>
-        </w:rPr>
-        <w:t xml:space="preserve"> was converted to instruction style data</w:t>
+        <w:t>Legal uqa was converted to instruction style data</w:t>
       </w:r>
     </w:p>
     <w:p>
@@ -1233,7 +1143,6 @@
         </w:rPr>
         <w:t xml:space="preserve">Judgments data </w:t>
       </w:r>
-      <w:proofErr w:type="spellStart"/>
       <w:r>
         <w:rPr>
           <w:color w:val="FF0000"/>
@@ -1241,17 +1150,7 @@
           <w:szCs w:val="26"/>
           <w:lang w:val="en-US"/>
         </w:rPr>
-        <w:t>data</w:t>
-      </w:r>
-      <w:proofErr w:type="spellEnd"/>
-      <w:r>
-        <w:rPr>
-          <w:color w:val="FF0000"/>
-          <w:sz w:val="26"/>
-          <w:szCs w:val="26"/>
-          <w:lang w:val="en-US"/>
-        </w:rPr>
-        <w:t>:</w:t>
+        <w:t>data:</w:t>
       </w:r>
     </w:p>
     <w:p>
@@ -1307,6 +1206,38 @@
     </w:p>
     <w:p>
       <w:pPr>
+        <w:pStyle w:val="ListParagraph"/>
+        <w:numPr>
+          <w:ilvl w:val="0"/>
+          <w:numId w:val="16"/>
+        </w:numPr>
+        <w:rPr>
+          <w:lang w:val="en-US"/>
+        </w:rPr>
+      </w:pPr>
+      <w:r>
+        <w:rPr>
+          <w:lang w:val="en-US"/>
+        </w:rPr>
+        <w:t>Filter out only property related judgments</w:t>
+      </w:r>
+    </w:p>
+    <w:p>
+      <w:pPr>
+        <w:ind w:left="360"/>
+        <w:rPr>
+          <w:lang w:val="en-US"/>
+        </w:rPr>
+      </w:pPr>
+      <w:r>
+        <w:rPr>
+          <w:lang w:val="en-US"/>
+        </w:rPr>
+        <w:t>Those judgments were given to gpt and were converted into instruction style</w:t>
+      </w:r>
+    </w:p>
+    <w:p>
+      <w:pPr>
         <w:pStyle w:val="Heading3"/>
         <w:rPr>
           <w:b w:val="0"/>
@@ -1319,6 +1250,16 @@
       <w:pPr>
         <w:pStyle w:val="Heading3"/>
         <w:rPr>
+          <w:b w:val="0"/>
+          <w:bCs w:val="0"/>
+          <w:lang w:val="en-US"/>
+        </w:rPr>
+      </w:pPr>
+    </w:p>
+    <w:p>
+      <w:pPr>
+        <w:pStyle w:val="Heading3"/>
+        <w:rPr>
           <w:lang w:val="en-US"/>
         </w:rPr>
       </w:pPr>
@@ -1334,6 +1275,7 @@
         <w:pStyle w:val="NormalWeb"/>
       </w:pPr>
       <w:r>
+        <w:lastRenderedPageBreak/>
         <w:t xml:space="preserve">Here’s a </w:t>
       </w:r>
       <w:r>
@@ -1343,21 +1285,13 @@
         <w:t>clear and practical</w:t>
       </w:r>
       <w:r>
-        <w:t xml:space="preserve"> answer tailored to the dataset you’ve built so far and the </w:t>
-      </w:r>
-      <w:proofErr w:type="spellStart"/>
-      <w:r>
-        <w:t>LegalMate</w:t>
-      </w:r>
-      <w:proofErr w:type="spellEnd"/>
-      <w:r>
-        <w:t xml:space="preserve"> chatbot you’re trying to create:</w:t>
+        <w:t xml:space="preserve"> answer tailored to the dataset you’ve built so far and the LegalMate chatbot you’re trying to create:</w:t>
       </w:r>
     </w:p>
     <w:p>
       <w:r>
         <w:pict w14:anchorId="70912480">
-          <v:rect id="_x0000_i1028" style="width:0;height:1.5pt" o:hralign="center" o:hrstd="t" o:hr="t" fillcolor="#a0a0a0" stroked="f"/>
+          <v:rect id="_x0000_i1025" style="width:0;height:1.5pt" o:hralign="center" o:hrstd="t" o:hr="t" fillcolor="#a0a0a0" stroked="f"/>
         </w:pict>
       </w:r>
     </w:p>
@@ -1369,7 +1303,6 @@
         <w:rPr>
           <w:rFonts w:ascii="Segoe UI Emoji" w:hAnsi="Segoe UI Emoji" w:cs="Segoe UI Emoji"/>
         </w:rPr>
-        <w:lastRenderedPageBreak/>
         <w:t>✅</w:t>
       </w:r>
       <w:r>
@@ -1469,7 +1402,7 @@
     <w:p>
       <w:r>
         <w:pict w14:anchorId="0B3230A6">
-          <v:rect id="_x0000_i1029" style="width:0;height:1.5pt" o:hralign="center" o:hrstd="t" o:hr="t" fillcolor="#a0a0a0" stroked="f"/>
+          <v:rect id="_x0000_i1026" style="width:0;height:1.5pt" o:hralign="center" o:hrstd="t" o:hr="t" fillcolor="#a0a0a0" stroked="f"/>
         </w:pict>
       </w:r>
     </w:p>
@@ -1542,7 +1475,7 @@
     <w:p>
       <w:r>
         <w:pict w14:anchorId="1F810462">
-          <v:rect id="_x0000_i1030" style="width:0;height:1.5pt" o:hralign="center" o:hrstd="t" o:hr="t" fillcolor="#a0a0a0" stroked="f"/>
+          <v:rect id="_x0000_i1027" style="width:0;height:1.5pt" o:hralign="center" o:hrstd="t" o:hr="t" fillcolor="#a0a0a0" stroked="f"/>
         </w:pict>
       </w:r>
     </w:p>
@@ -1647,7 +1580,7 @@
     <w:p>
       <w:r>
         <w:pict w14:anchorId="3391E04B">
-          <v:rect id="_x0000_i1031" style="width:0;height:1.5pt" o:hralign="center" o:hrstd="t" o:hr="t" fillcolor="#a0a0a0" stroked="f"/>
+          <v:rect id="_x0000_i1028" style="width:0;height:1.5pt" o:hralign="center" o:hrstd="t" o:hr="t" fillcolor="#a0a0a0" stroked="f"/>
         </w:pict>
       </w:r>
     </w:p>
@@ -1702,6 +1635,7 @@
         </w:numPr>
       </w:pPr>
       <w:r>
+        <w:lastRenderedPageBreak/>
         <w:t>“Two brothers have inheritance dispute.”</w:t>
       </w:r>
     </w:p>
@@ -1720,7 +1654,7 @@
     <w:p>
       <w:r>
         <w:pict w14:anchorId="7E567C07">
-          <v:rect id="_x0000_i1032" style="width:0;height:1.5pt" o:hralign="center" o:hrstd="t" o:hr="t" fillcolor="#a0a0a0" stroked="f"/>
+          <v:rect id="_x0000_i1029" style="width:0;height:1.5pt" o:hralign="center" o:hrstd="t" o:hr="t" fillcolor="#a0a0a0" stroked="f"/>
         </w:pict>
       </w:r>
     </w:p>
@@ -1734,7 +1668,6 @@
           <w:b w:val="0"/>
           <w:bCs w:val="0"/>
         </w:rPr>
-        <w:lastRenderedPageBreak/>
         <w:t>D. Step-by-Step Legal Procedures Dataset</w:t>
       </w:r>
     </w:p>
@@ -1805,7 +1738,7 @@
     <w:p>
       <w:r>
         <w:pict w14:anchorId="56E11021">
-          <v:rect id="_x0000_i1033" style="width:0;height:1.5pt" o:hralign="center" o:hrstd="t" o:hr="t" fillcolor="#a0a0a0" stroked="f"/>
+          <v:rect id="_x0000_i1030" style="width:0;height:1.5pt" o:hralign="center" o:hrstd="t" o:hr="t" fillcolor="#a0a0a0" stroked="f"/>
         </w:pict>
       </w:r>
     </w:p>
@@ -1874,7 +1807,7 @@
     <w:p>
       <w:r>
         <w:pict w14:anchorId="133497EF">
-          <v:rect id="_x0000_i1034" style="width:0;height:1.5pt" o:hralign="center" o:hrstd="t" o:hr="t" fillcolor="#a0a0a0" stroked="f"/>
+          <v:rect id="_x0000_i1031" style="width:0;height:1.5pt" o:hralign="center" o:hrstd="t" o:hr="t" fillcolor="#a0a0a0" stroked="f"/>
         </w:pict>
       </w:r>
     </w:p>
@@ -1970,7 +1903,7 @@
     <w:p>
       <w:r>
         <w:pict w14:anchorId="63B56C69">
-          <v:rect id="_x0000_i1035" style="width:0;height:1.5pt" o:hralign="center" o:hrstd="t" o:hr="t" fillcolor="#a0a0a0" stroked="f"/>
+          <v:rect id="_x0000_i1032" style="width:0;height:1.5pt" o:hralign="center" o:hrstd="t" o:hr="t" fillcolor="#a0a0a0" stroked="f"/>
         </w:pict>
       </w:r>
     </w:p>
@@ -2048,13 +1981,8 @@
           <w:numId w:val="11"/>
         </w:numPr>
       </w:pPr>
-      <w:proofErr w:type="spellStart"/>
-      <w:r>
-        <w:t>Balochistan</w:t>
-      </w:r>
-      <w:proofErr w:type="spellEnd"/>
-      <w:r>
-        <w:t xml:space="preserve"> Rent Law</w:t>
+      <w:r>
+        <w:t>Balochistan Rent Law</w:t>
       </w:r>
     </w:p>
     <w:p>
@@ -2074,13 +2002,14 @@
         <w:pStyle w:val="NormalWeb"/>
       </w:pPr>
       <w:r>
+        <w:lastRenderedPageBreak/>
         <w:t>This increases accuracy because laws vary province-to-province.</w:t>
       </w:r>
     </w:p>
     <w:p>
       <w:r>
         <w:pict w14:anchorId="420CE803">
-          <v:rect id="_x0000_i1036" style="width:0;height:1.5pt" o:hralign="center" o:hrstd="t" o:hr="t" fillcolor="#a0a0a0" stroked="f"/>
+          <v:rect id="_x0000_i1033" style="width:0;height:1.5pt" o:hralign="center" o:hrstd="t" o:hr="t" fillcolor="#a0a0a0" stroked="f"/>
         </w:pict>
       </w:r>
     </w:p>
@@ -2094,7 +2023,6 @@
           <w:b w:val="0"/>
           <w:bCs w:val="0"/>
         </w:rPr>
-        <w:lastRenderedPageBreak/>
         <w:t>H. Error-handling + Uncertainty Data</w:t>
       </w:r>
     </w:p>
@@ -2162,7 +2090,7 @@
     <w:p>
       <w:r>
         <w:pict w14:anchorId="042D9C33">
-          <v:rect id="_x0000_i1037" style="width:0;height:1.5pt" o:hralign="center" o:hrstd="t" o:hr="t" fillcolor="#a0a0a0" stroked="f"/>
+          <v:rect id="_x0000_i1034" style="width:0;height:1.5pt" o:hralign="center" o:hrstd="t" o:hr="t" fillcolor="#a0a0a0" stroked="f"/>
         </w:pict>
       </w:r>
     </w:p>
@@ -2185,18 +2113,8 @@
           <w:b w:val="0"/>
           <w:bCs w:val="0"/>
         </w:rPr>
-        <w:t xml:space="preserve">2. How many more datasets you still need for full </w:t>
-      </w:r>
-      <w:proofErr w:type="gramStart"/>
-      <w:r>
-        <w:rPr>
-          <w:rStyle w:val="Strong"/>
-          <w:b w:val="0"/>
-          <w:bCs w:val="0"/>
-        </w:rPr>
-        <w:t>coverage</w:t>
-      </w:r>
-      <w:proofErr w:type="gramEnd"/>
+        <w:t>2. How many more datasets you still need for full coverage</w:t>
+      </w:r>
     </w:p>
     <w:p>
       <w:pPr>
@@ -2841,7 +2759,7 @@
     <w:p>
       <w:r>
         <w:pict w14:anchorId="64CE1396">
-          <v:rect id="_x0000_i1038" style="width:0;height:1.5pt" o:hralign="center" o:hrstd="t" o:hr="t" fillcolor="#a0a0a0" stroked="f"/>
+          <v:rect id="_x0000_i1035" style="width:0;height:1.5pt" o:hralign="center" o:hrstd="t" o:hr="t" fillcolor="#a0a0a0" stroked="f"/>
         </w:pict>
       </w:r>
     </w:p>
@@ -2900,6 +2818,7 @@
         <w:pStyle w:val="NormalWeb"/>
       </w:pPr>
       <w:r>
+        <w:lastRenderedPageBreak/>
         <w:t>You currently have ~</w:t>
       </w:r>
       <w:r>
@@ -2916,13 +2835,8 @@
       <w:pPr>
         <w:pStyle w:val="NormalWeb"/>
       </w:pPr>
-      <w:proofErr w:type="gramStart"/>
-      <w:r>
-        <w:t>So</w:t>
-      </w:r>
-      <w:proofErr w:type="gramEnd"/>
-      <w:r>
-        <w:t xml:space="preserve"> you need </w:t>
+      <w:r>
+        <w:t xml:space="preserve">So you need </w:t>
       </w:r>
       <w:r>
         <w:rPr>
@@ -2944,7 +2858,6 @@
         <w:rPr>
           <w:lang w:val="en-US"/>
         </w:rPr>
-        <w:lastRenderedPageBreak/>
         <w:br w:type="page"/>
       </w:r>
     </w:p>
@@ -2965,21 +2878,7 @@
         <w:rPr>
           <w:lang w:val="en-US"/>
         </w:rPr>
-        <w:t xml:space="preserve">The types of </w:t>
-      </w:r>
-      <w:proofErr w:type="gramStart"/>
-      <w:r>
-        <w:rPr>
-          <w:lang w:val="en-US"/>
-        </w:rPr>
-        <w:t>dataset</w:t>
-      </w:r>
-      <w:proofErr w:type="gramEnd"/>
-      <w:r>
-        <w:rPr>
-          <w:lang w:val="en-US"/>
-        </w:rPr>
-        <w:t xml:space="preserve"> used;</w:t>
+        <w:t>The types of dataset used;</w:t>
       </w:r>
     </w:p>
     <w:p>
@@ -3021,16 +2920,8 @@
         <w:rPr>
           <w:lang w:val="en-US"/>
         </w:rPr>
-        <w:t xml:space="preserve">Supreme courts judgments taken from </w:t>
-      </w:r>
-      <w:proofErr w:type="spellStart"/>
-      <w:r>
-        <w:rPr>
-          <w:lang w:val="en-US"/>
-        </w:rPr>
-        <w:t>keggle</w:t>
-      </w:r>
-      <w:proofErr w:type="spellEnd"/>
+        <w:t>Supreme courts judgments taken from keggle</w:t>
+      </w:r>
     </w:p>
     <w:p>
       <w:pPr>
@@ -3071,16 +2962,8 @@
         <w:rPr>
           <w:lang w:val="en-US"/>
         </w:rPr>
-        <w:t xml:space="preserve"> from </w:t>
-      </w:r>
-      <w:proofErr w:type="spellStart"/>
-      <w:r>
-        <w:rPr>
-          <w:lang w:val="en-US"/>
-        </w:rPr>
-        <w:t>github</w:t>
-      </w:r>
-      <w:proofErr w:type="spellEnd"/>
+        <w:t xml:space="preserve"> from github</w:t>
+      </w:r>
     </w:p>
     <w:p>
       <w:pPr>
@@ -3100,16 +2983,8 @@
         <w:rPr>
           <w:lang w:val="en-US"/>
         </w:rPr>
-        <w:t xml:space="preserve"> from </w:t>
-      </w:r>
-      <w:proofErr w:type="spellStart"/>
-      <w:r>
-        <w:rPr>
-          <w:lang w:val="en-US"/>
-        </w:rPr>
-        <w:t>keggle</w:t>
-      </w:r>
-      <w:proofErr w:type="spellEnd"/>
+        <w:t xml:space="preserve"> from keggle</w:t>
+      </w:r>
       <w:r>
         <w:rPr>
           <w:lang w:val="en-US"/>
@@ -3215,21 +3090,12 @@
           <w:lang w:val="en-US"/>
         </w:rPr>
       </w:pPr>
-      <w:proofErr w:type="spellStart"/>
       <w:r>
         <w:rPr>
           <w:u w:val="single"/>
           <w:lang w:val="en-US"/>
         </w:rPr>
-        <w:t>Hassaan</w:t>
-      </w:r>
-      <w:proofErr w:type="spellEnd"/>
-      <w:r>
-        <w:rPr>
-          <w:u w:val="single"/>
-          <w:lang w:val="en-US"/>
-        </w:rPr>
-        <w:t xml:space="preserve"> sb.</w:t>
+        <w:t>Hassaan sb.</w:t>
       </w:r>
     </w:p>
     <w:p>
@@ -3256,16 +3122,8 @@
           <w:lang w:val="en-US"/>
         </w:rPr>
         <w:tab/>
-        <w:t xml:space="preserve">Feature </w:t>
-      </w:r>
-      <w:proofErr w:type="spellStart"/>
-      <w:r>
-        <w:rPr>
-          <w:lang w:val="en-US"/>
-        </w:rPr>
-        <w:t>impoverment</w:t>
-      </w:r>
-      <w:proofErr w:type="spellEnd"/>
+        <w:t>Feature impoverment</w:t>
+      </w:r>
     </w:p>
     <w:p>
       <w:pPr>
@@ -3638,6 +3496,95 @@
     </w:lvl>
   </w:abstractNum>
   <w:abstractNum w:abstractNumId="2" w15:restartNumberingAfterBreak="0">
+    <w:nsid w:val="03E809B6"/>
+    <w:multiLevelType w:val="hybridMultilevel"/>
+    <w:tmpl w:val="9CD40C50"/>
+    <w:lvl w:ilvl="0" w:tplc="2000000F">
+      <w:start w:val="1"/>
+      <w:numFmt w:val="decimal"/>
+      <w:lvlText w:val="%1."/>
+      <w:lvlJc w:val="left"/>
+      <w:pPr>
+        <w:ind w:left="720" w:hanging="360"/>
+      </w:pPr>
+      <w:rPr>
+        <w:rFonts w:hint="default"/>
+      </w:rPr>
+    </w:lvl>
+    <w:lvl w:ilvl="1" w:tplc="20000019" w:tentative="1">
+      <w:start w:val="1"/>
+      <w:numFmt w:val="lowerLetter"/>
+      <w:lvlText w:val="%2."/>
+      <w:lvlJc w:val="left"/>
+      <w:pPr>
+        <w:ind w:left="1440" w:hanging="360"/>
+      </w:pPr>
+    </w:lvl>
+    <w:lvl w:ilvl="2" w:tplc="2000001B" w:tentative="1">
+      <w:start w:val="1"/>
+      <w:numFmt w:val="lowerRoman"/>
+      <w:lvlText w:val="%3."/>
+      <w:lvlJc w:val="right"/>
+      <w:pPr>
+        <w:ind w:left="2160" w:hanging="180"/>
+      </w:pPr>
+    </w:lvl>
+    <w:lvl w:ilvl="3" w:tplc="2000000F" w:tentative="1">
+      <w:start w:val="1"/>
+      <w:numFmt w:val="decimal"/>
+      <w:lvlText w:val="%4."/>
+      <w:lvlJc w:val="left"/>
+      <w:pPr>
+        <w:ind w:left="2880" w:hanging="360"/>
+      </w:pPr>
+    </w:lvl>
+    <w:lvl w:ilvl="4" w:tplc="20000019" w:tentative="1">
+      <w:start w:val="1"/>
+      <w:numFmt w:val="lowerLetter"/>
+      <w:lvlText w:val="%5."/>
+      <w:lvlJc w:val="left"/>
+      <w:pPr>
+        <w:ind w:left="3600" w:hanging="360"/>
+      </w:pPr>
+    </w:lvl>
+    <w:lvl w:ilvl="5" w:tplc="2000001B" w:tentative="1">
+      <w:start w:val="1"/>
+      <w:numFmt w:val="lowerRoman"/>
+      <w:lvlText w:val="%6."/>
+      <w:lvlJc w:val="right"/>
+      <w:pPr>
+        <w:ind w:left="4320" w:hanging="180"/>
+      </w:pPr>
+    </w:lvl>
+    <w:lvl w:ilvl="6" w:tplc="2000000F" w:tentative="1">
+      <w:start w:val="1"/>
+      <w:numFmt w:val="decimal"/>
+      <w:lvlText w:val="%7."/>
+      <w:lvlJc w:val="left"/>
+      <w:pPr>
+        <w:ind w:left="5040" w:hanging="360"/>
+      </w:pPr>
+    </w:lvl>
+    <w:lvl w:ilvl="7" w:tplc="20000019" w:tentative="1">
+      <w:start w:val="1"/>
+      <w:numFmt w:val="lowerLetter"/>
+      <w:lvlText w:val="%8."/>
+      <w:lvlJc w:val="left"/>
+      <w:pPr>
+        <w:ind w:left="5760" w:hanging="360"/>
+      </w:pPr>
+    </w:lvl>
+    <w:lvl w:ilvl="8" w:tplc="2000001B" w:tentative="1">
+      <w:start w:val="1"/>
+      <w:numFmt w:val="lowerRoman"/>
+      <w:lvlText w:val="%9."/>
+      <w:lvlJc w:val="right"/>
+      <w:pPr>
+        <w:ind w:left="6480" w:hanging="180"/>
+      </w:pPr>
+    </w:lvl>
+  </w:abstractNum>
+  <w:abstractNum w:abstractNumId="3" w15:restartNumberingAfterBreak="0">
     <w:nsid w:val="1A1E29F0"/>
     <w:multiLevelType w:val="multilevel"/>
     <w:tmpl w:val="495A5C6E"/>
@@ -3786,7 +3733,7 @@
       </w:rPr>
     </w:lvl>
   </w:abstractNum>
-  <w:abstractNum w:abstractNumId="3" w15:restartNumberingAfterBreak="0">
+  <w:abstractNum w:abstractNumId="4" w15:restartNumberingAfterBreak="0">
     <w:nsid w:val="1BB3509C"/>
     <w:multiLevelType w:val="multilevel"/>
     <w:tmpl w:val="8E98D310"/>
@@ -3935,7 +3882,7 @@
       </w:rPr>
     </w:lvl>
   </w:abstractNum>
-  <w:abstractNum w:abstractNumId="4" w15:restartNumberingAfterBreak="0">
+  <w:abstractNum w:abstractNumId="5" w15:restartNumberingAfterBreak="0">
     <w:nsid w:val="229B4B73"/>
     <w:multiLevelType w:val="multilevel"/>
     <w:tmpl w:val="862A6E3A"/>
@@ -4084,7 +4031,7 @@
       </w:rPr>
     </w:lvl>
   </w:abstractNum>
-  <w:abstractNum w:abstractNumId="5" w15:restartNumberingAfterBreak="0">
+  <w:abstractNum w:abstractNumId="6" w15:restartNumberingAfterBreak="0">
     <w:nsid w:val="22A42214"/>
     <w:multiLevelType w:val="multilevel"/>
     <w:tmpl w:val="4654628E"/>
@@ -4233,7 +4180,7 @@
       </w:rPr>
     </w:lvl>
   </w:abstractNum>
-  <w:abstractNum w:abstractNumId="6" w15:restartNumberingAfterBreak="0">
+  <w:abstractNum w:abstractNumId="7" w15:restartNumberingAfterBreak="0">
     <w:nsid w:val="26C74C92"/>
     <w:multiLevelType w:val="multilevel"/>
     <w:tmpl w:val="94560B06"/>
@@ -4382,7 +4329,7 @@
       </w:rPr>
     </w:lvl>
   </w:abstractNum>
-  <w:abstractNum w:abstractNumId="7" w15:restartNumberingAfterBreak="0">
+  <w:abstractNum w:abstractNumId="8" w15:restartNumberingAfterBreak="0">
     <w:nsid w:val="2C8C2443"/>
     <w:multiLevelType w:val="multilevel"/>
     <w:tmpl w:val="99783172"/>
@@ -4531,7 +4478,7 @@
       </w:rPr>
     </w:lvl>
   </w:abstractNum>
-  <w:abstractNum w:abstractNumId="8" w15:restartNumberingAfterBreak="0">
+  <w:abstractNum w:abstractNumId="9" w15:restartNumberingAfterBreak="0">
     <w:nsid w:val="304E53B1"/>
     <w:multiLevelType w:val="multilevel"/>
     <w:tmpl w:val="FBA453EC"/>
@@ -4680,7 +4627,7 @@
       </w:rPr>
     </w:lvl>
   </w:abstractNum>
-  <w:abstractNum w:abstractNumId="9" w15:restartNumberingAfterBreak="0">
+  <w:abstractNum w:abstractNumId="10" w15:restartNumberingAfterBreak="0">
     <w:nsid w:val="31012CDF"/>
     <w:multiLevelType w:val="hybridMultilevel"/>
     <w:tmpl w:val="4FDE6AEE"/>
@@ -4769,7 +4716,7 @@
       </w:pPr>
     </w:lvl>
   </w:abstractNum>
-  <w:abstractNum w:abstractNumId="10" w15:restartNumberingAfterBreak="0">
+  <w:abstractNum w:abstractNumId="11" w15:restartNumberingAfterBreak="0">
     <w:nsid w:val="422432E9"/>
     <w:multiLevelType w:val="multilevel"/>
     <w:tmpl w:val="87F0A25E"/>
@@ -4886,7 +4833,7 @@
       </w:pPr>
     </w:lvl>
   </w:abstractNum>
-  <w:abstractNum w:abstractNumId="11" w15:restartNumberingAfterBreak="0">
+  <w:abstractNum w:abstractNumId="12" w15:restartNumberingAfterBreak="0">
     <w:nsid w:val="4F9B3CAE"/>
     <w:multiLevelType w:val="multilevel"/>
     <w:tmpl w:val="3B185DF8"/>
@@ -5035,7 +4982,7 @@
       </w:rPr>
     </w:lvl>
   </w:abstractNum>
-  <w:abstractNum w:abstractNumId="12" w15:restartNumberingAfterBreak="0">
+  <w:abstractNum w:abstractNumId="13" w15:restartNumberingAfterBreak="0">
     <w:nsid w:val="63D650C0"/>
     <w:multiLevelType w:val="multilevel"/>
     <w:tmpl w:val="3AB0EB72"/>
@@ -5184,7 +5131,7 @@
       </w:rPr>
     </w:lvl>
   </w:abstractNum>
-  <w:abstractNum w:abstractNumId="13" w15:restartNumberingAfterBreak="0">
+  <w:abstractNum w:abstractNumId="14" w15:restartNumberingAfterBreak="0">
     <w:nsid w:val="6C3D1E91"/>
     <w:multiLevelType w:val="multilevel"/>
     <w:tmpl w:val="A52AD072"/>
@@ -5333,7 +5280,7 @@
       </w:rPr>
     </w:lvl>
   </w:abstractNum>
-  <w:abstractNum w:abstractNumId="14" w15:restartNumberingAfterBreak="0">
+  <w:abstractNum w:abstractNumId="15" w15:restartNumberingAfterBreak="0">
     <w:nsid w:val="7993547D"/>
     <w:multiLevelType w:val="multilevel"/>
     <w:tmpl w:val="21645580"/>
@@ -5486,46 +5433,49 @@
     <w:abstractNumId w:val="0"/>
   </w:num>
   <w:num w:numId="2">
-    <w:abstractNumId w:val="9"/>
+    <w:abstractNumId w:val="10"/>
   </w:num>
   <w:num w:numId="3">
-    <w:abstractNumId w:val="10"/>
+    <w:abstractNumId w:val="11"/>
   </w:num>
   <w:num w:numId="4">
-    <w:abstractNumId w:val="11"/>
+    <w:abstractNumId w:val="12"/>
   </w:num>
   <w:num w:numId="5">
+    <w:abstractNumId w:val="7"/>
+  </w:num>
+  <w:num w:numId="6">
+    <w:abstractNumId w:val="3"/>
+  </w:num>
+  <w:num w:numId="7">
     <w:abstractNumId w:val="6"/>
   </w:num>
-  <w:num w:numId="6">
-    <w:abstractNumId w:val="2"/>
-  </w:num>
-  <w:num w:numId="7">
-    <w:abstractNumId w:val="5"/>
-  </w:num>
   <w:num w:numId="8">
-    <w:abstractNumId w:val="7"/>
+    <w:abstractNumId w:val="8"/>
   </w:num>
   <w:num w:numId="9">
-    <w:abstractNumId w:val="4"/>
+    <w:abstractNumId w:val="5"/>
   </w:num>
   <w:num w:numId="10">
     <w:abstractNumId w:val="1"/>
   </w:num>
   <w:num w:numId="11">
-    <w:abstractNumId w:val="12"/>
+    <w:abstractNumId w:val="13"/>
   </w:num>
   <w:num w:numId="12">
+    <w:abstractNumId w:val="15"/>
+  </w:num>
+  <w:num w:numId="13">
+    <w:abstractNumId w:val="9"/>
+  </w:num>
+  <w:num w:numId="14">
     <w:abstractNumId w:val="14"/>
   </w:num>
-  <w:num w:numId="13">
-    <w:abstractNumId w:val="8"/>
+  <w:num w:numId="15">
+    <w:abstractNumId w:val="4"/>
   </w:num>
-  <w:num w:numId="14">
-    <w:abstractNumId w:val="13"/>
-  </w:num>
-  <w:num w:numId="15">
-    <w:abstractNumId w:val="3"/>
+  <w:num w:numId="16">
+    <w:abstractNumId w:val="2"/>
   </w:num>
 </w:numbering>
 </file>
@@ -5990,7 +5940,7 @@
       <w:bCs/>
       <w:sz w:val="27"/>
       <w:szCs w:val="27"/>
-      <w:lang w:val="en-PK" w:eastAsia="en-PK"/>
+      <w:lang w:eastAsia="en-PK"/>
     </w:rPr>
   </w:style>
   <w:style w:type="character" w:default="1" w:styleId="DefaultParagraphFont">
@@ -6059,7 +6009,7 @@
       <w:rFonts w:ascii="Times New Roman" w:eastAsia="Times New Roman" w:hAnsi="Times New Roman" w:cs="Times New Roman"/>
       <w:sz w:val="24"/>
       <w:szCs w:val="24"/>
-      <w:lang w:val="en-PK" w:eastAsia="en-PK"/>
+      <w:lang w:eastAsia="en-PK"/>
     </w:rPr>
   </w:style>
   <w:style w:type="character" w:styleId="Strong">
@@ -6117,7 +6067,7 @@
       <w:rFonts w:ascii="Courier New" w:eastAsia="Times New Roman" w:hAnsi="Courier New" w:cs="Courier New"/>
       <w:sz w:val="20"/>
       <w:szCs w:val="20"/>
-      <w:lang w:val="en-PK" w:eastAsia="en-PK"/>
+      <w:lang w:eastAsia="en-PK"/>
     </w:rPr>
   </w:style>
   <w:style w:type="character" w:customStyle="1" w:styleId="HTMLPreformattedChar">

</xml_diff>